<commit_message>
Fiches techniques : toutes les recettes en base 10 couverts
Co-Authored-By: Claude Opus 5.5 <noreply@anthropic.com>
Claude-Session: https://claude.ai/code/session_01K8nkiVikF4Cso8sB8v1a6m
</commit_message>
<xml_diff>
--- a/fiches_techniques/FICHES_TECHNIQUES_CLUB_COCHON.docx
+++ b/fiches_techniques/FICHES_TECHNIQUES_CLUB_COCHON.docx
@@ -32,7 +32,7 @@
           <w:sz w:val="22"/>
           <w:szCs w:val="22"/>
         </w:rPr>
-        <w:t xml:space="preserve">(10 portions de 3 pièces)</w:t>
+        <w:t xml:space="preserve">(3 pièces par personne)</w:t>
       </w:r>
     </w:p>
     <w:tbl>
@@ -86,7 +86,7 @@
                 <w:szCs w:val="22"/>
                 <w:u w:val="single"/>
               </w:rPr>
-              <w:t xml:space="preserve">INGRÉDIENTS :</w:t>
+              <w:t xml:space="preserve">INGRÉDIENTS (10 couverts) :</w:t>
             </w:r>
           </w:p>
         </w:tc>
@@ -2197,7 +2197,7 @@
     <w:p>
       <w:pPr>
         <w:pageBreakBefore/>
-        <w:spacing w:after="60"/>
+        <w:spacing w:after="360"/>
         <w:jc w:val="center"/>
       </w:pPr>
       <w:r>
@@ -2210,22 +2210,6 @@
           <w:u w:val="single"/>
         </w:rPr>
         <w:t xml:space="preserve">CHOU VERT FARCI AU COCHON ET TROMPETTE DE LA MORT, JUS CORSÉ</w:t>
-      </w:r>
-    </w:p>
-    <w:p>
-      <w:pPr>
-        <w:spacing w:after="300"/>
-        <w:jc w:val="center"/>
-      </w:pPr>
-      <w:r>
-        <w:rPr>
-          <w:rFonts w:ascii="Arial Narrow" w:cs="Arial Narrow" w:eastAsia="Arial Narrow" w:hAnsi="Arial Narrow"/>
-          <w:i/>
-          <w:iCs/>
-          <w:sz w:val="22"/>
-          <w:szCs w:val="22"/>
-        </w:rPr>
-        <w:t xml:space="preserve">(10 pièces)</w:t>
       </w:r>
     </w:p>
     <w:tbl>
@@ -2279,7 +2263,7 @@
                 <w:szCs w:val="22"/>
                 <w:u w:val="single"/>
               </w:rPr>
-              <w:t xml:space="preserve">INGRÉDIENTS :</w:t>
+              <w:t xml:space="preserve">INGRÉDIENTS (10 couverts) :</w:t>
             </w:r>
           </w:p>
         </w:tc>
@@ -3933,7 +3917,7 @@
           <w:sz w:val="22"/>
           <w:szCs w:val="22"/>
         </w:rPr>
-        <w:t xml:space="preserve">(10 tourtes individuelles)</w:t>
+        <w:t xml:space="preserve">(1 tourte individuelle par personne)</w:t>
       </w:r>
     </w:p>
     <w:tbl>
@@ -3987,7 +3971,7 @@
                 <w:szCs w:val="22"/>
                 <w:u w:val="single"/>
               </w:rPr>
-              <w:t xml:space="preserve">INGRÉDIENTS :</w:t>
+              <w:t xml:space="preserve">INGRÉDIENTS (10 couverts) :</w:t>
             </w:r>
           </w:p>
         </w:tc>
@@ -5126,7 +5110,7 @@
           <w:sz w:val="22"/>
           <w:szCs w:val="22"/>
         </w:rPr>
-        <w:t xml:space="preserve">(10 portions de 250 g)</w:t>
+        <w:t xml:space="preserve">(1 saucisse de 250 g par personne)</w:t>
       </w:r>
     </w:p>
     <w:tbl>
@@ -5180,7 +5164,7 @@
                 <w:szCs w:val="22"/>
                 <w:u w:val="single"/>
               </w:rPr>
-              <w:t xml:space="preserve">INGRÉDIENTS :</w:t>
+              <w:t xml:space="preserve">INGRÉDIENTS (10 couverts) :</w:t>
             </w:r>
           </w:p>
         </w:tc>
@@ -6800,7 +6784,7 @@
           <w:sz w:val="22"/>
           <w:szCs w:val="22"/>
         </w:rPr>
-        <w:t xml:space="preserve">(5 côtes – 10 couverts)</w:t>
+        <w:t xml:space="preserve">(5 côtes pour 2 personnes)</w:t>
       </w:r>
     </w:p>
     <w:tbl>
@@ -6854,7 +6838,7 @@
                 <w:szCs w:val="22"/>
                 <w:u w:val="single"/>
               </w:rPr>
-              <w:t xml:space="preserve">INGRÉDIENTS :</w:t>
+              <w:t xml:space="preserve">INGRÉDIENTS (10 couverts) :</w:t>
             </w:r>
           </w:p>
         </w:tc>
@@ -8391,7 +8375,7 @@
           <w:sz w:val="22"/>
           <w:szCs w:val="22"/>
         </w:rPr>
-        <w:t xml:space="preserve">(5 côtes – 10 couverts)</w:t>
+        <w:t xml:space="preserve">(5 côtes pour 2 personnes)</w:t>
       </w:r>
     </w:p>
     <w:tbl>
@@ -8445,7 +8429,7 @@
                 <w:szCs w:val="22"/>
                 <w:u w:val="single"/>
               </w:rPr>
-              <w:t xml:space="preserve">INGRÉDIENTS :</w:t>
+              <w:t xml:space="preserve">INGRÉDIENTS (10 couverts) :</w:t>
             </w:r>
           </w:p>
         </w:tc>
@@ -9893,7 +9877,7 @@
           <w:sz w:val="22"/>
           <w:szCs w:val="22"/>
         </w:rPr>
-        <w:t xml:space="preserve">(10 portions de 250 g)</w:t>
+        <w:t xml:space="preserve">(250 g par personne)</w:t>
       </w:r>
     </w:p>
     <w:tbl>
@@ -9947,7 +9931,7 @@
                 <w:szCs w:val="22"/>
                 <w:u w:val="single"/>
               </w:rPr>
-              <w:t xml:space="preserve">INGRÉDIENTS :</w:t>
+              <w:t xml:space="preserve">INGRÉDIENTS (10 couverts) :</w:t>
             </w:r>
           </w:p>
         </w:tc>
@@ -10804,7 +10788,7 @@
           <w:sz w:val="22"/>
           <w:szCs w:val="22"/>
         </w:rPr>
-        <w:t xml:space="preserve">(1 cuissot – 3 couverts)</w:t>
+        <w:t xml:space="preserve">(cuissots servis pour 3 personnes)</w:t>
       </w:r>
     </w:p>
     <w:tbl>
@@ -10858,7 +10842,7 @@
                 <w:szCs w:val="22"/>
                 <w:u w:val="single"/>
               </w:rPr>
-              <w:t xml:space="preserve">INGRÉDIENTS :</w:t>
+              <w:t xml:space="preserve">INGRÉDIENTS (10 couverts) :</w:t>
             </w:r>
           </w:p>
         </w:tc>
@@ -10945,75 +10929,75 @@
                 <w:sz w:val="22"/>
                 <w:szCs w:val="22"/>
               </w:rPr>
-              <w:t xml:space="preserve">1 cuissot de cochon avec os (≈ 2,5 kg)</w:t>
-            </w:r>
-          </w:p>
-          <w:p>
-            <w:pPr>
-              <w:pStyle w:val="ListParagraph"/>
-              <w:numPr>
-                <w:ilvl w:val="0"/>
-                <w:numId w:val="2"/>
-              </w:numPr>
-            </w:pPr>
-            <w:r>
-              <w:rPr>
-                <w:rFonts w:ascii="Arial Narrow" w:cs="Arial Narrow" w:eastAsia="Arial Narrow" w:hAnsi="Arial Narrow"/>
-                <w:sz w:val="22"/>
-                <w:szCs w:val="22"/>
-              </w:rPr>
-              <w:t xml:space="preserve">25 g de sel fin</w:t>
-            </w:r>
-          </w:p>
-          <w:p>
-            <w:pPr>
-              <w:pStyle w:val="ListParagraph"/>
-              <w:numPr>
-                <w:ilvl w:val="0"/>
-                <w:numId w:val="2"/>
-              </w:numPr>
-            </w:pPr>
-            <w:r>
-              <w:rPr>
-                <w:rFonts w:ascii="Arial Narrow" w:cs="Arial Narrow" w:eastAsia="Arial Narrow" w:hAnsi="Arial Narrow"/>
-                <w:sz w:val="22"/>
-                <w:szCs w:val="22"/>
-              </w:rPr>
-              <w:t xml:space="preserve">3 g de poivre moulu</w:t>
-            </w:r>
-          </w:p>
-          <w:p>
-            <w:pPr>
-              <w:pStyle w:val="ListParagraph"/>
-              <w:numPr>
-                <w:ilvl w:val="0"/>
-                <w:numId w:val="2"/>
-              </w:numPr>
-            </w:pPr>
-            <w:r>
-              <w:rPr>
-                <w:rFonts w:ascii="Arial Narrow" w:cs="Arial Narrow" w:eastAsia="Arial Narrow" w:hAnsi="Arial Narrow"/>
-                <w:sz w:val="22"/>
-                <w:szCs w:val="22"/>
-              </w:rPr>
-              <w:t xml:space="preserve">3 gousses d'ail</w:t>
-            </w:r>
-          </w:p>
-          <w:p>
-            <w:pPr>
-              <w:pStyle w:val="ListParagraph"/>
-              <w:numPr>
-                <w:ilvl w:val="0"/>
-                <w:numId w:val="2"/>
-              </w:numPr>
-            </w:pPr>
-            <w:r>
-              <w:rPr>
-                <w:rFonts w:ascii="Arial Narrow" w:cs="Arial Narrow" w:eastAsia="Arial Narrow" w:hAnsi="Arial Narrow"/>
-                <w:sz w:val="22"/>
-                <w:szCs w:val="22"/>
-              </w:rPr>
-              <w:t xml:space="preserve">4 branches de thym</w:t>
+              <w:t xml:space="preserve">3 cuissots de cochon avec os (≈ 2,8 kg pièce, 850 g brut par personne)</w:t>
+            </w:r>
+          </w:p>
+          <w:p>
+            <w:pPr>
+              <w:pStyle w:val="ListParagraph"/>
+              <w:numPr>
+                <w:ilvl w:val="0"/>
+                <w:numId w:val="2"/>
+              </w:numPr>
+            </w:pPr>
+            <w:r>
+              <w:rPr>
+                <w:rFonts w:ascii="Arial Narrow" w:cs="Arial Narrow" w:eastAsia="Arial Narrow" w:hAnsi="Arial Narrow"/>
+                <w:sz w:val="22"/>
+                <w:szCs w:val="22"/>
+              </w:rPr>
+              <w:t xml:space="preserve">85 g de sel fin</w:t>
+            </w:r>
+          </w:p>
+          <w:p>
+            <w:pPr>
+              <w:pStyle w:val="ListParagraph"/>
+              <w:numPr>
+                <w:ilvl w:val="0"/>
+                <w:numId w:val="2"/>
+              </w:numPr>
+            </w:pPr>
+            <w:r>
+              <w:rPr>
+                <w:rFonts w:ascii="Arial Narrow" w:cs="Arial Narrow" w:eastAsia="Arial Narrow" w:hAnsi="Arial Narrow"/>
+                <w:sz w:val="22"/>
+                <w:szCs w:val="22"/>
+              </w:rPr>
+              <w:t xml:space="preserve">10 g de poivre moulu</w:t>
+            </w:r>
+          </w:p>
+          <w:p>
+            <w:pPr>
+              <w:pStyle w:val="ListParagraph"/>
+              <w:numPr>
+                <w:ilvl w:val="0"/>
+                <w:numId w:val="2"/>
+              </w:numPr>
+            </w:pPr>
+            <w:r>
+              <w:rPr>
+                <w:rFonts w:ascii="Arial Narrow" w:cs="Arial Narrow" w:eastAsia="Arial Narrow" w:hAnsi="Arial Narrow"/>
+                <w:sz w:val="22"/>
+                <w:szCs w:val="22"/>
+              </w:rPr>
+              <w:t xml:space="preserve">10 gousses d'ail</w:t>
+            </w:r>
+          </w:p>
+          <w:p>
+            <w:pPr>
+              <w:pStyle w:val="ListParagraph"/>
+              <w:numPr>
+                <w:ilvl w:val="0"/>
+                <w:numId w:val="2"/>
+              </w:numPr>
+            </w:pPr>
+            <w:r>
+              <w:rPr>
+                <w:rFonts w:ascii="Arial Narrow" w:cs="Arial Narrow" w:eastAsia="Arial Narrow" w:hAnsi="Arial Narrow"/>
+                <w:sz w:val="22"/>
+                <w:szCs w:val="22"/>
+              </w:rPr>
+              <w:t xml:space="preserve">12 branches de thym</w:t>
             </w:r>
           </w:p>
         </w:tc>
@@ -11084,7 +11068,7 @@
                 <w:sz w:val="22"/>
                 <w:szCs w:val="22"/>
               </w:rPr>
-              <w:t xml:space="preserve">Frotter le cuissot avec le sel, le poivre, l'ail écrasé et le thym. Filmer et réserver 12 heures au froid.</w:t>
+              <w:t xml:space="preserve">Frotter les cuissots avec le sel, le poivre, l'ail écrasé et le thym. Filmer et réserver 12 heures au froid.</w:t>
             </w:r>
           </w:p>
         </w:tc>
@@ -11136,126 +11120,126 @@
                 <w:sz w:val="22"/>
                 <w:szCs w:val="22"/>
               </w:rPr>
-              <w:t xml:space="preserve">50 g de graisse de canard</w:t>
-            </w:r>
-          </w:p>
-          <w:p>
-            <w:pPr>
-              <w:pStyle w:val="ListParagraph"/>
-              <w:numPr>
-                <w:ilvl w:val="0"/>
-                <w:numId w:val="2"/>
-              </w:numPr>
-            </w:pPr>
-            <w:r>
-              <w:rPr>
-                <w:rFonts w:ascii="Arial Narrow" w:cs="Arial Narrow" w:eastAsia="Arial Narrow" w:hAnsi="Arial Narrow"/>
-                <w:sz w:val="22"/>
-                <w:szCs w:val="22"/>
-              </w:rPr>
-              <w:t xml:space="preserve">2 oignons</w:t>
-            </w:r>
-          </w:p>
-          <w:p>
-            <w:pPr>
-              <w:pStyle w:val="ListParagraph"/>
-              <w:numPr>
-                <w:ilvl w:val="0"/>
-                <w:numId w:val="2"/>
-              </w:numPr>
-            </w:pPr>
-            <w:r>
-              <w:rPr>
-                <w:rFonts w:ascii="Arial Narrow" w:cs="Arial Narrow" w:eastAsia="Arial Narrow" w:hAnsi="Arial Narrow"/>
-                <w:sz w:val="22"/>
-                <w:szCs w:val="22"/>
-              </w:rPr>
-              <w:t xml:space="preserve">2 carottes</w:t>
-            </w:r>
-          </w:p>
-          <w:p>
-            <w:pPr>
-              <w:pStyle w:val="ListParagraph"/>
-              <w:numPr>
-                <w:ilvl w:val="0"/>
-                <w:numId w:val="2"/>
-              </w:numPr>
-            </w:pPr>
-            <w:r>
-              <w:rPr>
-                <w:rFonts w:ascii="Arial Narrow" w:cs="Arial Narrow" w:eastAsia="Arial Narrow" w:hAnsi="Arial Narrow"/>
-                <w:sz w:val="22"/>
-                <w:szCs w:val="22"/>
-              </w:rPr>
-              <w:t xml:space="preserve">1 tête d'ail</w:t>
-            </w:r>
-          </w:p>
-          <w:p>
-            <w:pPr>
-              <w:pStyle w:val="ListParagraph"/>
-              <w:numPr>
-                <w:ilvl w:val="0"/>
-                <w:numId w:val="2"/>
-              </w:numPr>
-            </w:pPr>
-            <w:r>
-              <w:rPr>
-                <w:rFonts w:ascii="Arial Narrow" w:cs="Arial Narrow" w:eastAsia="Arial Narrow" w:hAnsi="Arial Narrow"/>
-                <w:sz w:val="22"/>
-                <w:szCs w:val="22"/>
-              </w:rPr>
-              <w:t xml:space="preserve">1 bouquet garni</w:t>
-            </w:r>
-          </w:p>
-          <w:p>
-            <w:pPr>
-              <w:pStyle w:val="ListParagraph"/>
-              <w:numPr>
-                <w:ilvl w:val="0"/>
-                <w:numId w:val="2"/>
-              </w:numPr>
-            </w:pPr>
-            <w:r>
-              <w:rPr>
-                <w:rFonts w:ascii="Arial Narrow" w:cs="Arial Narrow" w:eastAsia="Arial Narrow" w:hAnsi="Arial Narrow"/>
-                <w:sz w:val="22"/>
-                <w:szCs w:val="22"/>
-              </w:rPr>
-              <w:t xml:space="preserve">500 g de cidre brut</w:t>
-            </w:r>
-          </w:p>
-          <w:p>
-            <w:pPr>
-              <w:pStyle w:val="ListParagraph"/>
-              <w:numPr>
-                <w:ilvl w:val="0"/>
-                <w:numId w:val="2"/>
-              </w:numPr>
-            </w:pPr>
-            <w:r>
-              <w:rPr>
-                <w:rFonts w:ascii="Arial Narrow" w:cs="Arial Narrow" w:eastAsia="Arial Narrow" w:hAnsi="Arial Narrow"/>
-                <w:sz w:val="22"/>
-                <w:szCs w:val="22"/>
-              </w:rPr>
-              <w:t xml:space="preserve">1 L de fond brun de veau</w:t>
-            </w:r>
-          </w:p>
-          <w:p>
-            <w:pPr>
-              <w:pStyle w:val="ListParagraph"/>
-              <w:numPr>
-                <w:ilvl w:val="0"/>
-                <w:numId w:val="2"/>
-              </w:numPr>
-            </w:pPr>
-            <w:r>
-              <w:rPr>
-                <w:rFonts w:ascii="Arial Narrow" w:cs="Arial Narrow" w:eastAsia="Arial Narrow" w:hAnsi="Arial Narrow"/>
-                <w:sz w:val="22"/>
-                <w:szCs w:val="22"/>
-              </w:rPr>
-              <w:t xml:space="preserve">30 g de miel</w:t>
+              <w:t xml:space="preserve">150 g de graisse de canard</w:t>
+            </w:r>
+          </w:p>
+          <w:p>
+            <w:pPr>
+              <w:pStyle w:val="ListParagraph"/>
+              <w:numPr>
+                <w:ilvl w:val="0"/>
+                <w:numId w:val="2"/>
+              </w:numPr>
+            </w:pPr>
+            <w:r>
+              <w:rPr>
+                <w:rFonts w:ascii="Arial Narrow" w:cs="Arial Narrow" w:eastAsia="Arial Narrow" w:hAnsi="Arial Narrow"/>
+                <w:sz w:val="22"/>
+                <w:szCs w:val="22"/>
+              </w:rPr>
+              <w:t xml:space="preserve">6 oignons</w:t>
+            </w:r>
+          </w:p>
+          <w:p>
+            <w:pPr>
+              <w:pStyle w:val="ListParagraph"/>
+              <w:numPr>
+                <w:ilvl w:val="0"/>
+                <w:numId w:val="2"/>
+              </w:numPr>
+            </w:pPr>
+            <w:r>
+              <w:rPr>
+                <w:rFonts w:ascii="Arial Narrow" w:cs="Arial Narrow" w:eastAsia="Arial Narrow" w:hAnsi="Arial Narrow"/>
+                <w:sz w:val="22"/>
+                <w:szCs w:val="22"/>
+              </w:rPr>
+              <w:t xml:space="preserve">6 carottes</w:t>
+            </w:r>
+          </w:p>
+          <w:p>
+            <w:pPr>
+              <w:pStyle w:val="ListParagraph"/>
+              <w:numPr>
+                <w:ilvl w:val="0"/>
+                <w:numId w:val="2"/>
+              </w:numPr>
+            </w:pPr>
+            <w:r>
+              <w:rPr>
+                <w:rFonts w:ascii="Arial Narrow" w:cs="Arial Narrow" w:eastAsia="Arial Narrow" w:hAnsi="Arial Narrow"/>
+                <w:sz w:val="22"/>
+                <w:szCs w:val="22"/>
+              </w:rPr>
+              <w:t xml:space="preserve">3 têtes d'ail</w:t>
+            </w:r>
+          </w:p>
+          <w:p>
+            <w:pPr>
+              <w:pStyle w:val="ListParagraph"/>
+              <w:numPr>
+                <w:ilvl w:val="0"/>
+                <w:numId w:val="2"/>
+              </w:numPr>
+            </w:pPr>
+            <w:r>
+              <w:rPr>
+                <w:rFonts w:ascii="Arial Narrow" w:cs="Arial Narrow" w:eastAsia="Arial Narrow" w:hAnsi="Arial Narrow"/>
+                <w:sz w:val="22"/>
+                <w:szCs w:val="22"/>
+              </w:rPr>
+              <w:t xml:space="preserve">3 bouquets garnis</w:t>
+            </w:r>
+          </w:p>
+          <w:p>
+            <w:pPr>
+              <w:pStyle w:val="ListParagraph"/>
+              <w:numPr>
+                <w:ilvl w:val="0"/>
+                <w:numId w:val="2"/>
+              </w:numPr>
+            </w:pPr>
+            <w:r>
+              <w:rPr>
+                <w:rFonts w:ascii="Arial Narrow" w:cs="Arial Narrow" w:eastAsia="Arial Narrow" w:hAnsi="Arial Narrow"/>
+                <w:sz w:val="22"/>
+                <w:szCs w:val="22"/>
+              </w:rPr>
+              <w:t xml:space="preserve">1,5 L de cidre brut</w:t>
+            </w:r>
+          </w:p>
+          <w:p>
+            <w:pPr>
+              <w:pStyle w:val="ListParagraph"/>
+              <w:numPr>
+                <w:ilvl w:val="0"/>
+                <w:numId w:val="2"/>
+              </w:numPr>
+            </w:pPr>
+            <w:r>
+              <w:rPr>
+                <w:rFonts w:ascii="Arial Narrow" w:cs="Arial Narrow" w:eastAsia="Arial Narrow" w:hAnsi="Arial Narrow"/>
+                <w:sz w:val="22"/>
+                <w:szCs w:val="22"/>
+              </w:rPr>
+              <w:t xml:space="preserve">3 L de fond brun de veau</w:t>
+            </w:r>
+          </w:p>
+          <w:p>
+            <w:pPr>
+              <w:pStyle w:val="ListParagraph"/>
+              <w:numPr>
+                <w:ilvl w:val="0"/>
+                <w:numId w:val="2"/>
+              </w:numPr>
+            </w:pPr>
+            <w:r>
+              <w:rPr>
+                <w:rFonts w:ascii="Arial Narrow" w:cs="Arial Narrow" w:eastAsia="Arial Narrow" w:hAnsi="Arial Narrow"/>
+                <w:sz w:val="22"/>
+                <w:szCs w:val="22"/>
+              </w:rPr>
+              <w:t xml:space="preserve">100 g de miel</w:t>
             </w:r>
           </w:p>
         </w:tc>
@@ -11307,7 +11291,7 @@
                 <w:sz w:val="22"/>
                 <w:szCs w:val="22"/>
               </w:rPr>
-              <w:t xml:space="preserve">Colorer le cuissot sur toutes les faces dans la graisse de canard en cocotte.</w:t>
+              <w:t xml:space="preserve">Colorer les cuissots sur toutes les faces dans la graisse de canard en cocotte.</w:t>
             </w:r>
           </w:p>
           <w:p>
@@ -11523,7 +11507,7 @@
                 <w:sz w:val="22"/>
                 <w:szCs w:val="22"/>
               </w:rPr>
-              <w:t xml:space="preserve">Présenter le cuissot entier sur planche, découpe en salle, avec le jus, les sauces et la garniture choisie.</w:t>
+              <w:t xml:space="preserve">Présenter chaque cuissot entier sur planche, découpe en salle, avec le jus, les sauces et la garniture choisie.</w:t>
             </w:r>
           </w:p>
         </w:tc>
@@ -11560,7 +11544,7 @@
           <w:sz w:val="22"/>
           <w:szCs w:val="22"/>
         </w:rPr>
-        <w:t xml:space="preserve">(1 épaule – 2 couverts)</w:t>
+        <w:t xml:space="preserve">(5 épaules pour 2 personnes)</w:t>
       </w:r>
     </w:p>
     <w:tbl>
@@ -11614,7 +11598,7 @@
                 <w:szCs w:val="22"/>
                 <w:u w:val="single"/>
               </w:rPr>
-              <w:t xml:space="preserve">INGRÉDIENTS :</w:t>
+              <w:t xml:space="preserve">INGRÉDIENTS (10 couverts) :</w:t>
             </w:r>
           </w:p>
         </w:tc>
@@ -11701,92 +11685,92 @@
                 <w:sz w:val="22"/>
                 <w:szCs w:val="22"/>
               </w:rPr>
-              <w:t xml:space="preserve">1 épaule de cochon avec os (≈ 1,6 kg)</w:t>
-            </w:r>
-          </w:p>
-          <w:p>
-            <w:pPr>
-              <w:pStyle w:val="ListParagraph"/>
-              <w:numPr>
-                <w:ilvl w:val="0"/>
-                <w:numId w:val="2"/>
-              </w:numPr>
-            </w:pPr>
-            <w:r>
-              <w:rPr>
-                <w:rFonts w:ascii="Arial Narrow" w:cs="Arial Narrow" w:eastAsia="Arial Narrow" w:hAnsi="Arial Narrow"/>
-                <w:sz w:val="22"/>
-                <w:szCs w:val="22"/>
-              </w:rPr>
-              <w:t xml:space="preserve">16 g de sel fin</w:t>
-            </w:r>
-          </w:p>
-          <w:p>
-            <w:pPr>
-              <w:pStyle w:val="ListParagraph"/>
-              <w:numPr>
-                <w:ilvl w:val="0"/>
-                <w:numId w:val="2"/>
-              </w:numPr>
-            </w:pPr>
-            <w:r>
-              <w:rPr>
-                <w:rFonts w:ascii="Arial Narrow" w:cs="Arial Narrow" w:eastAsia="Arial Narrow" w:hAnsi="Arial Narrow"/>
-                <w:sz w:val="22"/>
-                <w:szCs w:val="22"/>
-              </w:rPr>
-              <w:t xml:space="preserve">2 g de poivre moulu</w:t>
-            </w:r>
-          </w:p>
-          <w:p>
-            <w:pPr>
-              <w:pStyle w:val="ListParagraph"/>
-              <w:numPr>
-                <w:ilvl w:val="0"/>
-                <w:numId w:val="2"/>
-              </w:numPr>
-            </w:pPr>
-            <w:r>
-              <w:rPr>
-                <w:rFonts w:ascii="Arial Narrow" w:cs="Arial Narrow" w:eastAsia="Arial Narrow" w:hAnsi="Arial Narrow"/>
-                <w:sz w:val="22"/>
-                <w:szCs w:val="22"/>
-              </w:rPr>
-              <w:t xml:space="preserve">5 g de graines de fenouil torréfiées</w:t>
-            </w:r>
-          </w:p>
-          <w:p>
-            <w:pPr>
-              <w:pStyle w:val="ListParagraph"/>
-              <w:numPr>
-                <w:ilvl w:val="0"/>
-                <w:numId w:val="2"/>
-              </w:numPr>
-            </w:pPr>
-            <w:r>
-              <w:rPr>
-                <w:rFonts w:ascii="Arial Narrow" w:cs="Arial Narrow" w:eastAsia="Arial Narrow" w:hAnsi="Arial Narrow"/>
-                <w:sz w:val="22"/>
-                <w:szCs w:val="22"/>
-              </w:rPr>
-              <w:t xml:space="preserve">2 branches de romarin</w:t>
-            </w:r>
-          </w:p>
-          <w:p>
-            <w:pPr>
-              <w:pStyle w:val="ListParagraph"/>
-              <w:numPr>
-                <w:ilvl w:val="0"/>
-                <w:numId w:val="2"/>
-              </w:numPr>
-            </w:pPr>
-            <w:r>
-              <w:rPr>
-                <w:rFonts w:ascii="Arial Narrow" w:cs="Arial Narrow" w:eastAsia="Arial Narrow" w:hAnsi="Arial Narrow"/>
-                <w:sz w:val="22"/>
-                <w:szCs w:val="22"/>
-              </w:rPr>
-              <w:t xml:space="preserve">3 gousses d'ail</w:t>
+              <w:t xml:space="preserve">5 épaules de cochon avec os (≈ 1,6 kg pièce)</w:t>
+            </w:r>
+          </w:p>
+          <w:p>
+            <w:pPr>
+              <w:pStyle w:val="ListParagraph"/>
+              <w:numPr>
+                <w:ilvl w:val="0"/>
+                <w:numId w:val="2"/>
+              </w:numPr>
+            </w:pPr>
+            <w:r>
+              <w:rPr>
+                <w:rFonts w:ascii="Arial Narrow" w:cs="Arial Narrow" w:eastAsia="Arial Narrow" w:hAnsi="Arial Narrow"/>
+                <w:sz w:val="22"/>
+                <w:szCs w:val="22"/>
+              </w:rPr>
+              <w:t xml:space="preserve">80 g de sel fin</w:t>
+            </w:r>
+          </w:p>
+          <w:p>
+            <w:pPr>
+              <w:pStyle w:val="ListParagraph"/>
+              <w:numPr>
+                <w:ilvl w:val="0"/>
+                <w:numId w:val="2"/>
+              </w:numPr>
+            </w:pPr>
+            <w:r>
+              <w:rPr>
+                <w:rFonts w:ascii="Arial Narrow" w:cs="Arial Narrow" w:eastAsia="Arial Narrow" w:hAnsi="Arial Narrow"/>
+                <w:sz w:val="22"/>
+                <w:szCs w:val="22"/>
+              </w:rPr>
+              <w:t xml:space="preserve">10 g de poivre moulu</w:t>
+            </w:r>
+          </w:p>
+          <w:p>
+            <w:pPr>
+              <w:pStyle w:val="ListParagraph"/>
+              <w:numPr>
+                <w:ilvl w:val="0"/>
+                <w:numId w:val="2"/>
+              </w:numPr>
+            </w:pPr>
+            <w:r>
+              <w:rPr>
+                <w:rFonts w:ascii="Arial Narrow" w:cs="Arial Narrow" w:eastAsia="Arial Narrow" w:hAnsi="Arial Narrow"/>
+                <w:sz w:val="22"/>
+                <w:szCs w:val="22"/>
+              </w:rPr>
+              <w:t xml:space="preserve">25 g de graines de fenouil torréfiées</w:t>
+            </w:r>
+          </w:p>
+          <w:p>
+            <w:pPr>
+              <w:pStyle w:val="ListParagraph"/>
+              <w:numPr>
+                <w:ilvl w:val="0"/>
+                <w:numId w:val="2"/>
+              </w:numPr>
+            </w:pPr>
+            <w:r>
+              <w:rPr>
+                <w:rFonts w:ascii="Arial Narrow" w:cs="Arial Narrow" w:eastAsia="Arial Narrow" w:hAnsi="Arial Narrow"/>
+                <w:sz w:val="22"/>
+                <w:szCs w:val="22"/>
+              </w:rPr>
+              <w:t xml:space="preserve">10 branches de romarin</w:t>
+            </w:r>
+          </w:p>
+          <w:p>
+            <w:pPr>
+              <w:pStyle w:val="ListParagraph"/>
+              <w:numPr>
+                <w:ilvl w:val="0"/>
+                <w:numId w:val="2"/>
+              </w:numPr>
+            </w:pPr>
+            <w:r>
+              <w:rPr>
+                <w:rFonts w:ascii="Arial Narrow" w:cs="Arial Narrow" w:eastAsia="Arial Narrow" w:hAnsi="Arial Narrow"/>
+                <w:sz w:val="22"/>
+                <w:szCs w:val="22"/>
+              </w:rPr>
+              <w:t xml:space="preserve">15 gousses d'ail</w:t>
             </w:r>
           </w:p>
         </w:tc>
@@ -11857,7 +11841,7 @@
                 <w:sz w:val="22"/>
                 <w:szCs w:val="22"/>
               </w:rPr>
-              <w:t xml:space="preserve">Frotter l'épaule avec ce mélange, le sel et le poivre. Filmer et réserver 12 heures au froid.</w:t>
+              <w:t xml:space="preserve">Frotter les épaules avec ce mélange, le sel et le poivre. Filmer et réserver 12 heures au froid.</w:t>
             </w:r>
           </w:p>
         </w:tc>
@@ -11909,92 +11893,92 @@
                 <w:sz w:val="22"/>
                 <w:szCs w:val="22"/>
               </w:rPr>
-              <w:t xml:space="preserve">30 g de graisse de canard</w:t>
-            </w:r>
-          </w:p>
-          <w:p>
-            <w:pPr>
-              <w:pStyle w:val="ListParagraph"/>
-              <w:numPr>
-                <w:ilvl w:val="0"/>
-                <w:numId w:val="2"/>
-              </w:numPr>
-            </w:pPr>
-            <w:r>
-              <w:rPr>
-                <w:rFonts w:ascii="Arial Narrow" w:cs="Arial Narrow" w:eastAsia="Arial Narrow" w:hAnsi="Arial Narrow"/>
-                <w:sz w:val="22"/>
-                <w:szCs w:val="22"/>
-              </w:rPr>
-              <w:t xml:space="preserve">2 oignons</w:t>
-            </w:r>
-          </w:p>
-          <w:p>
-            <w:pPr>
-              <w:pStyle w:val="ListParagraph"/>
-              <w:numPr>
-                <w:ilvl w:val="0"/>
-                <w:numId w:val="2"/>
-              </w:numPr>
-            </w:pPr>
-            <w:r>
-              <w:rPr>
-                <w:rFonts w:ascii="Arial Narrow" w:cs="Arial Narrow" w:eastAsia="Arial Narrow" w:hAnsi="Arial Narrow"/>
-                <w:sz w:val="22"/>
-                <w:szCs w:val="22"/>
-              </w:rPr>
-              <w:t xml:space="preserve">1 carotte</w:t>
-            </w:r>
-          </w:p>
-          <w:p>
-            <w:pPr>
-              <w:pStyle w:val="ListParagraph"/>
-              <w:numPr>
-                <w:ilvl w:val="0"/>
-                <w:numId w:val="2"/>
-              </w:numPr>
-            </w:pPr>
-            <w:r>
-              <w:rPr>
-                <w:rFonts w:ascii="Arial Narrow" w:cs="Arial Narrow" w:eastAsia="Arial Narrow" w:hAnsi="Arial Narrow"/>
-                <w:sz w:val="22"/>
-                <w:szCs w:val="22"/>
-              </w:rPr>
-              <w:t xml:space="preserve">1 bulbe de fenouil</w:t>
-            </w:r>
-          </w:p>
-          <w:p>
-            <w:pPr>
-              <w:pStyle w:val="ListParagraph"/>
-              <w:numPr>
-                <w:ilvl w:val="0"/>
-                <w:numId w:val="2"/>
-              </w:numPr>
-            </w:pPr>
-            <w:r>
-              <w:rPr>
-                <w:rFonts w:ascii="Arial Narrow" w:cs="Arial Narrow" w:eastAsia="Arial Narrow" w:hAnsi="Arial Narrow"/>
-                <w:sz w:val="22"/>
-                <w:szCs w:val="22"/>
-              </w:rPr>
-              <w:t xml:space="preserve">300 g de vin blanc sec</w:t>
-            </w:r>
-          </w:p>
-          <w:p>
-            <w:pPr>
-              <w:pStyle w:val="ListParagraph"/>
-              <w:numPr>
-                <w:ilvl w:val="0"/>
-                <w:numId w:val="2"/>
-              </w:numPr>
-            </w:pPr>
-            <w:r>
-              <w:rPr>
-                <w:rFonts w:ascii="Arial Narrow" w:cs="Arial Narrow" w:eastAsia="Arial Narrow" w:hAnsi="Arial Narrow"/>
-                <w:sz w:val="22"/>
-                <w:szCs w:val="22"/>
-              </w:rPr>
-              <w:t xml:space="preserve">700 g de fond brun de veau</w:t>
+              <w:t xml:space="preserve">150 g de graisse de canard</w:t>
+            </w:r>
+          </w:p>
+          <w:p>
+            <w:pPr>
+              <w:pStyle w:val="ListParagraph"/>
+              <w:numPr>
+                <w:ilvl w:val="0"/>
+                <w:numId w:val="2"/>
+              </w:numPr>
+            </w:pPr>
+            <w:r>
+              <w:rPr>
+                <w:rFonts w:ascii="Arial Narrow" w:cs="Arial Narrow" w:eastAsia="Arial Narrow" w:hAnsi="Arial Narrow"/>
+                <w:sz w:val="22"/>
+                <w:szCs w:val="22"/>
+              </w:rPr>
+              <w:t xml:space="preserve">10 oignons</w:t>
+            </w:r>
+          </w:p>
+          <w:p>
+            <w:pPr>
+              <w:pStyle w:val="ListParagraph"/>
+              <w:numPr>
+                <w:ilvl w:val="0"/>
+                <w:numId w:val="2"/>
+              </w:numPr>
+            </w:pPr>
+            <w:r>
+              <w:rPr>
+                <w:rFonts w:ascii="Arial Narrow" w:cs="Arial Narrow" w:eastAsia="Arial Narrow" w:hAnsi="Arial Narrow"/>
+                <w:sz w:val="22"/>
+                <w:szCs w:val="22"/>
+              </w:rPr>
+              <w:t xml:space="preserve">5 carottes</w:t>
+            </w:r>
+          </w:p>
+          <w:p>
+            <w:pPr>
+              <w:pStyle w:val="ListParagraph"/>
+              <w:numPr>
+                <w:ilvl w:val="0"/>
+                <w:numId w:val="2"/>
+              </w:numPr>
+            </w:pPr>
+            <w:r>
+              <w:rPr>
+                <w:rFonts w:ascii="Arial Narrow" w:cs="Arial Narrow" w:eastAsia="Arial Narrow" w:hAnsi="Arial Narrow"/>
+                <w:sz w:val="22"/>
+                <w:szCs w:val="22"/>
+              </w:rPr>
+              <w:t xml:space="preserve">5 bulbes de fenouil</w:t>
+            </w:r>
+          </w:p>
+          <w:p>
+            <w:pPr>
+              <w:pStyle w:val="ListParagraph"/>
+              <w:numPr>
+                <w:ilvl w:val="0"/>
+                <w:numId w:val="2"/>
+              </w:numPr>
+            </w:pPr>
+            <w:r>
+              <w:rPr>
+                <w:rFonts w:ascii="Arial Narrow" w:cs="Arial Narrow" w:eastAsia="Arial Narrow" w:hAnsi="Arial Narrow"/>
+                <w:sz w:val="22"/>
+                <w:szCs w:val="22"/>
+              </w:rPr>
+              <w:t xml:space="preserve">1,5 L de vin blanc sec</w:t>
+            </w:r>
+          </w:p>
+          <w:p>
+            <w:pPr>
+              <w:pStyle w:val="ListParagraph"/>
+              <w:numPr>
+                <w:ilvl w:val="0"/>
+                <w:numId w:val="2"/>
+              </w:numPr>
+            </w:pPr>
+            <w:r>
+              <w:rPr>
+                <w:rFonts w:ascii="Arial Narrow" w:cs="Arial Narrow" w:eastAsia="Arial Narrow" w:hAnsi="Arial Narrow"/>
+                <w:sz w:val="22"/>
+                <w:szCs w:val="22"/>
+              </w:rPr>
+              <w:t xml:space="preserve">3,5 L de fond brun de veau</w:t>
             </w:r>
           </w:p>
         </w:tc>
@@ -12046,7 +12030,7 @@
                 <w:sz w:val="22"/>
                 <w:szCs w:val="22"/>
               </w:rPr>
-              <w:t xml:space="preserve">Colorer l'épaule sur toutes les faces en cocotte.</w:t>
+              <w:t xml:space="preserve">Colorer les épaules sur toutes les faces en cocotte.</w:t>
             </w:r>
           </w:p>
           <w:p>
@@ -12243,7 +12227,7 @@
                 <w:sz w:val="22"/>
                 <w:szCs w:val="22"/>
               </w:rPr>
-              <w:t xml:space="preserve">Présenter l'épaule entière sur planche avec le jus, les sauces et la garniture choisie.</w:t>
+              <w:t xml:space="preserve">Présenter chaque épaule entière sur planche avec le jus, les sauces et la garniture choisie.</w:t>
             </w:r>
           </w:p>
         </w:tc>
@@ -12280,7 +12264,7 @@
           <w:sz w:val="22"/>
           <w:szCs w:val="22"/>
         </w:rPr>
-        <w:t xml:space="preserve">(1 porchetta – 12 à 14 portions)</w:t>
+        <w:t xml:space="preserve">(250 g par personne)</w:t>
       </w:r>
     </w:p>
     <w:tbl>
@@ -12334,7 +12318,7 @@
                 <w:szCs w:val="22"/>
                 <w:u w:val="single"/>
               </w:rPr>
-              <w:t xml:space="preserve">INGRÉDIENTS :</w:t>
+              <w:t xml:space="preserve">INGRÉDIENTS (10 couverts) :</w:t>
             </w:r>
           </w:p>
         </w:tc>
@@ -12421,24 +12405,24 @@
                 <w:sz w:val="22"/>
                 <w:szCs w:val="22"/>
               </w:rPr>
-              <w:t xml:space="preserve">1 longe de porc avec poitrine attenante et couenne (≈ 4 kg)</w:t>
-            </w:r>
-          </w:p>
-          <w:p>
-            <w:pPr>
-              <w:pStyle w:val="ListParagraph"/>
-              <w:numPr>
-                <w:ilvl w:val="0"/>
-                <w:numId w:val="2"/>
-              </w:numPr>
-            </w:pPr>
-            <w:r>
-              <w:rPr>
-                <w:rFonts w:ascii="Arial Narrow" w:cs="Arial Narrow" w:eastAsia="Arial Narrow" w:hAnsi="Arial Narrow"/>
-                <w:sz w:val="22"/>
-                <w:szCs w:val="22"/>
-              </w:rPr>
-              <w:t xml:space="preserve">45 g de sel fin</w:t>
+              <w:t xml:space="preserve">1 longe de porc avec poitrine attenante et couenne (≈ 3 kg)</w:t>
+            </w:r>
+          </w:p>
+          <w:p>
+            <w:pPr>
+              <w:pStyle w:val="ListParagraph"/>
+              <w:numPr>
+                <w:ilvl w:val="0"/>
+                <w:numId w:val="2"/>
+              </w:numPr>
+            </w:pPr>
+            <w:r>
+              <w:rPr>
+                <w:rFonts w:ascii="Arial Narrow" w:cs="Arial Narrow" w:eastAsia="Arial Narrow" w:hAnsi="Arial Narrow"/>
+                <w:sz w:val="22"/>
+                <w:szCs w:val="22"/>
+              </w:rPr>
+              <w:t xml:space="preserve">35 g de sel fin</w:t>
             </w:r>
           </w:p>
         </w:tc>
@@ -12561,109 +12545,109 @@
                 <w:sz w:val="22"/>
                 <w:szCs w:val="22"/>
               </w:rPr>
-              <w:t xml:space="preserve">500 g de chair à saucisse</w:t>
-            </w:r>
-          </w:p>
-          <w:p>
-            <w:pPr>
-              <w:pStyle w:val="ListParagraph"/>
-              <w:numPr>
-                <w:ilvl w:val="0"/>
-                <w:numId w:val="2"/>
-              </w:numPr>
-            </w:pPr>
-            <w:r>
-              <w:rPr>
-                <w:rFonts w:ascii="Arial Narrow" w:cs="Arial Narrow" w:eastAsia="Arial Narrow" w:hAnsi="Arial Narrow"/>
-                <w:sz w:val="22"/>
-                <w:szCs w:val="22"/>
-              </w:rPr>
-              <w:t xml:space="preserve">30 g de graines de fenouil torréfiées</w:t>
-            </w:r>
-          </w:p>
-          <w:p>
-            <w:pPr>
-              <w:pStyle w:val="ListParagraph"/>
-              <w:numPr>
-                <w:ilvl w:val="0"/>
-                <w:numId w:val="2"/>
-              </w:numPr>
-            </w:pPr>
-            <w:r>
-              <w:rPr>
-                <w:rFonts w:ascii="Arial Narrow" w:cs="Arial Narrow" w:eastAsia="Arial Narrow" w:hAnsi="Arial Narrow"/>
-                <w:sz w:val="22"/>
-                <w:szCs w:val="22"/>
-              </w:rPr>
-              <w:t xml:space="preserve">6 gousses d'ail</w:t>
-            </w:r>
-          </w:p>
-          <w:p>
-            <w:pPr>
-              <w:pStyle w:val="ListParagraph"/>
-              <w:numPr>
-                <w:ilvl w:val="0"/>
-                <w:numId w:val="2"/>
-              </w:numPr>
-            </w:pPr>
-            <w:r>
-              <w:rPr>
-                <w:rFonts w:ascii="Arial Narrow" w:cs="Arial Narrow" w:eastAsia="Arial Narrow" w:hAnsi="Arial Narrow"/>
-                <w:sz w:val="22"/>
-                <w:szCs w:val="22"/>
-              </w:rPr>
-              <w:t xml:space="preserve">20 g de romarin</w:t>
-            </w:r>
-          </w:p>
-          <w:p>
-            <w:pPr>
-              <w:pStyle w:val="ListParagraph"/>
-              <w:numPr>
-                <w:ilvl w:val="0"/>
-                <w:numId w:val="2"/>
-              </w:numPr>
-            </w:pPr>
-            <w:r>
-              <w:rPr>
-                <w:rFonts w:ascii="Arial Narrow" w:cs="Arial Narrow" w:eastAsia="Arial Narrow" w:hAnsi="Arial Narrow"/>
-                <w:sz w:val="22"/>
-                <w:szCs w:val="22"/>
-              </w:rPr>
-              <w:t xml:space="preserve">10 g de sauge</w:t>
-            </w:r>
-          </w:p>
-          <w:p>
-            <w:pPr>
-              <w:pStyle w:val="ListParagraph"/>
-              <w:numPr>
-                <w:ilvl w:val="0"/>
-                <w:numId w:val="2"/>
-              </w:numPr>
-            </w:pPr>
-            <w:r>
-              <w:rPr>
-                <w:rFonts w:ascii="Arial Narrow" w:cs="Arial Narrow" w:eastAsia="Arial Narrow" w:hAnsi="Arial Narrow"/>
-                <w:sz w:val="22"/>
-                <w:szCs w:val="22"/>
-              </w:rPr>
-              <w:t xml:space="preserve">Le zeste de 2 citrons</w:t>
-            </w:r>
-          </w:p>
-          <w:p>
-            <w:pPr>
-              <w:pStyle w:val="ListParagraph"/>
-              <w:numPr>
-                <w:ilvl w:val="0"/>
-                <w:numId w:val="2"/>
-              </w:numPr>
-            </w:pPr>
-            <w:r>
-              <w:rPr>
-                <w:rFonts w:ascii="Arial Narrow" w:cs="Arial Narrow" w:eastAsia="Arial Narrow" w:hAnsi="Arial Narrow"/>
-                <w:sz w:val="22"/>
-                <w:szCs w:val="22"/>
-              </w:rPr>
-              <w:t xml:space="preserve">10 g de poivre noir concassé</w:t>
+              <w:t xml:space="preserve">400 g de chair à saucisse</w:t>
+            </w:r>
+          </w:p>
+          <w:p>
+            <w:pPr>
+              <w:pStyle w:val="ListParagraph"/>
+              <w:numPr>
+                <w:ilvl w:val="0"/>
+                <w:numId w:val="2"/>
+              </w:numPr>
+            </w:pPr>
+            <w:r>
+              <w:rPr>
+                <w:rFonts w:ascii="Arial Narrow" w:cs="Arial Narrow" w:eastAsia="Arial Narrow" w:hAnsi="Arial Narrow"/>
+                <w:sz w:val="22"/>
+                <w:szCs w:val="22"/>
+              </w:rPr>
+              <w:t xml:space="preserve">25 g de graines de fenouil torréfiées</w:t>
+            </w:r>
+          </w:p>
+          <w:p>
+            <w:pPr>
+              <w:pStyle w:val="ListParagraph"/>
+              <w:numPr>
+                <w:ilvl w:val="0"/>
+                <w:numId w:val="2"/>
+              </w:numPr>
+            </w:pPr>
+            <w:r>
+              <w:rPr>
+                <w:rFonts w:ascii="Arial Narrow" w:cs="Arial Narrow" w:eastAsia="Arial Narrow" w:hAnsi="Arial Narrow"/>
+                <w:sz w:val="22"/>
+                <w:szCs w:val="22"/>
+              </w:rPr>
+              <w:t xml:space="preserve">5 gousses d'ail</w:t>
+            </w:r>
+          </w:p>
+          <w:p>
+            <w:pPr>
+              <w:pStyle w:val="ListParagraph"/>
+              <w:numPr>
+                <w:ilvl w:val="0"/>
+                <w:numId w:val="2"/>
+              </w:numPr>
+            </w:pPr>
+            <w:r>
+              <w:rPr>
+                <w:rFonts w:ascii="Arial Narrow" w:cs="Arial Narrow" w:eastAsia="Arial Narrow" w:hAnsi="Arial Narrow"/>
+                <w:sz w:val="22"/>
+                <w:szCs w:val="22"/>
+              </w:rPr>
+              <w:t xml:space="preserve">15 g de romarin</w:t>
+            </w:r>
+          </w:p>
+          <w:p>
+            <w:pPr>
+              <w:pStyle w:val="ListParagraph"/>
+              <w:numPr>
+                <w:ilvl w:val="0"/>
+                <w:numId w:val="2"/>
+              </w:numPr>
+            </w:pPr>
+            <w:r>
+              <w:rPr>
+                <w:rFonts w:ascii="Arial Narrow" w:cs="Arial Narrow" w:eastAsia="Arial Narrow" w:hAnsi="Arial Narrow"/>
+                <w:sz w:val="22"/>
+                <w:szCs w:val="22"/>
+              </w:rPr>
+              <w:t xml:space="preserve">8 g de sauge</w:t>
+            </w:r>
+          </w:p>
+          <w:p>
+            <w:pPr>
+              <w:pStyle w:val="ListParagraph"/>
+              <w:numPr>
+                <w:ilvl w:val="0"/>
+                <w:numId w:val="2"/>
+              </w:numPr>
+            </w:pPr>
+            <w:r>
+              <w:rPr>
+                <w:rFonts w:ascii="Arial Narrow" w:cs="Arial Narrow" w:eastAsia="Arial Narrow" w:hAnsi="Arial Narrow"/>
+                <w:sz w:val="22"/>
+                <w:szCs w:val="22"/>
+              </w:rPr>
+              <w:t xml:space="preserve">Le zeste d'1 citron et demi</w:t>
+            </w:r>
+          </w:p>
+          <w:p>
+            <w:pPr>
+              <w:pStyle w:val="ListParagraph"/>
+              <w:numPr>
+                <w:ilvl w:val="0"/>
+                <w:numId w:val="2"/>
+              </w:numPr>
+            </w:pPr>
+            <w:r>
+              <w:rPr>
+                <w:rFonts w:ascii="Arial Narrow" w:cs="Arial Narrow" w:eastAsia="Arial Narrow" w:hAnsi="Arial Narrow"/>
+                <w:sz w:val="22"/>
+                <w:szCs w:val="22"/>
+              </w:rPr>
+              <w:t xml:space="preserve">8 g de poivre noir concassé</w:t>
             </w:r>
           </w:p>
           <w:p>
@@ -12912,7 +12896,7 @@
                 <w:sz w:val="22"/>
                 <w:szCs w:val="22"/>
               </w:rPr>
-              <w:t xml:space="preserve">Rôtir 30 minutes à 230 °C, puis 2 h 30 à 3 heures à 150 °C jusqu'à 68 °C à cœur.</w:t>
+              <w:t xml:space="preserve">Rôtir 30 minutes à 230 °C, puis 2 heures à 2 h 30 à 150 °C jusqu'à 68 °C à cœur.</w:t>
             </w:r>
           </w:p>
           <w:p>
@@ -13074,7 +13058,7 @@
           <w:sz w:val="22"/>
           <w:szCs w:val="22"/>
         </w:rPr>
-        <w:t xml:space="preserve">(1 carré de 10 côtes – 10 couverts)</w:t>
+        <w:t xml:space="preserve">(1 côte par personne)</w:t>
       </w:r>
     </w:p>
     <w:tbl>
@@ -13128,7 +13112,7 @@
                 <w:szCs w:val="22"/>
                 <w:u w:val="single"/>
               </w:rPr>
-              <w:t xml:space="preserve">INGRÉDIENTS :</w:t>
+              <w:t xml:space="preserve">INGRÉDIENTS (10 couverts) :</w:t>
             </w:r>
           </w:p>
         </w:tc>
@@ -13724,7 +13708,7 @@
           <w:sz w:val="22"/>
           <w:szCs w:val="22"/>
         </w:rPr>
-        <w:t xml:space="preserve">(1 L)</w:t>
+        <w:t xml:space="preserve">(≈ 60 g par personne)</w:t>
       </w:r>
     </w:p>
     <w:tbl>
@@ -13778,7 +13762,7 @@
                 <w:szCs w:val="22"/>
                 <w:u w:val="single"/>
               </w:rPr>
-              <w:t xml:space="preserve">INGRÉDIENTS :</w:t>
+              <w:t xml:space="preserve">INGRÉDIENTS (10 couverts) :</w:t>
             </w:r>
           </w:p>
         </w:tc>
@@ -13849,194 +13833,194 @@
                 <w:sz w:val="22"/>
                 <w:szCs w:val="22"/>
               </w:rPr>
-              <w:t xml:space="preserve">150 g d'échalotes</w:t>
-            </w:r>
-          </w:p>
-          <w:p>
-            <w:pPr>
-              <w:pStyle w:val="ListParagraph"/>
-              <w:numPr>
-                <w:ilvl w:val="0"/>
-                <w:numId w:val="2"/>
-              </w:numPr>
-            </w:pPr>
-            <w:r>
-              <w:rPr>
-                <w:rFonts w:ascii="Arial Narrow" w:cs="Arial Narrow" w:eastAsia="Arial Narrow" w:hAnsi="Arial Narrow"/>
-                <w:sz w:val="22"/>
-                <w:szCs w:val="22"/>
-              </w:rPr>
-              <w:t xml:space="preserve">30 g de beurre</w:t>
-            </w:r>
-          </w:p>
-          <w:p>
-            <w:pPr>
-              <w:pStyle w:val="ListParagraph"/>
-              <w:numPr>
-                <w:ilvl w:val="0"/>
-                <w:numId w:val="2"/>
-              </w:numPr>
-            </w:pPr>
-            <w:r>
-              <w:rPr>
-                <w:rFonts w:ascii="Arial Narrow" w:cs="Arial Narrow" w:eastAsia="Arial Narrow" w:hAnsi="Arial Narrow"/>
-                <w:sz w:val="22"/>
-                <w:szCs w:val="22"/>
-              </w:rPr>
-              <w:t xml:space="preserve">200 g de vin blanc sec</w:t>
-            </w:r>
-          </w:p>
-          <w:p>
-            <w:pPr>
-              <w:pStyle w:val="ListParagraph"/>
-              <w:numPr>
-                <w:ilvl w:val="0"/>
-                <w:numId w:val="2"/>
-              </w:numPr>
-            </w:pPr>
-            <w:r>
-              <w:rPr>
-                <w:rFonts w:ascii="Arial Narrow" w:cs="Arial Narrow" w:eastAsia="Arial Narrow" w:hAnsi="Arial Narrow"/>
-                <w:sz w:val="22"/>
-                <w:szCs w:val="22"/>
-              </w:rPr>
-              <w:t xml:space="preserve">50 g de vinaigre de cidre</w:t>
-            </w:r>
-          </w:p>
-          <w:p>
-            <w:pPr>
-              <w:pStyle w:val="ListParagraph"/>
-              <w:numPr>
-                <w:ilvl w:val="0"/>
-                <w:numId w:val="2"/>
-              </w:numPr>
-            </w:pPr>
-            <w:r>
-              <w:rPr>
-                <w:rFonts w:ascii="Arial Narrow" w:cs="Arial Narrow" w:eastAsia="Arial Narrow" w:hAnsi="Arial Narrow"/>
-                <w:sz w:val="22"/>
-                <w:szCs w:val="22"/>
-              </w:rPr>
-              <w:t xml:space="preserve">600 g de jus corsé de cochon (voir fiche)</w:t>
-            </w:r>
-          </w:p>
-          <w:p>
-            <w:pPr>
-              <w:pStyle w:val="ListParagraph"/>
-              <w:numPr>
-                <w:ilvl w:val="0"/>
-                <w:numId w:val="2"/>
-              </w:numPr>
-            </w:pPr>
-            <w:r>
-              <w:rPr>
-                <w:rFonts w:ascii="Arial Narrow" w:cs="Arial Narrow" w:eastAsia="Arial Narrow" w:hAnsi="Arial Narrow"/>
-                <w:sz w:val="22"/>
-                <w:szCs w:val="22"/>
-              </w:rPr>
-              <w:t xml:space="preserve">200 g de crème liquide 35 %</w:t>
-            </w:r>
-          </w:p>
-          <w:p>
-            <w:pPr>
-              <w:pStyle w:val="ListParagraph"/>
-              <w:numPr>
-                <w:ilvl w:val="0"/>
-                <w:numId w:val="2"/>
-              </w:numPr>
-            </w:pPr>
-            <w:r>
-              <w:rPr>
-                <w:rFonts w:ascii="Arial Narrow" w:cs="Arial Narrow" w:eastAsia="Arial Narrow" w:hAnsi="Arial Narrow"/>
-                <w:sz w:val="22"/>
-                <w:szCs w:val="22"/>
-              </w:rPr>
-              <w:t xml:space="preserve">60 g de moutarde à l'ancienne</w:t>
-            </w:r>
-          </w:p>
-          <w:p>
-            <w:pPr>
-              <w:pStyle w:val="ListParagraph"/>
-              <w:numPr>
-                <w:ilvl w:val="0"/>
-                <w:numId w:val="2"/>
-              </w:numPr>
-            </w:pPr>
-            <w:r>
-              <w:rPr>
-                <w:rFonts w:ascii="Arial Narrow" w:cs="Arial Narrow" w:eastAsia="Arial Narrow" w:hAnsi="Arial Narrow"/>
-                <w:sz w:val="22"/>
-                <w:szCs w:val="22"/>
-              </w:rPr>
-              <w:t xml:space="preserve">20 g de moutarde de Dijon</w:t>
-            </w:r>
-          </w:p>
-          <w:p>
-            <w:pPr>
-              <w:pStyle w:val="ListParagraph"/>
-              <w:numPr>
-                <w:ilvl w:val="0"/>
-                <w:numId w:val="2"/>
-              </w:numPr>
-            </w:pPr>
-            <w:r>
-              <w:rPr>
-                <w:rFonts w:ascii="Arial Narrow" w:cs="Arial Narrow" w:eastAsia="Arial Narrow" w:hAnsi="Arial Narrow"/>
-                <w:sz w:val="22"/>
-                <w:szCs w:val="22"/>
-              </w:rPr>
-              <w:t xml:space="preserve">80 g de cornichons</w:t>
-            </w:r>
-          </w:p>
-          <w:p>
-            <w:pPr>
-              <w:pStyle w:val="ListParagraph"/>
-              <w:numPr>
-                <w:ilvl w:val="0"/>
-                <w:numId w:val="2"/>
-              </w:numPr>
-            </w:pPr>
-            <w:r>
-              <w:rPr>
-                <w:rFonts w:ascii="Arial Narrow" w:cs="Arial Narrow" w:eastAsia="Arial Narrow" w:hAnsi="Arial Narrow"/>
-                <w:sz w:val="22"/>
-                <w:szCs w:val="22"/>
-              </w:rPr>
-              <w:t xml:space="preserve">30 g de câpres</w:t>
-            </w:r>
-          </w:p>
-          <w:p>
-            <w:pPr>
-              <w:pStyle w:val="ListParagraph"/>
-              <w:numPr>
-                <w:ilvl w:val="0"/>
-                <w:numId w:val="2"/>
-              </w:numPr>
-            </w:pPr>
-            <w:r>
-              <w:rPr>
-                <w:rFonts w:ascii="Arial Narrow" w:cs="Arial Narrow" w:eastAsia="Arial Narrow" w:hAnsi="Arial Narrow"/>
-                <w:sz w:val="22"/>
-                <w:szCs w:val="22"/>
-              </w:rPr>
-              <w:t xml:space="preserve">10 g d'estragon</w:t>
-            </w:r>
-          </w:p>
-          <w:p>
-            <w:pPr>
-              <w:pStyle w:val="ListParagraph"/>
-              <w:numPr>
-                <w:ilvl w:val="0"/>
-                <w:numId w:val="2"/>
-              </w:numPr>
-            </w:pPr>
-            <w:r>
-              <w:rPr>
-                <w:rFonts w:ascii="Arial Narrow" w:cs="Arial Narrow" w:eastAsia="Arial Narrow" w:hAnsi="Arial Narrow"/>
-                <w:sz w:val="22"/>
-                <w:szCs w:val="22"/>
-              </w:rPr>
-              <w:t xml:space="preserve">5 g de poivre mignonnette</w:t>
+              <w:t xml:space="preserve">90 g d'échalotes</w:t>
+            </w:r>
+          </w:p>
+          <w:p>
+            <w:pPr>
+              <w:pStyle w:val="ListParagraph"/>
+              <w:numPr>
+                <w:ilvl w:val="0"/>
+                <w:numId w:val="2"/>
+              </w:numPr>
+            </w:pPr>
+            <w:r>
+              <w:rPr>
+                <w:rFonts w:ascii="Arial Narrow" w:cs="Arial Narrow" w:eastAsia="Arial Narrow" w:hAnsi="Arial Narrow"/>
+                <w:sz w:val="22"/>
+                <w:szCs w:val="22"/>
+              </w:rPr>
+              <w:t xml:space="preserve">20 g de beurre</w:t>
+            </w:r>
+          </w:p>
+          <w:p>
+            <w:pPr>
+              <w:pStyle w:val="ListParagraph"/>
+              <w:numPr>
+                <w:ilvl w:val="0"/>
+                <w:numId w:val="2"/>
+              </w:numPr>
+            </w:pPr>
+            <w:r>
+              <w:rPr>
+                <w:rFonts w:ascii="Arial Narrow" w:cs="Arial Narrow" w:eastAsia="Arial Narrow" w:hAnsi="Arial Narrow"/>
+                <w:sz w:val="22"/>
+                <w:szCs w:val="22"/>
+              </w:rPr>
+              <w:t xml:space="preserve">120 g de vin blanc sec</w:t>
+            </w:r>
+          </w:p>
+          <w:p>
+            <w:pPr>
+              <w:pStyle w:val="ListParagraph"/>
+              <w:numPr>
+                <w:ilvl w:val="0"/>
+                <w:numId w:val="2"/>
+              </w:numPr>
+            </w:pPr>
+            <w:r>
+              <w:rPr>
+                <w:rFonts w:ascii="Arial Narrow" w:cs="Arial Narrow" w:eastAsia="Arial Narrow" w:hAnsi="Arial Narrow"/>
+                <w:sz w:val="22"/>
+                <w:szCs w:val="22"/>
+              </w:rPr>
+              <w:t xml:space="preserve">30 g de vinaigre de cidre</w:t>
+            </w:r>
+          </w:p>
+          <w:p>
+            <w:pPr>
+              <w:pStyle w:val="ListParagraph"/>
+              <w:numPr>
+                <w:ilvl w:val="0"/>
+                <w:numId w:val="2"/>
+              </w:numPr>
+            </w:pPr>
+            <w:r>
+              <w:rPr>
+                <w:rFonts w:ascii="Arial Narrow" w:cs="Arial Narrow" w:eastAsia="Arial Narrow" w:hAnsi="Arial Narrow"/>
+                <w:sz w:val="22"/>
+                <w:szCs w:val="22"/>
+              </w:rPr>
+              <w:t xml:space="preserve">360 g de jus corsé de cochon (voir fiche)</w:t>
+            </w:r>
+          </w:p>
+          <w:p>
+            <w:pPr>
+              <w:pStyle w:val="ListParagraph"/>
+              <w:numPr>
+                <w:ilvl w:val="0"/>
+                <w:numId w:val="2"/>
+              </w:numPr>
+            </w:pPr>
+            <w:r>
+              <w:rPr>
+                <w:rFonts w:ascii="Arial Narrow" w:cs="Arial Narrow" w:eastAsia="Arial Narrow" w:hAnsi="Arial Narrow"/>
+                <w:sz w:val="22"/>
+                <w:szCs w:val="22"/>
+              </w:rPr>
+              <w:t xml:space="preserve">120 g de crème liquide 35 %</w:t>
+            </w:r>
+          </w:p>
+          <w:p>
+            <w:pPr>
+              <w:pStyle w:val="ListParagraph"/>
+              <w:numPr>
+                <w:ilvl w:val="0"/>
+                <w:numId w:val="2"/>
+              </w:numPr>
+            </w:pPr>
+            <w:r>
+              <w:rPr>
+                <w:rFonts w:ascii="Arial Narrow" w:cs="Arial Narrow" w:eastAsia="Arial Narrow" w:hAnsi="Arial Narrow"/>
+                <w:sz w:val="22"/>
+                <w:szCs w:val="22"/>
+              </w:rPr>
+              <w:t xml:space="preserve">40 g de moutarde à l'ancienne</w:t>
+            </w:r>
+          </w:p>
+          <w:p>
+            <w:pPr>
+              <w:pStyle w:val="ListParagraph"/>
+              <w:numPr>
+                <w:ilvl w:val="0"/>
+                <w:numId w:val="2"/>
+              </w:numPr>
+            </w:pPr>
+            <w:r>
+              <w:rPr>
+                <w:rFonts w:ascii="Arial Narrow" w:cs="Arial Narrow" w:eastAsia="Arial Narrow" w:hAnsi="Arial Narrow"/>
+                <w:sz w:val="22"/>
+                <w:szCs w:val="22"/>
+              </w:rPr>
+              <w:t xml:space="preserve">12 g de moutarde de Dijon</w:t>
+            </w:r>
+          </w:p>
+          <w:p>
+            <w:pPr>
+              <w:pStyle w:val="ListParagraph"/>
+              <w:numPr>
+                <w:ilvl w:val="0"/>
+                <w:numId w:val="2"/>
+              </w:numPr>
+            </w:pPr>
+            <w:r>
+              <w:rPr>
+                <w:rFonts w:ascii="Arial Narrow" w:cs="Arial Narrow" w:eastAsia="Arial Narrow" w:hAnsi="Arial Narrow"/>
+                <w:sz w:val="22"/>
+                <w:szCs w:val="22"/>
+              </w:rPr>
+              <w:t xml:space="preserve">50 g de cornichons</w:t>
+            </w:r>
+          </w:p>
+          <w:p>
+            <w:pPr>
+              <w:pStyle w:val="ListParagraph"/>
+              <w:numPr>
+                <w:ilvl w:val="0"/>
+                <w:numId w:val="2"/>
+              </w:numPr>
+            </w:pPr>
+            <w:r>
+              <w:rPr>
+                <w:rFonts w:ascii="Arial Narrow" w:cs="Arial Narrow" w:eastAsia="Arial Narrow" w:hAnsi="Arial Narrow"/>
+                <w:sz w:val="22"/>
+                <w:szCs w:val="22"/>
+              </w:rPr>
+              <w:t xml:space="preserve">20 g de câpres</w:t>
+            </w:r>
+          </w:p>
+          <w:p>
+            <w:pPr>
+              <w:pStyle w:val="ListParagraph"/>
+              <w:numPr>
+                <w:ilvl w:val="0"/>
+                <w:numId w:val="2"/>
+              </w:numPr>
+            </w:pPr>
+            <w:r>
+              <w:rPr>
+                <w:rFonts w:ascii="Arial Narrow" w:cs="Arial Narrow" w:eastAsia="Arial Narrow" w:hAnsi="Arial Narrow"/>
+                <w:sz w:val="22"/>
+                <w:szCs w:val="22"/>
+              </w:rPr>
+              <w:t xml:space="preserve">6 g d'estragon</w:t>
+            </w:r>
+          </w:p>
+          <w:p>
+            <w:pPr>
+              <w:pStyle w:val="ListParagraph"/>
+              <w:numPr>
+                <w:ilvl w:val="0"/>
+                <w:numId w:val="2"/>
+              </w:numPr>
+            </w:pPr>
+            <w:r>
+              <w:rPr>
+                <w:rFonts w:ascii="Arial Narrow" w:cs="Arial Narrow" w:eastAsia="Arial Narrow" w:hAnsi="Arial Narrow"/>
+                <w:sz w:val="22"/>
+                <w:szCs w:val="22"/>
+              </w:rPr>
+              <w:t xml:space="preserve">3 g de poivre mignonnette</w:t>
             </w:r>
           </w:p>
           <w:p>
@@ -14202,7 +14186,7 @@
           <w:sz w:val="22"/>
           <w:szCs w:val="22"/>
         </w:rPr>
-        <w:t xml:space="preserve">(1,2 L)</w:t>
+        <w:t xml:space="preserve">(≈ 50 g par personne)</w:t>
       </w:r>
     </w:p>
     <w:tbl>
@@ -14256,7 +14240,7 @@
                 <w:szCs w:val="22"/>
                 <w:u w:val="single"/>
               </w:rPr>
-              <w:t xml:space="preserve">INGRÉDIENTS :</w:t>
+              <w:t xml:space="preserve">INGRÉDIENTS (10 couverts) :</w:t>
             </w:r>
           </w:p>
         </w:tc>
@@ -14327,279 +14311,279 @@
                 <w:sz w:val="22"/>
                 <w:szCs w:val="22"/>
               </w:rPr>
-              <w:t xml:space="preserve">200 g d'oignons</w:t>
-            </w:r>
-          </w:p>
-          <w:p>
-            <w:pPr>
-              <w:pStyle w:val="ListParagraph"/>
-              <w:numPr>
-                <w:ilvl w:val="0"/>
-                <w:numId w:val="2"/>
-              </w:numPr>
-            </w:pPr>
-            <w:r>
-              <w:rPr>
-                <w:rFonts w:ascii="Arial Narrow" w:cs="Arial Narrow" w:eastAsia="Arial Narrow" w:hAnsi="Arial Narrow"/>
-                <w:sz w:val="22"/>
-                <w:szCs w:val="22"/>
-              </w:rPr>
-              <w:t xml:space="preserve">20 g d'ail</w:t>
-            </w:r>
-          </w:p>
-          <w:p>
-            <w:pPr>
-              <w:pStyle w:val="ListParagraph"/>
-              <w:numPr>
-                <w:ilvl w:val="0"/>
-                <w:numId w:val="2"/>
-              </w:numPr>
-            </w:pPr>
-            <w:r>
-              <w:rPr>
-                <w:rFonts w:ascii="Arial Narrow" w:cs="Arial Narrow" w:eastAsia="Arial Narrow" w:hAnsi="Arial Narrow"/>
-                <w:sz w:val="22"/>
-                <w:szCs w:val="22"/>
-              </w:rPr>
-              <w:t xml:space="preserve">20 g de piments rouges frais</w:t>
-            </w:r>
-          </w:p>
-          <w:p>
-            <w:pPr>
-              <w:pStyle w:val="ListParagraph"/>
-              <w:numPr>
-                <w:ilvl w:val="0"/>
-                <w:numId w:val="2"/>
-              </w:numPr>
-            </w:pPr>
-            <w:r>
-              <w:rPr>
-                <w:rFonts w:ascii="Arial Narrow" w:cs="Arial Narrow" w:eastAsia="Arial Narrow" w:hAnsi="Arial Narrow"/>
-                <w:sz w:val="22"/>
-                <w:szCs w:val="22"/>
-              </w:rPr>
-              <w:t xml:space="preserve">2 piments chipotle</w:t>
-            </w:r>
-          </w:p>
-          <w:p>
-            <w:pPr>
-              <w:pStyle w:val="ListParagraph"/>
-              <w:numPr>
-                <w:ilvl w:val="0"/>
-                <w:numId w:val="2"/>
-              </w:numPr>
-            </w:pPr>
-            <w:r>
-              <w:rPr>
-                <w:rFonts w:ascii="Arial Narrow" w:cs="Arial Narrow" w:eastAsia="Arial Narrow" w:hAnsi="Arial Narrow"/>
-                <w:sz w:val="22"/>
-                <w:szCs w:val="22"/>
-              </w:rPr>
-              <w:t xml:space="preserve">300 g de pommes (Granny Smith)</w:t>
-            </w:r>
-          </w:p>
-          <w:p>
-            <w:pPr>
-              <w:pStyle w:val="ListParagraph"/>
-              <w:numPr>
-                <w:ilvl w:val="0"/>
-                <w:numId w:val="2"/>
-              </w:numPr>
-            </w:pPr>
-            <w:r>
-              <w:rPr>
-                <w:rFonts w:ascii="Arial Narrow" w:cs="Arial Narrow" w:eastAsia="Arial Narrow" w:hAnsi="Arial Narrow"/>
-                <w:sz w:val="22"/>
-                <w:szCs w:val="22"/>
-              </w:rPr>
-              <w:t xml:space="preserve">30 g d'huile neutre</w:t>
-            </w:r>
-          </w:p>
-          <w:p>
-            <w:pPr>
-              <w:pStyle w:val="ListParagraph"/>
-              <w:numPr>
-                <w:ilvl w:val="0"/>
-                <w:numId w:val="2"/>
-              </w:numPr>
-            </w:pPr>
-            <w:r>
-              <w:rPr>
-                <w:rFonts w:ascii="Arial Narrow" w:cs="Arial Narrow" w:eastAsia="Arial Narrow" w:hAnsi="Arial Narrow"/>
-                <w:sz w:val="22"/>
-                <w:szCs w:val="22"/>
-              </w:rPr>
-              <w:t xml:space="preserve">300 g de ketchup</w:t>
-            </w:r>
-          </w:p>
-          <w:p>
-            <w:pPr>
-              <w:pStyle w:val="ListParagraph"/>
-              <w:numPr>
-                <w:ilvl w:val="0"/>
-                <w:numId w:val="2"/>
-              </w:numPr>
-            </w:pPr>
-            <w:r>
-              <w:rPr>
-                <w:rFonts w:ascii="Arial Narrow" w:cs="Arial Narrow" w:eastAsia="Arial Narrow" w:hAnsi="Arial Narrow"/>
-                <w:sz w:val="22"/>
-                <w:szCs w:val="22"/>
-              </w:rPr>
-              <w:t xml:space="preserve">100 g de concentré de tomate</w:t>
-            </w:r>
-          </w:p>
-          <w:p>
-            <w:pPr>
-              <w:pStyle w:val="ListParagraph"/>
-              <w:numPr>
-                <w:ilvl w:val="0"/>
-                <w:numId w:val="2"/>
-              </w:numPr>
-            </w:pPr>
-            <w:r>
-              <w:rPr>
-                <w:rFonts w:ascii="Arial Narrow" w:cs="Arial Narrow" w:eastAsia="Arial Narrow" w:hAnsi="Arial Narrow"/>
-                <w:sz w:val="22"/>
-                <w:szCs w:val="22"/>
-              </w:rPr>
-              <w:t xml:space="preserve">250 g de cidre brut</w:t>
-            </w:r>
-          </w:p>
-          <w:p>
-            <w:pPr>
-              <w:pStyle w:val="ListParagraph"/>
-              <w:numPr>
-                <w:ilvl w:val="0"/>
-                <w:numId w:val="2"/>
-              </w:numPr>
-            </w:pPr>
-            <w:r>
-              <w:rPr>
-                <w:rFonts w:ascii="Arial Narrow" w:cs="Arial Narrow" w:eastAsia="Arial Narrow" w:hAnsi="Arial Narrow"/>
-                <w:sz w:val="22"/>
-                <w:szCs w:val="22"/>
-              </w:rPr>
-              <w:t xml:space="preserve">100 g de vinaigre de cidre</w:t>
-            </w:r>
-          </w:p>
-          <w:p>
-            <w:pPr>
-              <w:pStyle w:val="ListParagraph"/>
-              <w:numPr>
-                <w:ilvl w:val="0"/>
-                <w:numId w:val="2"/>
-              </w:numPr>
-            </w:pPr>
-            <w:r>
-              <w:rPr>
-                <w:rFonts w:ascii="Arial Narrow" w:cs="Arial Narrow" w:eastAsia="Arial Narrow" w:hAnsi="Arial Narrow"/>
-                <w:sz w:val="22"/>
-                <w:szCs w:val="22"/>
-              </w:rPr>
-              <w:t xml:space="preserve">120 g de cassonade</w:t>
-            </w:r>
-          </w:p>
-          <w:p>
-            <w:pPr>
-              <w:pStyle w:val="ListParagraph"/>
-              <w:numPr>
-                <w:ilvl w:val="0"/>
-                <w:numId w:val="2"/>
-              </w:numPr>
-            </w:pPr>
-            <w:r>
-              <w:rPr>
-                <w:rFonts w:ascii="Arial Narrow" w:cs="Arial Narrow" w:eastAsia="Arial Narrow" w:hAnsi="Arial Narrow"/>
-                <w:sz w:val="22"/>
-                <w:szCs w:val="22"/>
-              </w:rPr>
-              <w:t xml:space="preserve">50 g de miel</w:t>
-            </w:r>
-          </w:p>
-          <w:p>
-            <w:pPr>
-              <w:pStyle w:val="ListParagraph"/>
-              <w:numPr>
-                <w:ilvl w:val="0"/>
-                <w:numId w:val="2"/>
-              </w:numPr>
-            </w:pPr>
-            <w:r>
-              <w:rPr>
-                <w:rFonts w:ascii="Arial Narrow" w:cs="Arial Narrow" w:eastAsia="Arial Narrow" w:hAnsi="Arial Narrow"/>
-                <w:sz w:val="22"/>
-                <w:szCs w:val="22"/>
-              </w:rPr>
-              <w:t xml:space="preserve">20 g de moutarde de Dijon</w:t>
-            </w:r>
-          </w:p>
-          <w:p>
-            <w:pPr>
-              <w:pStyle w:val="ListParagraph"/>
-              <w:numPr>
-                <w:ilvl w:val="0"/>
-                <w:numId w:val="2"/>
-              </w:numPr>
-            </w:pPr>
-            <w:r>
-              <w:rPr>
-                <w:rFonts w:ascii="Arial Narrow" w:cs="Arial Narrow" w:eastAsia="Arial Narrow" w:hAnsi="Arial Narrow"/>
-                <w:sz w:val="22"/>
-                <w:szCs w:val="22"/>
-              </w:rPr>
-              <w:t xml:space="preserve">15 g de sauce Worcestershire</w:t>
-            </w:r>
-          </w:p>
-          <w:p>
-            <w:pPr>
-              <w:pStyle w:val="ListParagraph"/>
-              <w:numPr>
-                <w:ilvl w:val="0"/>
-                <w:numId w:val="2"/>
-              </w:numPr>
-            </w:pPr>
-            <w:r>
-              <w:rPr>
-                <w:rFonts w:ascii="Arial Narrow" w:cs="Arial Narrow" w:eastAsia="Arial Narrow" w:hAnsi="Arial Narrow"/>
-                <w:sz w:val="22"/>
-                <w:szCs w:val="22"/>
-              </w:rPr>
-              <w:t xml:space="preserve">10 g de paprika fumé</w:t>
-            </w:r>
-          </w:p>
-          <w:p>
-            <w:pPr>
-              <w:pStyle w:val="ListParagraph"/>
-              <w:numPr>
-                <w:ilvl w:val="0"/>
-                <w:numId w:val="2"/>
-              </w:numPr>
-            </w:pPr>
-            <w:r>
-              <w:rPr>
-                <w:rFonts w:ascii="Arial Narrow" w:cs="Arial Narrow" w:eastAsia="Arial Narrow" w:hAnsi="Arial Narrow"/>
-                <w:sz w:val="22"/>
-                <w:szCs w:val="22"/>
-              </w:rPr>
-              <w:t xml:space="preserve">5 g de piment de Cayenne</w:t>
-            </w:r>
-          </w:p>
-          <w:p>
-            <w:pPr>
-              <w:pStyle w:val="ListParagraph"/>
-              <w:numPr>
-                <w:ilvl w:val="0"/>
-                <w:numId w:val="2"/>
-              </w:numPr>
-            </w:pPr>
-            <w:r>
-              <w:rPr>
-                <w:rFonts w:ascii="Arial Narrow" w:cs="Arial Narrow" w:eastAsia="Arial Narrow" w:hAnsi="Arial Narrow"/>
-                <w:sz w:val="22"/>
-                <w:szCs w:val="22"/>
-              </w:rPr>
-              <w:t xml:space="preserve">10 g de sel fin</w:t>
+              <w:t xml:space="preserve">80 g d'oignons</w:t>
+            </w:r>
+          </w:p>
+          <w:p>
+            <w:pPr>
+              <w:pStyle w:val="ListParagraph"/>
+              <w:numPr>
+                <w:ilvl w:val="0"/>
+                <w:numId w:val="2"/>
+              </w:numPr>
+            </w:pPr>
+            <w:r>
+              <w:rPr>
+                <w:rFonts w:ascii="Arial Narrow" w:cs="Arial Narrow" w:eastAsia="Arial Narrow" w:hAnsi="Arial Narrow"/>
+                <w:sz w:val="22"/>
+                <w:szCs w:val="22"/>
+              </w:rPr>
+              <w:t xml:space="preserve">8 g d'ail</w:t>
+            </w:r>
+          </w:p>
+          <w:p>
+            <w:pPr>
+              <w:pStyle w:val="ListParagraph"/>
+              <w:numPr>
+                <w:ilvl w:val="0"/>
+                <w:numId w:val="2"/>
+              </w:numPr>
+            </w:pPr>
+            <w:r>
+              <w:rPr>
+                <w:rFonts w:ascii="Arial Narrow" w:cs="Arial Narrow" w:eastAsia="Arial Narrow" w:hAnsi="Arial Narrow"/>
+                <w:sz w:val="22"/>
+                <w:szCs w:val="22"/>
+              </w:rPr>
+              <w:t xml:space="preserve">8 g de piments rouges frais</w:t>
+            </w:r>
+          </w:p>
+          <w:p>
+            <w:pPr>
+              <w:pStyle w:val="ListParagraph"/>
+              <w:numPr>
+                <w:ilvl w:val="0"/>
+                <w:numId w:val="2"/>
+              </w:numPr>
+            </w:pPr>
+            <w:r>
+              <w:rPr>
+                <w:rFonts w:ascii="Arial Narrow" w:cs="Arial Narrow" w:eastAsia="Arial Narrow" w:hAnsi="Arial Narrow"/>
+                <w:sz w:val="22"/>
+                <w:szCs w:val="22"/>
+              </w:rPr>
+              <w:t xml:space="preserve">1 piment chipotle</w:t>
+            </w:r>
+          </w:p>
+          <w:p>
+            <w:pPr>
+              <w:pStyle w:val="ListParagraph"/>
+              <w:numPr>
+                <w:ilvl w:val="0"/>
+                <w:numId w:val="2"/>
+              </w:numPr>
+            </w:pPr>
+            <w:r>
+              <w:rPr>
+                <w:rFonts w:ascii="Arial Narrow" w:cs="Arial Narrow" w:eastAsia="Arial Narrow" w:hAnsi="Arial Narrow"/>
+                <w:sz w:val="22"/>
+                <w:szCs w:val="22"/>
+              </w:rPr>
+              <w:t xml:space="preserve">120 g de pommes (Granny Smith)</w:t>
+            </w:r>
+          </w:p>
+          <w:p>
+            <w:pPr>
+              <w:pStyle w:val="ListParagraph"/>
+              <w:numPr>
+                <w:ilvl w:val="0"/>
+                <w:numId w:val="2"/>
+              </w:numPr>
+            </w:pPr>
+            <w:r>
+              <w:rPr>
+                <w:rFonts w:ascii="Arial Narrow" w:cs="Arial Narrow" w:eastAsia="Arial Narrow" w:hAnsi="Arial Narrow"/>
+                <w:sz w:val="22"/>
+                <w:szCs w:val="22"/>
+              </w:rPr>
+              <w:t xml:space="preserve">15 g d'huile neutre</w:t>
+            </w:r>
+          </w:p>
+          <w:p>
+            <w:pPr>
+              <w:pStyle w:val="ListParagraph"/>
+              <w:numPr>
+                <w:ilvl w:val="0"/>
+                <w:numId w:val="2"/>
+              </w:numPr>
+            </w:pPr>
+            <w:r>
+              <w:rPr>
+                <w:rFonts w:ascii="Arial Narrow" w:cs="Arial Narrow" w:eastAsia="Arial Narrow" w:hAnsi="Arial Narrow"/>
+                <w:sz w:val="22"/>
+                <w:szCs w:val="22"/>
+              </w:rPr>
+              <w:t xml:space="preserve">120 g de ketchup</w:t>
+            </w:r>
+          </w:p>
+          <w:p>
+            <w:pPr>
+              <w:pStyle w:val="ListParagraph"/>
+              <w:numPr>
+                <w:ilvl w:val="0"/>
+                <w:numId w:val="2"/>
+              </w:numPr>
+            </w:pPr>
+            <w:r>
+              <w:rPr>
+                <w:rFonts w:ascii="Arial Narrow" w:cs="Arial Narrow" w:eastAsia="Arial Narrow" w:hAnsi="Arial Narrow"/>
+                <w:sz w:val="22"/>
+                <w:szCs w:val="22"/>
+              </w:rPr>
+              <w:t xml:space="preserve">40 g de concentré de tomate</w:t>
+            </w:r>
+          </w:p>
+          <w:p>
+            <w:pPr>
+              <w:pStyle w:val="ListParagraph"/>
+              <w:numPr>
+                <w:ilvl w:val="0"/>
+                <w:numId w:val="2"/>
+              </w:numPr>
+            </w:pPr>
+            <w:r>
+              <w:rPr>
+                <w:rFonts w:ascii="Arial Narrow" w:cs="Arial Narrow" w:eastAsia="Arial Narrow" w:hAnsi="Arial Narrow"/>
+                <w:sz w:val="22"/>
+                <w:szCs w:val="22"/>
+              </w:rPr>
+              <w:t xml:space="preserve">100 g de cidre brut</w:t>
+            </w:r>
+          </w:p>
+          <w:p>
+            <w:pPr>
+              <w:pStyle w:val="ListParagraph"/>
+              <w:numPr>
+                <w:ilvl w:val="0"/>
+                <w:numId w:val="2"/>
+              </w:numPr>
+            </w:pPr>
+            <w:r>
+              <w:rPr>
+                <w:rFonts w:ascii="Arial Narrow" w:cs="Arial Narrow" w:eastAsia="Arial Narrow" w:hAnsi="Arial Narrow"/>
+                <w:sz w:val="22"/>
+                <w:szCs w:val="22"/>
+              </w:rPr>
+              <w:t xml:space="preserve">40 g de vinaigre de cidre</w:t>
+            </w:r>
+          </w:p>
+          <w:p>
+            <w:pPr>
+              <w:pStyle w:val="ListParagraph"/>
+              <w:numPr>
+                <w:ilvl w:val="0"/>
+                <w:numId w:val="2"/>
+              </w:numPr>
+            </w:pPr>
+            <w:r>
+              <w:rPr>
+                <w:rFonts w:ascii="Arial Narrow" w:cs="Arial Narrow" w:eastAsia="Arial Narrow" w:hAnsi="Arial Narrow"/>
+                <w:sz w:val="22"/>
+                <w:szCs w:val="22"/>
+              </w:rPr>
+              <w:t xml:space="preserve">50 g de cassonade</w:t>
+            </w:r>
+          </w:p>
+          <w:p>
+            <w:pPr>
+              <w:pStyle w:val="ListParagraph"/>
+              <w:numPr>
+                <w:ilvl w:val="0"/>
+                <w:numId w:val="2"/>
+              </w:numPr>
+            </w:pPr>
+            <w:r>
+              <w:rPr>
+                <w:rFonts w:ascii="Arial Narrow" w:cs="Arial Narrow" w:eastAsia="Arial Narrow" w:hAnsi="Arial Narrow"/>
+                <w:sz w:val="22"/>
+                <w:szCs w:val="22"/>
+              </w:rPr>
+              <w:t xml:space="preserve">20 g de miel</w:t>
+            </w:r>
+          </w:p>
+          <w:p>
+            <w:pPr>
+              <w:pStyle w:val="ListParagraph"/>
+              <w:numPr>
+                <w:ilvl w:val="0"/>
+                <w:numId w:val="2"/>
+              </w:numPr>
+            </w:pPr>
+            <w:r>
+              <w:rPr>
+                <w:rFonts w:ascii="Arial Narrow" w:cs="Arial Narrow" w:eastAsia="Arial Narrow" w:hAnsi="Arial Narrow"/>
+                <w:sz w:val="22"/>
+                <w:szCs w:val="22"/>
+              </w:rPr>
+              <w:t xml:space="preserve">8 g de moutarde de Dijon</w:t>
+            </w:r>
+          </w:p>
+          <w:p>
+            <w:pPr>
+              <w:pStyle w:val="ListParagraph"/>
+              <w:numPr>
+                <w:ilvl w:val="0"/>
+                <w:numId w:val="2"/>
+              </w:numPr>
+            </w:pPr>
+            <w:r>
+              <w:rPr>
+                <w:rFonts w:ascii="Arial Narrow" w:cs="Arial Narrow" w:eastAsia="Arial Narrow" w:hAnsi="Arial Narrow"/>
+                <w:sz w:val="22"/>
+                <w:szCs w:val="22"/>
+              </w:rPr>
+              <w:t xml:space="preserve">6 g de sauce Worcestershire</w:t>
+            </w:r>
+          </w:p>
+          <w:p>
+            <w:pPr>
+              <w:pStyle w:val="ListParagraph"/>
+              <w:numPr>
+                <w:ilvl w:val="0"/>
+                <w:numId w:val="2"/>
+              </w:numPr>
+            </w:pPr>
+            <w:r>
+              <w:rPr>
+                <w:rFonts w:ascii="Arial Narrow" w:cs="Arial Narrow" w:eastAsia="Arial Narrow" w:hAnsi="Arial Narrow"/>
+                <w:sz w:val="22"/>
+                <w:szCs w:val="22"/>
+              </w:rPr>
+              <w:t xml:space="preserve">4 g de paprika fumé</w:t>
+            </w:r>
+          </w:p>
+          <w:p>
+            <w:pPr>
+              <w:pStyle w:val="ListParagraph"/>
+              <w:numPr>
+                <w:ilvl w:val="0"/>
+                <w:numId w:val="2"/>
+              </w:numPr>
+            </w:pPr>
+            <w:r>
+              <w:rPr>
+                <w:rFonts w:ascii="Arial Narrow" w:cs="Arial Narrow" w:eastAsia="Arial Narrow" w:hAnsi="Arial Narrow"/>
+                <w:sz w:val="22"/>
+                <w:szCs w:val="22"/>
+              </w:rPr>
+              <w:t xml:space="preserve">2 g de piment de Cayenne</w:t>
+            </w:r>
+          </w:p>
+          <w:p>
+            <w:pPr>
+              <w:pStyle w:val="ListParagraph"/>
+              <w:numPr>
+                <w:ilvl w:val="0"/>
+                <w:numId w:val="2"/>
+              </w:numPr>
+            </w:pPr>
+            <w:r>
+              <w:rPr>
+                <w:rFonts w:ascii="Arial Narrow" w:cs="Arial Narrow" w:eastAsia="Arial Narrow" w:hAnsi="Arial Narrow"/>
+                <w:sz w:val="22"/>
+                <w:szCs w:val="22"/>
+              </w:rPr>
+              <w:t xml:space="preserve">4 g de sel fin</w:t>
             </w:r>
           </w:p>
         </w:tc>
@@ -14673,7 +14657,7 @@
                 <w:sz w:val="22"/>
                 <w:szCs w:val="22"/>
               </w:rPr>
-              <w:t xml:space="preserve">Ajouter tous les autres ingrédients et cuire 45 minutes à feu doux en remuant régulièrement.</w:t>
+              <w:t xml:space="preserve">Ajouter tous les autres ingrédients et cuire 30 minutes à feu doux en remuant régulièrement.</w:t>
             </w:r>
           </w:p>
           <w:p>
@@ -14748,7 +14732,7 @@
           <w:sz w:val="22"/>
           <w:szCs w:val="22"/>
         </w:rPr>
-        <w:t xml:space="preserve">(1,5 L)</w:t>
+        <w:t xml:space="preserve">(≈ 60 g par personne)</w:t>
       </w:r>
     </w:p>
     <w:tbl>
@@ -14802,7 +14786,7 @@
                 <w:szCs w:val="22"/>
                 <w:u w:val="single"/>
               </w:rPr>
-              <w:t xml:space="preserve">INGRÉDIENTS :</w:t>
+              <w:t xml:space="preserve">INGRÉDIENTS (10 couverts) :</w:t>
             </w:r>
           </w:p>
         </w:tc>
@@ -14873,160 +14857,160 @@
                 <w:sz w:val="22"/>
                 <w:szCs w:val="22"/>
               </w:rPr>
-              <w:t xml:space="preserve">3 kg d'os et parures de cochon (travers, queues, 1 pied)</w:t>
-            </w:r>
-          </w:p>
-          <w:p>
-            <w:pPr>
-              <w:pStyle w:val="ListParagraph"/>
-              <w:numPr>
-                <w:ilvl w:val="0"/>
-                <w:numId w:val="2"/>
-              </w:numPr>
-            </w:pPr>
-            <w:r>
-              <w:rPr>
-                <w:rFonts w:ascii="Arial Narrow" w:cs="Arial Narrow" w:eastAsia="Arial Narrow" w:hAnsi="Arial Narrow"/>
-                <w:sz w:val="22"/>
-                <w:szCs w:val="22"/>
-              </w:rPr>
-              <w:t xml:space="preserve">2 oignons</w:t>
-            </w:r>
-          </w:p>
-          <w:p>
-            <w:pPr>
-              <w:pStyle w:val="ListParagraph"/>
-              <w:numPr>
-                <w:ilvl w:val="0"/>
-                <w:numId w:val="2"/>
-              </w:numPr>
-            </w:pPr>
-            <w:r>
-              <w:rPr>
-                <w:rFonts w:ascii="Arial Narrow" w:cs="Arial Narrow" w:eastAsia="Arial Narrow" w:hAnsi="Arial Narrow"/>
-                <w:sz w:val="22"/>
-                <w:szCs w:val="22"/>
-              </w:rPr>
-              <w:t xml:space="preserve">2 carottes</w:t>
-            </w:r>
-          </w:p>
-          <w:p>
-            <w:pPr>
-              <w:pStyle w:val="ListParagraph"/>
-              <w:numPr>
-                <w:ilvl w:val="0"/>
-                <w:numId w:val="2"/>
-              </w:numPr>
-            </w:pPr>
-            <w:r>
-              <w:rPr>
-                <w:rFonts w:ascii="Arial Narrow" w:cs="Arial Narrow" w:eastAsia="Arial Narrow" w:hAnsi="Arial Narrow"/>
-                <w:sz w:val="22"/>
-                <w:szCs w:val="22"/>
-              </w:rPr>
-              <w:t xml:space="preserve">3 échalotes</w:t>
-            </w:r>
-          </w:p>
-          <w:p>
-            <w:pPr>
-              <w:pStyle w:val="ListParagraph"/>
-              <w:numPr>
-                <w:ilvl w:val="0"/>
-                <w:numId w:val="2"/>
-              </w:numPr>
-            </w:pPr>
-            <w:r>
-              <w:rPr>
-                <w:rFonts w:ascii="Arial Narrow" w:cs="Arial Narrow" w:eastAsia="Arial Narrow" w:hAnsi="Arial Narrow"/>
-                <w:sz w:val="22"/>
-                <w:szCs w:val="22"/>
-              </w:rPr>
-              <w:t xml:space="preserve">1 tête d'ail</w:t>
-            </w:r>
-          </w:p>
-          <w:p>
-            <w:pPr>
-              <w:pStyle w:val="ListParagraph"/>
-              <w:numPr>
-                <w:ilvl w:val="0"/>
-                <w:numId w:val="2"/>
-              </w:numPr>
-            </w:pPr>
-            <w:r>
-              <w:rPr>
-                <w:rFonts w:ascii="Arial Narrow" w:cs="Arial Narrow" w:eastAsia="Arial Narrow" w:hAnsi="Arial Narrow"/>
-                <w:sz w:val="22"/>
-                <w:szCs w:val="22"/>
-              </w:rPr>
-              <w:t xml:space="preserve">50 g de concentré de tomate</w:t>
-            </w:r>
-          </w:p>
-          <w:p>
-            <w:pPr>
-              <w:pStyle w:val="ListParagraph"/>
-              <w:numPr>
-                <w:ilvl w:val="0"/>
-                <w:numId w:val="2"/>
-              </w:numPr>
-            </w:pPr>
-            <w:r>
-              <w:rPr>
-                <w:rFonts w:ascii="Arial Narrow" w:cs="Arial Narrow" w:eastAsia="Arial Narrow" w:hAnsi="Arial Narrow"/>
-                <w:sz w:val="22"/>
-                <w:szCs w:val="22"/>
-              </w:rPr>
-              <w:t xml:space="preserve">300 g de vin blanc sec</w:t>
-            </w:r>
-          </w:p>
-          <w:p>
-            <w:pPr>
-              <w:pStyle w:val="ListParagraph"/>
-              <w:numPr>
-                <w:ilvl w:val="0"/>
-                <w:numId w:val="2"/>
-              </w:numPr>
-            </w:pPr>
-            <w:r>
-              <w:rPr>
-                <w:rFonts w:ascii="Arial Narrow" w:cs="Arial Narrow" w:eastAsia="Arial Narrow" w:hAnsi="Arial Narrow"/>
-                <w:sz w:val="22"/>
-                <w:szCs w:val="22"/>
-              </w:rPr>
-              <w:t xml:space="preserve">5 L d'eau ou de fond blanc</w:t>
-            </w:r>
-          </w:p>
-          <w:p>
-            <w:pPr>
-              <w:pStyle w:val="ListParagraph"/>
-              <w:numPr>
-                <w:ilvl w:val="0"/>
-                <w:numId w:val="2"/>
-              </w:numPr>
-            </w:pPr>
-            <w:r>
-              <w:rPr>
-                <w:rFonts w:ascii="Arial Narrow" w:cs="Arial Narrow" w:eastAsia="Arial Narrow" w:hAnsi="Arial Narrow"/>
-                <w:sz w:val="22"/>
-                <w:szCs w:val="22"/>
-              </w:rPr>
-              <w:t xml:space="preserve">1 bouquet garni</w:t>
-            </w:r>
-          </w:p>
-          <w:p>
-            <w:pPr>
-              <w:pStyle w:val="ListParagraph"/>
-              <w:numPr>
-                <w:ilvl w:val="0"/>
-                <w:numId w:val="2"/>
-              </w:numPr>
-            </w:pPr>
-            <w:r>
-              <w:rPr>
-                <w:rFonts w:ascii="Arial Narrow" w:cs="Arial Narrow" w:eastAsia="Arial Narrow" w:hAnsi="Arial Narrow"/>
-                <w:sz w:val="22"/>
-                <w:szCs w:val="22"/>
-              </w:rPr>
-              <w:t xml:space="preserve">5 g de poivre en grains</w:t>
+              <w:t xml:space="preserve">1,2 kg d'os et parures de cochon (travers, queues, ½ pied)</w:t>
+            </w:r>
+          </w:p>
+          <w:p>
+            <w:pPr>
+              <w:pStyle w:val="ListParagraph"/>
+              <w:numPr>
+                <w:ilvl w:val="0"/>
+                <w:numId w:val="2"/>
+              </w:numPr>
+            </w:pPr>
+            <w:r>
+              <w:rPr>
+                <w:rFonts w:ascii="Arial Narrow" w:cs="Arial Narrow" w:eastAsia="Arial Narrow" w:hAnsi="Arial Narrow"/>
+                <w:sz w:val="22"/>
+                <w:szCs w:val="22"/>
+              </w:rPr>
+              <w:t xml:space="preserve">1 oignon</w:t>
+            </w:r>
+          </w:p>
+          <w:p>
+            <w:pPr>
+              <w:pStyle w:val="ListParagraph"/>
+              <w:numPr>
+                <w:ilvl w:val="0"/>
+                <w:numId w:val="2"/>
+              </w:numPr>
+            </w:pPr>
+            <w:r>
+              <w:rPr>
+                <w:rFonts w:ascii="Arial Narrow" w:cs="Arial Narrow" w:eastAsia="Arial Narrow" w:hAnsi="Arial Narrow"/>
+                <w:sz w:val="22"/>
+                <w:szCs w:val="22"/>
+              </w:rPr>
+              <w:t xml:space="preserve">1 carotte</w:t>
+            </w:r>
+          </w:p>
+          <w:p>
+            <w:pPr>
+              <w:pStyle w:val="ListParagraph"/>
+              <w:numPr>
+                <w:ilvl w:val="0"/>
+                <w:numId w:val="2"/>
+              </w:numPr>
+            </w:pPr>
+            <w:r>
+              <w:rPr>
+                <w:rFonts w:ascii="Arial Narrow" w:cs="Arial Narrow" w:eastAsia="Arial Narrow" w:hAnsi="Arial Narrow"/>
+                <w:sz w:val="22"/>
+                <w:szCs w:val="22"/>
+              </w:rPr>
+              <w:t xml:space="preserve">1 échalote</w:t>
+            </w:r>
+          </w:p>
+          <w:p>
+            <w:pPr>
+              <w:pStyle w:val="ListParagraph"/>
+              <w:numPr>
+                <w:ilvl w:val="0"/>
+                <w:numId w:val="2"/>
+              </w:numPr>
+            </w:pPr>
+            <w:r>
+              <w:rPr>
+                <w:rFonts w:ascii="Arial Narrow" w:cs="Arial Narrow" w:eastAsia="Arial Narrow" w:hAnsi="Arial Narrow"/>
+                <w:sz w:val="22"/>
+                <w:szCs w:val="22"/>
+              </w:rPr>
+              <w:t xml:space="preserve">½ tête d'ail</w:t>
+            </w:r>
+          </w:p>
+          <w:p>
+            <w:pPr>
+              <w:pStyle w:val="ListParagraph"/>
+              <w:numPr>
+                <w:ilvl w:val="0"/>
+                <w:numId w:val="2"/>
+              </w:numPr>
+            </w:pPr>
+            <w:r>
+              <w:rPr>
+                <w:rFonts w:ascii="Arial Narrow" w:cs="Arial Narrow" w:eastAsia="Arial Narrow" w:hAnsi="Arial Narrow"/>
+                <w:sz w:val="22"/>
+                <w:szCs w:val="22"/>
+              </w:rPr>
+              <w:t xml:space="preserve">20 g de concentré de tomate</w:t>
+            </w:r>
+          </w:p>
+          <w:p>
+            <w:pPr>
+              <w:pStyle w:val="ListParagraph"/>
+              <w:numPr>
+                <w:ilvl w:val="0"/>
+                <w:numId w:val="2"/>
+              </w:numPr>
+            </w:pPr>
+            <w:r>
+              <w:rPr>
+                <w:rFonts w:ascii="Arial Narrow" w:cs="Arial Narrow" w:eastAsia="Arial Narrow" w:hAnsi="Arial Narrow"/>
+                <w:sz w:val="22"/>
+                <w:szCs w:val="22"/>
+              </w:rPr>
+              <w:t xml:space="preserve">120 g de vin blanc sec</w:t>
+            </w:r>
+          </w:p>
+          <w:p>
+            <w:pPr>
+              <w:pStyle w:val="ListParagraph"/>
+              <w:numPr>
+                <w:ilvl w:val="0"/>
+                <w:numId w:val="2"/>
+              </w:numPr>
+            </w:pPr>
+            <w:r>
+              <w:rPr>
+                <w:rFonts w:ascii="Arial Narrow" w:cs="Arial Narrow" w:eastAsia="Arial Narrow" w:hAnsi="Arial Narrow"/>
+                <w:sz w:val="22"/>
+                <w:szCs w:val="22"/>
+              </w:rPr>
+              <w:t xml:space="preserve">2 L d'eau ou de fond blanc</w:t>
+            </w:r>
+          </w:p>
+          <w:p>
+            <w:pPr>
+              <w:pStyle w:val="ListParagraph"/>
+              <w:numPr>
+                <w:ilvl w:val="0"/>
+                <w:numId w:val="2"/>
+              </w:numPr>
+            </w:pPr>
+            <w:r>
+              <w:rPr>
+                <w:rFonts w:ascii="Arial Narrow" w:cs="Arial Narrow" w:eastAsia="Arial Narrow" w:hAnsi="Arial Narrow"/>
+                <w:sz w:val="22"/>
+                <w:szCs w:val="22"/>
+              </w:rPr>
+              <w:t xml:space="preserve">1 petit bouquet garni</w:t>
+            </w:r>
+          </w:p>
+          <w:p>
+            <w:pPr>
+              <w:pStyle w:val="ListParagraph"/>
+              <w:numPr>
+                <w:ilvl w:val="0"/>
+                <w:numId w:val="2"/>
+              </w:numPr>
+            </w:pPr>
+            <w:r>
+              <w:rPr>
+                <w:rFonts w:ascii="Arial Narrow" w:cs="Arial Narrow" w:eastAsia="Arial Narrow" w:hAnsi="Arial Narrow"/>
+                <w:sz w:val="22"/>
+                <w:szCs w:val="22"/>
+              </w:rPr>
+              <w:t xml:space="preserve">2 g de poivre en grains</w:t>
             </w:r>
           </w:p>
         </w:tc>
@@ -15138,7 +15122,7 @@
                 <w:sz w:val="22"/>
                 <w:szCs w:val="22"/>
               </w:rPr>
-              <w:t xml:space="preserve">Ajouter le bouquet garni et le poivre, cuire 4 heures à frémissement en écumant régulièrement.</w:t>
+              <w:t xml:space="preserve">Ajouter le bouquet garni et le poivre, cuire 3 heures à frémissement en écumant régulièrement.</w:t>
             </w:r>
           </w:p>
           <w:p>
@@ -19571,7 +19555,7 @@
           <w:sz w:val="22"/>
           <w:szCs w:val="22"/>
         </w:rPr>
-        <w:t xml:space="preserve">(10 couverts – service en salle)</w:t>
+        <w:t xml:space="preserve">(service en salle)</w:t>
       </w:r>
     </w:p>
     <w:tbl>
@@ -19625,7 +19609,7 @@
                 <w:szCs w:val="22"/>
                 <w:u w:val="single"/>
               </w:rPr>
-              <w:t xml:space="preserve">INGRÉDIENTS :</w:t>
+              <w:t xml:space="preserve">INGRÉDIENTS (10 couverts) :</w:t>
             </w:r>
           </w:p>
         </w:tc>
@@ -22080,7 +22064,7 @@
           <w:sz w:val="22"/>
           <w:szCs w:val="22"/>
         </w:rPr>
-        <w:t xml:space="preserve">(10 couverts – uniquement le mercredi)</w:t>
+        <w:t xml:space="preserve">(uniquement le mercredi)</w:t>
       </w:r>
     </w:p>
     <w:tbl>
@@ -22134,7 +22118,7 @@
                 <w:szCs w:val="22"/>
                 <w:u w:val="single"/>
               </w:rPr>
-              <w:t xml:space="preserve">INGRÉDIENTS :</w:t>
+              <w:t xml:space="preserve">INGRÉDIENTS (10 couverts) :</w:t>
             </w:r>
           </w:p>
         </w:tc>
@@ -23760,7 +23744,7 @@
           <w:sz w:val="22"/>
           <w:szCs w:val="22"/>
         </w:rPr>
-        <w:t xml:space="preserve">(10 couverts – 8 raviolis par personne)</w:t>
+        <w:t xml:space="preserve">(8 raviolis par personne)</w:t>
       </w:r>
     </w:p>
     <w:tbl>
@@ -23814,7 +23798,7 @@
                 <w:szCs w:val="22"/>
                 <w:u w:val="single"/>
               </w:rPr>
-              <w:t xml:space="preserve">INGRÉDIENTS :</w:t>
+              <w:t xml:space="preserve">INGRÉDIENTS (10 couverts) :</w:t>
             </w:r>
           </w:p>
         </w:tc>
@@ -25798,7 +25782,7 @@
                 <w:sz w:val="22"/>
                 <w:szCs w:val="22"/>
               </w:rPr>
-              <w:t xml:space="preserve">Remplir des moules beurrés et cacaotés à 80 g, réserver 1 heure au froid.</w:t>
+              <w:t xml:space="preserve">Remplir des moules beurrés et cacaotés à 75 g (10 pièces), réserver 1 heure au froid.</w:t>
             </w:r>
           </w:p>
           <w:p>
@@ -26683,7 +26667,7 @@
           <w:sz w:val="22"/>
           <w:szCs w:val="22"/>
         </w:rPr>
-        <w:t xml:space="preserve">(20 financiers – 10 couverts)</w:t>
+        <w:t xml:space="preserve">(2 financiers par personne)</w:t>
       </w:r>
     </w:p>
     <w:tbl>
@@ -26737,7 +26721,7 @@
                 <w:szCs w:val="22"/>
                 <w:u w:val="single"/>
               </w:rPr>
-              <w:t xml:space="preserve">INGRÉDIENTS :</w:t>
+              <w:t xml:space="preserve">INGRÉDIENTS (10 couverts) :</w:t>
             </w:r>
           </w:p>
         </w:tc>

</xml_diff>

<commit_message>
Fiches techniques : logos placés dans chaque page du Word
Co-Authored-By: Claude Opus 5.5 <noreply@anthropic.com>
Claude-Session: https://claude.ai/code/session_01K8nkiVikF4Cso8sB8v1a6m
</commit_message>
<xml_diff>
--- a/fiches_techniques/FICHES_TECHNIQUES_CLUB_COCHON.docx
+++ b/fiches_techniques/FICHES_TECHNIQUES_CLUB_COCHON.docx
@@ -159,6 +159,102 @@
         <w:jc w:val="center"/>
       </w:pPr>
       <w:r>
+        <w:drawing>
+          <wp:anchor distT="0" distB="0" distL="0" distR="0" simplePos="0" allowOverlap="1" behindDoc="0" locked="0" layoutInCell="1" relativeHeight="762000">
+            <wp:simplePos x="0" y="0"/>
+            <wp:positionH relativeFrom="page">
+              <wp:posOffset>493200</wp:posOffset>
+            </wp:positionH>
+            <wp:positionV relativeFrom="page">
+              <wp:posOffset>6444000</wp:posOffset>
+            </wp:positionV>
+            <wp:extent cx="762000" cy="762000"/>
+            <wp:effectExtent t="0" r="0" b="0" l="0"/>
+            <wp:wrapNone/>
+            <wp:docPr id="1" name="" descr="" title=""/>
+            <wp:cNvGraphicFramePr>
+              <a:graphicFrameLocks xmlns:a="http://schemas.openxmlformats.org/drawingml/2006/main" noChangeAspect="1"/>
+            </wp:cNvGraphicFramePr>
+            <a:graphic xmlns:a="http://schemas.openxmlformats.org/drawingml/2006/main">
+              <a:graphicData uri="http://schemas.openxmlformats.org/drawingml/2006/picture">
+                <pic:pic xmlns:pic="http://schemas.openxmlformats.org/drawingml/2006/picture">
+                  <pic:nvPicPr>
+                    <pic:cNvPr id="0" name="" descr=""/>
+                    <pic:cNvPicPr>
+                      <a:picLocks noChangeAspect="1" noChangeArrowheads="1"/>
+                    </pic:cNvPicPr>
+                  </pic:nvPicPr>
+                  <pic:blipFill>
+                    <a:blip r:embed="rId9" cstate="none"/>
+                    <a:srcRect/>
+                    <a:stretch>
+                      <a:fillRect/>
+                    </a:stretch>
+                  </pic:blipFill>
+                  <pic:spPr bwMode="auto">
+                    <a:xfrm>
+                      <a:off x="0" y="0"/>
+                      <a:ext cx="762000" cy="762000"/>
+                    </a:xfrm>
+                    <a:prstGeom prst="rect">
+                      <a:avLst/>
+                    </a:prstGeom>
+                  </pic:spPr>
+                </pic:pic>
+              </a:graphicData>
+            </a:graphic>
+          </wp:anchor>
+        </w:drawing>
+      </w:r>
+      <w:r>
+        <w:drawing>
+          <wp:anchor distT="0" distB="0" distL="0" distR="0" simplePos="0" allowOverlap="1" behindDoc="0" locked="0" layoutInCell="1" relativeHeight="723900">
+            <wp:simplePos x="0" y="0"/>
+            <wp:positionH relativeFrom="page">
+              <wp:posOffset>9216000</wp:posOffset>
+            </wp:positionH>
+            <wp:positionV relativeFrom="page">
+              <wp:posOffset>6480000</wp:posOffset>
+            </wp:positionV>
+            <wp:extent cx="723900" cy="723900"/>
+            <wp:effectExtent t="0" r="0" b="0" l="0"/>
+            <wp:wrapNone/>
+            <wp:docPr id="1" name="" descr="" title=""/>
+            <wp:cNvGraphicFramePr>
+              <a:graphicFrameLocks xmlns:a="http://schemas.openxmlformats.org/drawingml/2006/main" noChangeAspect="1"/>
+            </wp:cNvGraphicFramePr>
+            <a:graphic xmlns:a="http://schemas.openxmlformats.org/drawingml/2006/main">
+              <a:graphicData uri="http://schemas.openxmlformats.org/drawingml/2006/picture">
+                <pic:pic xmlns:pic="http://schemas.openxmlformats.org/drawingml/2006/picture">
+                  <pic:nvPicPr>
+                    <pic:cNvPr id="0" name="" descr=""/>
+                    <pic:cNvPicPr>
+                      <a:picLocks noChangeAspect="1" noChangeArrowheads="1"/>
+                    </pic:cNvPicPr>
+                  </pic:nvPicPr>
+                  <pic:blipFill>
+                    <a:blip r:embed="rId10" cstate="none"/>
+                    <a:srcRect/>
+                    <a:stretch>
+                      <a:fillRect/>
+                    </a:stretch>
+                  </pic:blipFill>
+                  <pic:spPr bwMode="auto">
+                    <a:xfrm>
+                      <a:off x="0" y="0"/>
+                      <a:ext cx="723900" cy="723900"/>
+                    </a:xfrm>
+                    <a:prstGeom prst="rect">
+                      <a:avLst/>
+                    </a:prstGeom>
+                  </pic:spPr>
+                </pic:pic>
+              </a:graphicData>
+            </a:graphic>
+          </wp:anchor>
+        </w:drawing>
+      </w:r>
+      <w:r>
         <w:rPr>
           <w:rFonts w:ascii="Arial Narrow" w:cs="Arial Narrow" w:eastAsia="Arial Narrow" w:hAnsi="Arial Narrow"/>
           <w:b/>
@@ -928,6 +1024,102 @@
         <w:jc w:val="center"/>
       </w:pPr>
       <w:r>
+        <w:drawing>
+          <wp:anchor distT="0" distB="0" distL="0" distR="0" simplePos="0" allowOverlap="1" behindDoc="0" locked="0" layoutInCell="1" relativeHeight="762000">
+            <wp:simplePos x="0" y="0"/>
+            <wp:positionH relativeFrom="page">
+              <wp:posOffset>493200</wp:posOffset>
+            </wp:positionH>
+            <wp:positionV relativeFrom="page">
+              <wp:posOffset>6444000</wp:posOffset>
+            </wp:positionV>
+            <wp:extent cx="762000" cy="762000"/>
+            <wp:effectExtent t="0" r="0" b="0" l="0"/>
+            <wp:wrapNone/>
+            <wp:docPr id="1" name="" descr="" title=""/>
+            <wp:cNvGraphicFramePr>
+              <a:graphicFrameLocks xmlns:a="http://schemas.openxmlformats.org/drawingml/2006/main" noChangeAspect="1"/>
+            </wp:cNvGraphicFramePr>
+            <a:graphic xmlns:a="http://schemas.openxmlformats.org/drawingml/2006/main">
+              <a:graphicData uri="http://schemas.openxmlformats.org/drawingml/2006/picture">
+                <pic:pic xmlns:pic="http://schemas.openxmlformats.org/drawingml/2006/picture">
+                  <pic:nvPicPr>
+                    <pic:cNvPr id="0" name="" descr=""/>
+                    <pic:cNvPicPr>
+                      <a:picLocks noChangeAspect="1" noChangeArrowheads="1"/>
+                    </pic:cNvPicPr>
+                  </pic:nvPicPr>
+                  <pic:blipFill>
+                    <a:blip r:embed="rId9" cstate="none"/>
+                    <a:srcRect/>
+                    <a:stretch>
+                      <a:fillRect/>
+                    </a:stretch>
+                  </pic:blipFill>
+                  <pic:spPr bwMode="auto">
+                    <a:xfrm>
+                      <a:off x="0" y="0"/>
+                      <a:ext cx="762000" cy="762000"/>
+                    </a:xfrm>
+                    <a:prstGeom prst="rect">
+                      <a:avLst/>
+                    </a:prstGeom>
+                  </pic:spPr>
+                </pic:pic>
+              </a:graphicData>
+            </a:graphic>
+          </wp:anchor>
+        </w:drawing>
+      </w:r>
+      <w:r>
+        <w:drawing>
+          <wp:anchor distT="0" distB="0" distL="0" distR="0" simplePos="0" allowOverlap="1" behindDoc="0" locked="0" layoutInCell="1" relativeHeight="723900">
+            <wp:simplePos x="0" y="0"/>
+            <wp:positionH relativeFrom="page">
+              <wp:posOffset>9216000</wp:posOffset>
+            </wp:positionH>
+            <wp:positionV relativeFrom="page">
+              <wp:posOffset>6480000</wp:posOffset>
+            </wp:positionV>
+            <wp:extent cx="723900" cy="723900"/>
+            <wp:effectExtent t="0" r="0" b="0" l="0"/>
+            <wp:wrapNone/>
+            <wp:docPr id="1" name="" descr="" title=""/>
+            <wp:cNvGraphicFramePr>
+              <a:graphicFrameLocks xmlns:a="http://schemas.openxmlformats.org/drawingml/2006/main" noChangeAspect="1"/>
+            </wp:cNvGraphicFramePr>
+            <a:graphic xmlns:a="http://schemas.openxmlformats.org/drawingml/2006/main">
+              <a:graphicData uri="http://schemas.openxmlformats.org/drawingml/2006/picture">
+                <pic:pic xmlns:pic="http://schemas.openxmlformats.org/drawingml/2006/picture">
+                  <pic:nvPicPr>
+                    <pic:cNvPr id="0" name="" descr=""/>
+                    <pic:cNvPicPr>
+                      <a:picLocks noChangeAspect="1" noChangeArrowheads="1"/>
+                    </pic:cNvPicPr>
+                  </pic:nvPicPr>
+                  <pic:blipFill>
+                    <a:blip r:embed="rId10" cstate="none"/>
+                    <a:srcRect/>
+                    <a:stretch>
+                      <a:fillRect/>
+                    </a:stretch>
+                  </pic:blipFill>
+                  <pic:spPr bwMode="auto">
+                    <a:xfrm>
+                      <a:off x="0" y="0"/>
+                      <a:ext cx="723900" cy="723900"/>
+                    </a:xfrm>
+                    <a:prstGeom prst="rect">
+                      <a:avLst/>
+                    </a:prstGeom>
+                  </pic:spPr>
+                </pic:pic>
+              </a:graphicData>
+            </a:graphic>
+          </wp:anchor>
+        </w:drawing>
+      </w:r>
+      <w:r>
         <w:rPr>
           <w:rFonts w:ascii="Arial Narrow" w:cs="Arial Narrow" w:eastAsia="Arial Narrow" w:hAnsi="Arial Narrow"/>
           <w:b/>
@@ -1588,6 +1780,102 @@
         <w:spacing w:after="360"/>
         <w:jc w:val="center"/>
       </w:pPr>
+      <w:r>
+        <w:drawing>
+          <wp:anchor distT="0" distB="0" distL="0" distR="0" simplePos="0" allowOverlap="1" behindDoc="0" locked="0" layoutInCell="1" relativeHeight="762000">
+            <wp:simplePos x="0" y="0"/>
+            <wp:positionH relativeFrom="page">
+              <wp:posOffset>493200</wp:posOffset>
+            </wp:positionH>
+            <wp:positionV relativeFrom="page">
+              <wp:posOffset>6444000</wp:posOffset>
+            </wp:positionV>
+            <wp:extent cx="762000" cy="762000"/>
+            <wp:effectExtent t="0" r="0" b="0" l="0"/>
+            <wp:wrapNone/>
+            <wp:docPr id="1" name="" descr="" title=""/>
+            <wp:cNvGraphicFramePr>
+              <a:graphicFrameLocks xmlns:a="http://schemas.openxmlformats.org/drawingml/2006/main" noChangeAspect="1"/>
+            </wp:cNvGraphicFramePr>
+            <a:graphic xmlns:a="http://schemas.openxmlformats.org/drawingml/2006/main">
+              <a:graphicData uri="http://schemas.openxmlformats.org/drawingml/2006/picture">
+                <pic:pic xmlns:pic="http://schemas.openxmlformats.org/drawingml/2006/picture">
+                  <pic:nvPicPr>
+                    <pic:cNvPr id="0" name="" descr=""/>
+                    <pic:cNvPicPr>
+                      <a:picLocks noChangeAspect="1" noChangeArrowheads="1"/>
+                    </pic:cNvPicPr>
+                  </pic:nvPicPr>
+                  <pic:blipFill>
+                    <a:blip r:embed="rId9" cstate="none"/>
+                    <a:srcRect/>
+                    <a:stretch>
+                      <a:fillRect/>
+                    </a:stretch>
+                  </pic:blipFill>
+                  <pic:spPr bwMode="auto">
+                    <a:xfrm>
+                      <a:off x="0" y="0"/>
+                      <a:ext cx="762000" cy="762000"/>
+                    </a:xfrm>
+                    <a:prstGeom prst="rect">
+                      <a:avLst/>
+                    </a:prstGeom>
+                  </pic:spPr>
+                </pic:pic>
+              </a:graphicData>
+            </a:graphic>
+          </wp:anchor>
+        </w:drawing>
+      </w:r>
+      <w:r>
+        <w:drawing>
+          <wp:anchor distT="0" distB="0" distL="0" distR="0" simplePos="0" allowOverlap="1" behindDoc="0" locked="0" layoutInCell="1" relativeHeight="723900">
+            <wp:simplePos x="0" y="0"/>
+            <wp:positionH relativeFrom="page">
+              <wp:posOffset>9216000</wp:posOffset>
+            </wp:positionH>
+            <wp:positionV relativeFrom="page">
+              <wp:posOffset>6480000</wp:posOffset>
+            </wp:positionV>
+            <wp:extent cx="723900" cy="723900"/>
+            <wp:effectExtent t="0" r="0" b="0" l="0"/>
+            <wp:wrapNone/>
+            <wp:docPr id="1" name="" descr="" title=""/>
+            <wp:cNvGraphicFramePr>
+              <a:graphicFrameLocks xmlns:a="http://schemas.openxmlformats.org/drawingml/2006/main" noChangeAspect="1"/>
+            </wp:cNvGraphicFramePr>
+            <a:graphic xmlns:a="http://schemas.openxmlformats.org/drawingml/2006/main">
+              <a:graphicData uri="http://schemas.openxmlformats.org/drawingml/2006/picture">
+                <pic:pic xmlns:pic="http://schemas.openxmlformats.org/drawingml/2006/picture">
+                  <pic:nvPicPr>
+                    <pic:cNvPr id="0" name="" descr=""/>
+                    <pic:cNvPicPr>
+                      <a:picLocks noChangeAspect="1" noChangeArrowheads="1"/>
+                    </pic:cNvPicPr>
+                  </pic:nvPicPr>
+                  <pic:blipFill>
+                    <a:blip r:embed="rId10" cstate="none"/>
+                    <a:srcRect/>
+                    <a:stretch>
+                      <a:fillRect/>
+                    </a:stretch>
+                  </pic:blipFill>
+                  <pic:spPr bwMode="auto">
+                    <a:xfrm>
+                      <a:off x="0" y="0"/>
+                      <a:ext cx="723900" cy="723900"/>
+                    </a:xfrm>
+                    <a:prstGeom prst="rect">
+                      <a:avLst/>
+                    </a:prstGeom>
+                  </pic:spPr>
+                </pic:pic>
+              </a:graphicData>
+            </a:graphic>
+          </wp:anchor>
+        </w:drawing>
+      </w:r>
       <w:r>
         <w:rPr>
           <w:rFonts w:ascii="Arial Narrow" w:cs="Arial Narrow" w:eastAsia="Arial Narrow" w:hAnsi="Arial Narrow"/>
@@ -2376,6 +2664,102 @@
         <w:jc w:val="center"/>
       </w:pPr>
       <w:r>
+        <w:drawing>
+          <wp:anchor distT="0" distB="0" distL="0" distR="0" simplePos="0" allowOverlap="1" behindDoc="0" locked="0" layoutInCell="1" relativeHeight="762000">
+            <wp:simplePos x="0" y="0"/>
+            <wp:positionH relativeFrom="page">
+              <wp:posOffset>493200</wp:posOffset>
+            </wp:positionH>
+            <wp:positionV relativeFrom="page">
+              <wp:posOffset>6444000</wp:posOffset>
+            </wp:positionV>
+            <wp:extent cx="762000" cy="762000"/>
+            <wp:effectExtent t="0" r="0" b="0" l="0"/>
+            <wp:wrapNone/>
+            <wp:docPr id="1" name="" descr="" title=""/>
+            <wp:cNvGraphicFramePr>
+              <a:graphicFrameLocks xmlns:a="http://schemas.openxmlformats.org/drawingml/2006/main" noChangeAspect="1"/>
+            </wp:cNvGraphicFramePr>
+            <a:graphic xmlns:a="http://schemas.openxmlformats.org/drawingml/2006/main">
+              <a:graphicData uri="http://schemas.openxmlformats.org/drawingml/2006/picture">
+                <pic:pic xmlns:pic="http://schemas.openxmlformats.org/drawingml/2006/picture">
+                  <pic:nvPicPr>
+                    <pic:cNvPr id="0" name="" descr=""/>
+                    <pic:cNvPicPr>
+                      <a:picLocks noChangeAspect="1" noChangeArrowheads="1"/>
+                    </pic:cNvPicPr>
+                  </pic:nvPicPr>
+                  <pic:blipFill>
+                    <a:blip r:embed="rId9" cstate="none"/>
+                    <a:srcRect/>
+                    <a:stretch>
+                      <a:fillRect/>
+                    </a:stretch>
+                  </pic:blipFill>
+                  <pic:spPr bwMode="auto">
+                    <a:xfrm>
+                      <a:off x="0" y="0"/>
+                      <a:ext cx="762000" cy="762000"/>
+                    </a:xfrm>
+                    <a:prstGeom prst="rect">
+                      <a:avLst/>
+                    </a:prstGeom>
+                  </pic:spPr>
+                </pic:pic>
+              </a:graphicData>
+            </a:graphic>
+          </wp:anchor>
+        </w:drawing>
+      </w:r>
+      <w:r>
+        <w:drawing>
+          <wp:anchor distT="0" distB="0" distL="0" distR="0" simplePos="0" allowOverlap="1" behindDoc="0" locked="0" layoutInCell="1" relativeHeight="723900">
+            <wp:simplePos x="0" y="0"/>
+            <wp:positionH relativeFrom="page">
+              <wp:posOffset>9216000</wp:posOffset>
+            </wp:positionH>
+            <wp:positionV relativeFrom="page">
+              <wp:posOffset>6480000</wp:posOffset>
+            </wp:positionV>
+            <wp:extent cx="723900" cy="723900"/>
+            <wp:effectExtent t="0" r="0" b="0" l="0"/>
+            <wp:wrapNone/>
+            <wp:docPr id="1" name="" descr="" title=""/>
+            <wp:cNvGraphicFramePr>
+              <a:graphicFrameLocks xmlns:a="http://schemas.openxmlformats.org/drawingml/2006/main" noChangeAspect="1"/>
+            </wp:cNvGraphicFramePr>
+            <a:graphic xmlns:a="http://schemas.openxmlformats.org/drawingml/2006/main">
+              <a:graphicData uri="http://schemas.openxmlformats.org/drawingml/2006/picture">
+                <pic:pic xmlns:pic="http://schemas.openxmlformats.org/drawingml/2006/picture">
+                  <pic:nvPicPr>
+                    <pic:cNvPr id="0" name="" descr=""/>
+                    <pic:cNvPicPr>
+                      <a:picLocks noChangeAspect="1" noChangeArrowheads="1"/>
+                    </pic:cNvPicPr>
+                  </pic:nvPicPr>
+                  <pic:blipFill>
+                    <a:blip r:embed="rId10" cstate="none"/>
+                    <a:srcRect/>
+                    <a:stretch>
+                      <a:fillRect/>
+                    </a:stretch>
+                  </pic:blipFill>
+                  <pic:spPr bwMode="auto">
+                    <a:xfrm>
+                      <a:off x="0" y="0"/>
+                      <a:ext cx="723900" cy="723900"/>
+                    </a:xfrm>
+                    <a:prstGeom prst="rect">
+                      <a:avLst/>
+                    </a:prstGeom>
+                  </pic:spPr>
+                </pic:pic>
+              </a:graphicData>
+            </a:graphic>
+          </wp:anchor>
+        </w:drawing>
+      </w:r>
+      <w:r>
         <w:rPr>
           <w:rFonts w:ascii="Arial Narrow" w:cs="Arial Narrow" w:eastAsia="Arial Narrow" w:hAnsi="Arial Narrow"/>
           <w:b/>
@@ -3390,6 +3774,102 @@
         <w:spacing w:after="360"/>
         <w:jc w:val="center"/>
       </w:pPr>
+      <w:r>
+        <w:drawing>
+          <wp:anchor distT="0" distB="0" distL="0" distR="0" simplePos="0" allowOverlap="1" behindDoc="0" locked="0" layoutInCell="1" relativeHeight="762000">
+            <wp:simplePos x="0" y="0"/>
+            <wp:positionH relativeFrom="page">
+              <wp:posOffset>493200</wp:posOffset>
+            </wp:positionH>
+            <wp:positionV relativeFrom="page">
+              <wp:posOffset>6444000</wp:posOffset>
+            </wp:positionV>
+            <wp:extent cx="762000" cy="762000"/>
+            <wp:effectExtent t="0" r="0" b="0" l="0"/>
+            <wp:wrapNone/>
+            <wp:docPr id="1" name="" descr="" title=""/>
+            <wp:cNvGraphicFramePr>
+              <a:graphicFrameLocks xmlns:a="http://schemas.openxmlformats.org/drawingml/2006/main" noChangeAspect="1"/>
+            </wp:cNvGraphicFramePr>
+            <a:graphic xmlns:a="http://schemas.openxmlformats.org/drawingml/2006/main">
+              <a:graphicData uri="http://schemas.openxmlformats.org/drawingml/2006/picture">
+                <pic:pic xmlns:pic="http://schemas.openxmlformats.org/drawingml/2006/picture">
+                  <pic:nvPicPr>
+                    <pic:cNvPr id="0" name="" descr=""/>
+                    <pic:cNvPicPr>
+                      <a:picLocks noChangeAspect="1" noChangeArrowheads="1"/>
+                    </pic:cNvPicPr>
+                  </pic:nvPicPr>
+                  <pic:blipFill>
+                    <a:blip r:embed="rId9" cstate="none"/>
+                    <a:srcRect/>
+                    <a:stretch>
+                      <a:fillRect/>
+                    </a:stretch>
+                  </pic:blipFill>
+                  <pic:spPr bwMode="auto">
+                    <a:xfrm>
+                      <a:off x="0" y="0"/>
+                      <a:ext cx="762000" cy="762000"/>
+                    </a:xfrm>
+                    <a:prstGeom prst="rect">
+                      <a:avLst/>
+                    </a:prstGeom>
+                  </pic:spPr>
+                </pic:pic>
+              </a:graphicData>
+            </a:graphic>
+          </wp:anchor>
+        </w:drawing>
+      </w:r>
+      <w:r>
+        <w:drawing>
+          <wp:anchor distT="0" distB="0" distL="0" distR="0" simplePos="0" allowOverlap="1" behindDoc="0" locked="0" layoutInCell="1" relativeHeight="723900">
+            <wp:simplePos x="0" y="0"/>
+            <wp:positionH relativeFrom="page">
+              <wp:posOffset>9216000</wp:posOffset>
+            </wp:positionH>
+            <wp:positionV relativeFrom="page">
+              <wp:posOffset>6480000</wp:posOffset>
+            </wp:positionV>
+            <wp:extent cx="723900" cy="723900"/>
+            <wp:effectExtent t="0" r="0" b="0" l="0"/>
+            <wp:wrapNone/>
+            <wp:docPr id="1" name="" descr="" title=""/>
+            <wp:cNvGraphicFramePr>
+              <a:graphicFrameLocks xmlns:a="http://schemas.openxmlformats.org/drawingml/2006/main" noChangeAspect="1"/>
+            </wp:cNvGraphicFramePr>
+            <a:graphic xmlns:a="http://schemas.openxmlformats.org/drawingml/2006/main">
+              <a:graphicData uri="http://schemas.openxmlformats.org/drawingml/2006/picture">
+                <pic:pic xmlns:pic="http://schemas.openxmlformats.org/drawingml/2006/picture">
+                  <pic:nvPicPr>
+                    <pic:cNvPr id="0" name="" descr=""/>
+                    <pic:cNvPicPr>
+                      <a:picLocks noChangeAspect="1" noChangeArrowheads="1"/>
+                    </pic:cNvPicPr>
+                  </pic:nvPicPr>
+                  <pic:blipFill>
+                    <a:blip r:embed="rId10" cstate="none"/>
+                    <a:srcRect/>
+                    <a:stretch>
+                      <a:fillRect/>
+                    </a:stretch>
+                  </pic:blipFill>
+                  <pic:spPr bwMode="auto">
+                    <a:xfrm>
+                      <a:off x="0" y="0"/>
+                      <a:ext cx="723900" cy="723900"/>
+                    </a:xfrm>
+                    <a:prstGeom prst="rect">
+                      <a:avLst/>
+                    </a:prstGeom>
+                  </pic:spPr>
+                </pic:pic>
+              </a:graphicData>
+            </a:graphic>
+          </wp:anchor>
+        </w:drawing>
+      </w:r>
       <w:r>
         <w:rPr>
           <w:rFonts w:ascii="Arial Narrow" w:cs="Arial Narrow" w:eastAsia="Arial Narrow" w:hAnsi="Arial Narrow"/>
@@ -4089,6 +4569,102 @@
         <w:jc w:val="center"/>
       </w:pPr>
       <w:r>
+        <w:drawing>
+          <wp:anchor distT="0" distB="0" distL="0" distR="0" simplePos="0" allowOverlap="1" behindDoc="0" locked="0" layoutInCell="1" relativeHeight="762000">
+            <wp:simplePos x="0" y="0"/>
+            <wp:positionH relativeFrom="page">
+              <wp:posOffset>493200</wp:posOffset>
+            </wp:positionH>
+            <wp:positionV relativeFrom="page">
+              <wp:posOffset>6444000</wp:posOffset>
+            </wp:positionV>
+            <wp:extent cx="762000" cy="762000"/>
+            <wp:effectExtent t="0" r="0" b="0" l="0"/>
+            <wp:wrapNone/>
+            <wp:docPr id="1" name="" descr="" title=""/>
+            <wp:cNvGraphicFramePr>
+              <a:graphicFrameLocks xmlns:a="http://schemas.openxmlformats.org/drawingml/2006/main" noChangeAspect="1"/>
+            </wp:cNvGraphicFramePr>
+            <a:graphic xmlns:a="http://schemas.openxmlformats.org/drawingml/2006/main">
+              <a:graphicData uri="http://schemas.openxmlformats.org/drawingml/2006/picture">
+                <pic:pic xmlns:pic="http://schemas.openxmlformats.org/drawingml/2006/picture">
+                  <pic:nvPicPr>
+                    <pic:cNvPr id="0" name="" descr=""/>
+                    <pic:cNvPicPr>
+                      <a:picLocks noChangeAspect="1" noChangeArrowheads="1"/>
+                    </pic:cNvPicPr>
+                  </pic:nvPicPr>
+                  <pic:blipFill>
+                    <a:blip r:embed="rId9" cstate="none"/>
+                    <a:srcRect/>
+                    <a:stretch>
+                      <a:fillRect/>
+                    </a:stretch>
+                  </pic:blipFill>
+                  <pic:spPr bwMode="auto">
+                    <a:xfrm>
+                      <a:off x="0" y="0"/>
+                      <a:ext cx="762000" cy="762000"/>
+                    </a:xfrm>
+                    <a:prstGeom prst="rect">
+                      <a:avLst/>
+                    </a:prstGeom>
+                  </pic:spPr>
+                </pic:pic>
+              </a:graphicData>
+            </a:graphic>
+          </wp:anchor>
+        </w:drawing>
+      </w:r>
+      <w:r>
+        <w:drawing>
+          <wp:anchor distT="0" distB="0" distL="0" distR="0" simplePos="0" allowOverlap="1" behindDoc="0" locked="0" layoutInCell="1" relativeHeight="723900">
+            <wp:simplePos x="0" y="0"/>
+            <wp:positionH relativeFrom="page">
+              <wp:posOffset>9216000</wp:posOffset>
+            </wp:positionH>
+            <wp:positionV relativeFrom="page">
+              <wp:posOffset>6480000</wp:posOffset>
+            </wp:positionV>
+            <wp:extent cx="723900" cy="723900"/>
+            <wp:effectExtent t="0" r="0" b="0" l="0"/>
+            <wp:wrapNone/>
+            <wp:docPr id="1" name="" descr="" title=""/>
+            <wp:cNvGraphicFramePr>
+              <a:graphicFrameLocks xmlns:a="http://schemas.openxmlformats.org/drawingml/2006/main" noChangeAspect="1"/>
+            </wp:cNvGraphicFramePr>
+            <a:graphic xmlns:a="http://schemas.openxmlformats.org/drawingml/2006/main">
+              <a:graphicData uri="http://schemas.openxmlformats.org/drawingml/2006/picture">
+                <pic:pic xmlns:pic="http://schemas.openxmlformats.org/drawingml/2006/picture">
+                  <pic:nvPicPr>
+                    <pic:cNvPr id="0" name="" descr=""/>
+                    <pic:cNvPicPr>
+                      <a:picLocks noChangeAspect="1" noChangeArrowheads="1"/>
+                    </pic:cNvPicPr>
+                  </pic:nvPicPr>
+                  <pic:blipFill>
+                    <a:blip r:embed="rId10" cstate="none"/>
+                    <a:srcRect/>
+                    <a:stretch>
+                      <a:fillRect/>
+                    </a:stretch>
+                  </pic:blipFill>
+                  <pic:spPr bwMode="auto">
+                    <a:xfrm>
+                      <a:off x="0" y="0"/>
+                      <a:ext cx="723900" cy="723900"/>
+                    </a:xfrm>
+                    <a:prstGeom prst="rect">
+                      <a:avLst/>
+                    </a:prstGeom>
+                  </pic:spPr>
+                </pic:pic>
+              </a:graphicData>
+            </a:graphic>
+          </wp:anchor>
+        </w:drawing>
+      </w:r>
+      <w:r>
         <w:rPr>
           <w:rFonts w:ascii="Arial Narrow" w:cs="Arial Narrow" w:eastAsia="Arial Narrow" w:hAnsi="Arial Narrow"/>
           <w:b/>
@@ -4519,6 +5095,102 @@
         <w:spacing w:after="60"/>
         <w:jc w:val="center"/>
       </w:pPr>
+      <w:r>
+        <w:drawing>
+          <wp:anchor distT="0" distB="0" distL="0" distR="0" simplePos="0" allowOverlap="1" behindDoc="0" locked="0" layoutInCell="1" relativeHeight="762000">
+            <wp:simplePos x="0" y="0"/>
+            <wp:positionH relativeFrom="page">
+              <wp:posOffset>493200</wp:posOffset>
+            </wp:positionH>
+            <wp:positionV relativeFrom="page">
+              <wp:posOffset>6444000</wp:posOffset>
+            </wp:positionV>
+            <wp:extent cx="762000" cy="762000"/>
+            <wp:effectExtent t="0" r="0" b="0" l="0"/>
+            <wp:wrapNone/>
+            <wp:docPr id="1" name="" descr="" title=""/>
+            <wp:cNvGraphicFramePr>
+              <a:graphicFrameLocks xmlns:a="http://schemas.openxmlformats.org/drawingml/2006/main" noChangeAspect="1"/>
+            </wp:cNvGraphicFramePr>
+            <a:graphic xmlns:a="http://schemas.openxmlformats.org/drawingml/2006/main">
+              <a:graphicData uri="http://schemas.openxmlformats.org/drawingml/2006/picture">
+                <pic:pic xmlns:pic="http://schemas.openxmlformats.org/drawingml/2006/picture">
+                  <pic:nvPicPr>
+                    <pic:cNvPr id="0" name="" descr=""/>
+                    <pic:cNvPicPr>
+                      <a:picLocks noChangeAspect="1" noChangeArrowheads="1"/>
+                    </pic:cNvPicPr>
+                  </pic:nvPicPr>
+                  <pic:blipFill>
+                    <a:blip r:embed="rId9" cstate="none"/>
+                    <a:srcRect/>
+                    <a:stretch>
+                      <a:fillRect/>
+                    </a:stretch>
+                  </pic:blipFill>
+                  <pic:spPr bwMode="auto">
+                    <a:xfrm>
+                      <a:off x="0" y="0"/>
+                      <a:ext cx="762000" cy="762000"/>
+                    </a:xfrm>
+                    <a:prstGeom prst="rect">
+                      <a:avLst/>
+                    </a:prstGeom>
+                  </pic:spPr>
+                </pic:pic>
+              </a:graphicData>
+            </a:graphic>
+          </wp:anchor>
+        </w:drawing>
+      </w:r>
+      <w:r>
+        <w:drawing>
+          <wp:anchor distT="0" distB="0" distL="0" distR="0" simplePos="0" allowOverlap="1" behindDoc="0" locked="0" layoutInCell="1" relativeHeight="723900">
+            <wp:simplePos x="0" y="0"/>
+            <wp:positionH relativeFrom="page">
+              <wp:posOffset>9216000</wp:posOffset>
+            </wp:positionH>
+            <wp:positionV relativeFrom="page">
+              <wp:posOffset>6480000</wp:posOffset>
+            </wp:positionV>
+            <wp:extent cx="723900" cy="723900"/>
+            <wp:effectExtent t="0" r="0" b="0" l="0"/>
+            <wp:wrapNone/>
+            <wp:docPr id="1" name="" descr="" title=""/>
+            <wp:cNvGraphicFramePr>
+              <a:graphicFrameLocks xmlns:a="http://schemas.openxmlformats.org/drawingml/2006/main" noChangeAspect="1"/>
+            </wp:cNvGraphicFramePr>
+            <a:graphic xmlns:a="http://schemas.openxmlformats.org/drawingml/2006/main">
+              <a:graphicData uri="http://schemas.openxmlformats.org/drawingml/2006/picture">
+                <pic:pic xmlns:pic="http://schemas.openxmlformats.org/drawingml/2006/picture">
+                  <pic:nvPicPr>
+                    <pic:cNvPr id="0" name="" descr=""/>
+                    <pic:cNvPicPr>
+                      <a:picLocks noChangeAspect="1" noChangeArrowheads="1"/>
+                    </pic:cNvPicPr>
+                  </pic:nvPicPr>
+                  <pic:blipFill>
+                    <a:blip r:embed="rId10" cstate="none"/>
+                    <a:srcRect/>
+                    <a:stretch>
+                      <a:fillRect/>
+                    </a:stretch>
+                  </pic:blipFill>
+                  <pic:spPr bwMode="auto">
+                    <a:xfrm>
+                      <a:off x="0" y="0"/>
+                      <a:ext cx="723900" cy="723900"/>
+                    </a:xfrm>
+                    <a:prstGeom prst="rect">
+                      <a:avLst/>
+                    </a:prstGeom>
+                  </pic:spPr>
+                </pic:pic>
+              </a:graphicData>
+            </a:graphic>
+          </wp:anchor>
+        </w:drawing>
+      </w:r>
       <w:r>
         <w:rPr>
           <w:rFonts w:ascii="Arial Narrow" w:cs="Arial Narrow" w:eastAsia="Arial Narrow" w:hAnsi="Arial Narrow"/>
@@ -5351,6 +6023,102 @@
         <w:jc w:val="center"/>
       </w:pPr>
       <w:r>
+        <w:drawing>
+          <wp:anchor distT="0" distB="0" distL="0" distR="0" simplePos="0" allowOverlap="1" behindDoc="0" locked="0" layoutInCell="1" relativeHeight="762000">
+            <wp:simplePos x="0" y="0"/>
+            <wp:positionH relativeFrom="page">
+              <wp:posOffset>493200</wp:posOffset>
+            </wp:positionH>
+            <wp:positionV relativeFrom="page">
+              <wp:posOffset>6444000</wp:posOffset>
+            </wp:positionV>
+            <wp:extent cx="762000" cy="762000"/>
+            <wp:effectExtent t="0" r="0" b="0" l="0"/>
+            <wp:wrapNone/>
+            <wp:docPr id="1" name="" descr="" title=""/>
+            <wp:cNvGraphicFramePr>
+              <a:graphicFrameLocks xmlns:a="http://schemas.openxmlformats.org/drawingml/2006/main" noChangeAspect="1"/>
+            </wp:cNvGraphicFramePr>
+            <a:graphic xmlns:a="http://schemas.openxmlformats.org/drawingml/2006/main">
+              <a:graphicData uri="http://schemas.openxmlformats.org/drawingml/2006/picture">
+                <pic:pic xmlns:pic="http://schemas.openxmlformats.org/drawingml/2006/picture">
+                  <pic:nvPicPr>
+                    <pic:cNvPr id="0" name="" descr=""/>
+                    <pic:cNvPicPr>
+                      <a:picLocks noChangeAspect="1" noChangeArrowheads="1"/>
+                    </pic:cNvPicPr>
+                  </pic:nvPicPr>
+                  <pic:blipFill>
+                    <a:blip r:embed="rId9" cstate="none"/>
+                    <a:srcRect/>
+                    <a:stretch>
+                      <a:fillRect/>
+                    </a:stretch>
+                  </pic:blipFill>
+                  <pic:spPr bwMode="auto">
+                    <a:xfrm>
+                      <a:off x="0" y="0"/>
+                      <a:ext cx="762000" cy="762000"/>
+                    </a:xfrm>
+                    <a:prstGeom prst="rect">
+                      <a:avLst/>
+                    </a:prstGeom>
+                  </pic:spPr>
+                </pic:pic>
+              </a:graphicData>
+            </a:graphic>
+          </wp:anchor>
+        </w:drawing>
+      </w:r>
+      <w:r>
+        <w:drawing>
+          <wp:anchor distT="0" distB="0" distL="0" distR="0" simplePos="0" allowOverlap="1" behindDoc="0" locked="0" layoutInCell="1" relativeHeight="723900">
+            <wp:simplePos x="0" y="0"/>
+            <wp:positionH relativeFrom="page">
+              <wp:posOffset>9216000</wp:posOffset>
+            </wp:positionH>
+            <wp:positionV relativeFrom="page">
+              <wp:posOffset>6480000</wp:posOffset>
+            </wp:positionV>
+            <wp:extent cx="723900" cy="723900"/>
+            <wp:effectExtent t="0" r="0" b="0" l="0"/>
+            <wp:wrapNone/>
+            <wp:docPr id="1" name="" descr="" title=""/>
+            <wp:cNvGraphicFramePr>
+              <a:graphicFrameLocks xmlns:a="http://schemas.openxmlformats.org/drawingml/2006/main" noChangeAspect="1"/>
+            </wp:cNvGraphicFramePr>
+            <a:graphic xmlns:a="http://schemas.openxmlformats.org/drawingml/2006/main">
+              <a:graphicData uri="http://schemas.openxmlformats.org/drawingml/2006/picture">
+                <pic:pic xmlns:pic="http://schemas.openxmlformats.org/drawingml/2006/picture">
+                  <pic:nvPicPr>
+                    <pic:cNvPr id="0" name="" descr=""/>
+                    <pic:cNvPicPr>
+                      <a:picLocks noChangeAspect="1" noChangeArrowheads="1"/>
+                    </pic:cNvPicPr>
+                  </pic:nvPicPr>
+                  <pic:blipFill>
+                    <a:blip r:embed="rId10" cstate="none"/>
+                    <a:srcRect/>
+                    <a:stretch>
+                      <a:fillRect/>
+                    </a:stretch>
+                  </pic:blipFill>
+                  <pic:spPr bwMode="auto">
+                    <a:xfrm>
+                      <a:off x="0" y="0"/>
+                      <a:ext cx="723900" cy="723900"/>
+                    </a:xfrm>
+                    <a:prstGeom prst="rect">
+                      <a:avLst/>
+                    </a:prstGeom>
+                  </pic:spPr>
+                </pic:pic>
+              </a:graphicData>
+            </a:graphic>
+          </wp:anchor>
+        </w:drawing>
+      </w:r>
+      <w:r>
         <w:rPr>
           <w:rFonts w:ascii="Arial Narrow" w:cs="Arial Narrow" w:eastAsia="Arial Narrow" w:hAnsi="Arial Narrow"/>
           <w:b/>
@@ -5853,6 +6621,102 @@
         <w:spacing w:after="60"/>
         <w:jc w:val="center"/>
       </w:pPr>
+      <w:r>
+        <w:drawing>
+          <wp:anchor distT="0" distB="0" distL="0" distR="0" simplePos="0" allowOverlap="1" behindDoc="0" locked="0" layoutInCell="1" relativeHeight="762000">
+            <wp:simplePos x="0" y="0"/>
+            <wp:positionH relativeFrom="page">
+              <wp:posOffset>493200</wp:posOffset>
+            </wp:positionH>
+            <wp:positionV relativeFrom="page">
+              <wp:posOffset>6444000</wp:posOffset>
+            </wp:positionV>
+            <wp:extent cx="762000" cy="762000"/>
+            <wp:effectExtent t="0" r="0" b="0" l="0"/>
+            <wp:wrapNone/>
+            <wp:docPr id="1" name="" descr="" title=""/>
+            <wp:cNvGraphicFramePr>
+              <a:graphicFrameLocks xmlns:a="http://schemas.openxmlformats.org/drawingml/2006/main" noChangeAspect="1"/>
+            </wp:cNvGraphicFramePr>
+            <a:graphic xmlns:a="http://schemas.openxmlformats.org/drawingml/2006/main">
+              <a:graphicData uri="http://schemas.openxmlformats.org/drawingml/2006/picture">
+                <pic:pic xmlns:pic="http://schemas.openxmlformats.org/drawingml/2006/picture">
+                  <pic:nvPicPr>
+                    <pic:cNvPr id="0" name="" descr=""/>
+                    <pic:cNvPicPr>
+                      <a:picLocks noChangeAspect="1" noChangeArrowheads="1"/>
+                    </pic:cNvPicPr>
+                  </pic:nvPicPr>
+                  <pic:blipFill>
+                    <a:blip r:embed="rId9" cstate="none"/>
+                    <a:srcRect/>
+                    <a:stretch>
+                      <a:fillRect/>
+                    </a:stretch>
+                  </pic:blipFill>
+                  <pic:spPr bwMode="auto">
+                    <a:xfrm>
+                      <a:off x="0" y="0"/>
+                      <a:ext cx="762000" cy="762000"/>
+                    </a:xfrm>
+                    <a:prstGeom prst="rect">
+                      <a:avLst/>
+                    </a:prstGeom>
+                  </pic:spPr>
+                </pic:pic>
+              </a:graphicData>
+            </a:graphic>
+          </wp:anchor>
+        </w:drawing>
+      </w:r>
+      <w:r>
+        <w:drawing>
+          <wp:anchor distT="0" distB="0" distL="0" distR="0" simplePos="0" allowOverlap="1" behindDoc="0" locked="0" layoutInCell="1" relativeHeight="723900">
+            <wp:simplePos x="0" y="0"/>
+            <wp:positionH relativeFrom="page">
+              <wp:posOffset>9216000</wp:posOffset>
+            </wp:positionH>
+            <wp:positionV relativeFrom="page">
+              <wp:posOffset>6480000</wp:posOffset>
+            </wp:positionV>
+            <wp:extent cx="723900" cy="723900"/>
+            <wp:effectExtent t="0" r="0" b="0" l="0"/>
+            <wp:wrapNone/>
+            <wp:docPr id="1" name="" descr="" title=""/>
+            <wp:cNvGraphicFramePr>
+              <a:graphicFrameLocks xmlns:a="http://schemas.openxmlformats.org/drawingml/2006/main" noChangeAspect="1"/>
+            </wp:cNvGraphicFramePr>
+            <a:graphic xmlns:a="http://schemas.openxmlformats.org/drawingml/2006/main">
+              <a:graphicData uri="http://schemas.openxmlformats.org/drawingml/2006/picture">
+                <pic:pic xmlns:pic="http://schemas.openxmlformats.org/drawingml/2006/picture">
+                  <pic:nvPicPr>
+                    <pic:cNvPr id="0" name="" descr=""/>
+                    <pic:cNvPicPr>
+                      <a:picLocks noChangeAspect="1" noChangeArrowheads="1"/>
+                    </pic:cNvPicPr>
+                  </pic:nvPicPr>
+                  <pic:blipFill>
+                    <a:blip r:embed="rId10" cstate="none"/>
+                    <a:srcRect/>
+                    <a:stretch>
+                      <a:fillRect/>
+                    </a:stretch>
+                  </pic:blipFill>
+                  <pic:spPr bwMode="auto">
+                    <a:xfrm>
+                      <a:off x="0" y="0"/>
+                      <a:ext cx="723900" cy="723900"/>
+                    </a:xfrm>
+                    <a:prstGeom prst="rect">
+                      <a:avLst/>
+                    </a:prstGeom>
+                  </pic:spPr>
+                </pic:pic>
+              </a:graphicData>
+            </a:graphic>
+          </wp:anchor>
+        </w:drawing>
+      </w:r>
       <w:r>
         <w:rPr>
           <w:rFonts w:ascii="Arial Narrow" w:cs="Arial Narrow" w:eastAsia="Arial Narrow" w:hAnsi="Arial Narrow"/>
@@ -6689,6 +7553,102 @@
         <w:jc w:val="center"/>
       </w:pPr>
       <w:r>
+        <w:drawing>
+          <wp:anchor distT="0" distB="0" distL="0" distR="0" simplePos="0" allowOverlap="1" behindDoc="0" locked="0" layoutInCell="1" relativeHeight="762000">
+            <wp:simplePos x="0" y="0"/>
+            <wp:positionH relativeFrom="page">
+              <wp:posOffset>493200</wp:posOffset>
+            </wp:positionH>
+            <wp:positionV relativeFrom="page">
+              <wp:posOffset>6444000</wp:posOffset>
+            </wp:positionV>
+            <wp:extent cx="762000" cy="762000"/>
+            <wp:effectExtent t="0" r="0" b="0" l="0"/>
+            <wp:wrapNone/>
+            <wp:docPr id="1" name="" descr="" title=""/>
+            <wp:cNvGraphicFramePr>
+              <a:graphicFrameLocks xmlns:a="http://schemas.openxmlformats.org/drawingml/2006/main" noChangeAspect="1"/>
+            </wp:cNvGraphicFramePr>
+            <a:graphic xmlns:a="http://schemas.openxmlformats.org/drawingml/2006/main">
+              <a:graphicData uri="http://schemas.openxmlformats.org/drawingml/2006/picture">
+                <pic:pic xmlns:pic="http://schemas.openxmlformats.org/drawingml/2006/picture">
+                  <pic:nvPicPr>
+                    <pic:cNvPr id="0" name="" descr=""/>
+                    <pic:cNvPicPr>
+                      <a:picLocks noChangeAspect="1" noChangeArrowheads="1"/>
+                    </pic:cNvPicPr>
+                  </pic:nvPicPr>
+                  <pic:blipFill>
+                    <a:blip r:embed="rId9" cstate="none"/>
+                    <a:srcRect/>
+                    <a:stretch>
+                      <a:fillRect/>
+                    </a:stretch>
+                  </pic:blipFill>
+                  <pic:spPr bwMode="auto">
+                    <a:xfrm>
+                      <a:off x="0" y="0"/>
+                      <a:ext cx="762000" cy="762000"/>
+                    </a:xfrm>
+                    <a:prstGeom prst="rect">
+                      <a:avLst/>
+                    </a:prstGeom>
+                  </pic:spPr>
+                </pic:pic>
+              </a:graphicData>
+            </a:graphic>
+          </wp:anchor>
+        </w:drawing>
+      </w:r>
+      <w:r>
+        <w:drawing>
+          <wp:anchor distT="0" distB="0" distL="0" distR="0" simplePos="0" allowOverlap="1" behindDoc="0" locked="0" layoutInCell="1" relativeHeight="723900">
+            <wp:simplePos x="0" y="0"/>
+            <wp:positionH relativeFrom="page">
+              <wp:posOffset>9216000</wp:posOffset>
+            </wp:positionH>
+            <wp:positionV relativeFrom="page">
+              <wp:posOffset>6480000</wp:posOffset>
+            </wp:positionV>
+            <wp:extent cx="723900" cy="723900"/>
+            <wp:effectExtent t="0" r="0" b="0" l="0"/>
+            <wp:wrapNone/>
+            <wp:docPr id="1" name="" descr="" title=""/>
+            <wp:cNvGraphicFramePr>
+              <a:graphicFrameLocks xmlns:a="http://schemas.openxmlformats.org/drawingml/2006/main" noChangeAspect="1"/>
+            </wp:cNvGraphicFramePr>
+            <a:graphic xmlns:a="http://schemas.openxmlformats.org/drawingml/2006/main">
+              <a:graphicData uri="http://schemas.openxmlformats.org/drawingml/2006/picture">
+                <pic:pic xmlns:pic="http://schemas.openxmlformats.org/drawingml/2006/picture">
+                  <pic:nvPicPr>
+                    <pic:cNvPr id="0" name="" descr=""/>
+                    <pic:cNvPicPr>
+                      <a:picLocks noChangeAspect="1" noChangeArrowheads="1"/>
+                    </pic:cNvPicPr>
+                  </pic:nvPicPr>
+                  <pic:blipFill>
+                    <a:blip r:embed="rId10" cstate="none"/>
+                    <a:srcRect/>
+                    <a:stretch>
+                      <a:fillRect/>
+                    </a:stretch>
+                  </pic:blipFill>
+                  <pic:spPr bwMode="auto">
+                    <a:xfrm>
+                      <a:off x="0" y="0"/>
+                      <a:ext cx="723900" cy="723900"/>
+                    </a:xfrm>
+                    <a:prstGeom prst="rect">
+                      <a:avLst/>
+                    </a:prstGeom>
+                  </pic:spPr>
+                </pic:pic>
+              </a:graphicData>
+            </a:graphic>
+          </wp:anchor>
+        </w:drawing>
+      </w:r>
+      <w:r>
         <w:rPr>
           <w:rFonts w:ascii="Arial Narrow" w:cs="Arial Narrow" w:eastAsia="Arial Narrow" w:hAnsi="Arial Narrow"/>
           <w:b/>
@@ -7545,6 +8505,102 @@
         <w:spacing w:after="60"/>
         <w:jc w:val="center"/>
       </w:pPr>
+      <w:r>
+        <w:drawing>
+          <wp:anchor distT="0" distB="0" distL="0" distR="0" simplePos="0" allowOverlap="1" behindDoc="0" locked="0" layoutInCell="1" relativeHeight="762000">
+            <wp:simplePos x="0" y="0"/>
+            <wp:positionH relativeFrom="page">
+              <wp:posOffset>493200</wp:posOffset>
+            </wp:positionH>
+            <wp:positionV relativeFrom="page">
+              <wp:posOffset>6444000</wp:posOffset>
+            </wp:positionV>
+            <wp:extent cx="762000" cy="762000"/>
+            <wp:effectExtent t="0" r="0" b="0" l="0"/>
+            <wp:wrapNone/>
+            <wp:docPr id="1" name="" descr="" title=""/>
+            <wp:cNvGraphicFramePr>
+              <a:graphicFrameLocks xmlns:a="http://schemas.openxmlformats.org/drawingml/2006/main" noChangeAspect="1"/>
+            </wp:cNvGraphicFramePr>
+            <a:graphic xmlns:a="http://schemas.openxmlformats.org/drawingml/2006/main">
+              <a:graphicData uri="http://schemas.openxmlformats.org/drawingml/2006/picture">
+                <pic:pic xmlns:pic="http://schemas.openxmlformats.org/drawingml/2006/picture">
+                  <pic:nvPicPr>
+                    <pic:cNvPr id="0" name="" descr=""/>
+                    <pic:cNvPicPr>
+                      <a:picLocks noChangeAspect="1" noChangeArrowheads="1"/>
+                    </pic:cNvPicPr>
+                  </pic:nvPicPr>
+                  <pic:blipFill>
+                    <a:blip r:embed="rId9" cstate="none"/>
+                    <a:srcRect/>
+                    <a:stretch>
+                      <a:fillRect/>
+                    </a:stretch>
+                  </pic:blipFill>
+                  <pic:spPr bwMode="auto">
+                    <a:xfrm>
+                      <a:off x="0" y="0"/>
+                      <a:ext cx="762000" cy="762000"/>
+                    </a:xfrm>
+                    <a:prstGeom prst="rect">
+                      <a:avLst/>
+                    </a:prstGeom>
+                  </pic:spPr>
+                </pic:pic>
+              </a:graphicData>
+            </a:graphic>
+          </wp:anchor>
+        </w:drawing>
+      </w:r>
+      <w:r>
+        <w:drawing>
+          <wp:anchor distT="0" distB="0" distL="0" distR="0" simplePos="0" allowOverlap="1" behindDoc="0" locked="0" layoutInCell="1" relativeHeight="723900">
+            <wp:simplePos x="0" y="0"/>
+            <wp:positionH relativeFrom="page">
+              <wp:posOffset>9216000</wp:posOffset>
+            </wp:positionH>
+            <wp:positionV relativeFrom="page">
+              <wp:posOffset>6480000</wp:posOffset>
+            </wp:positionV>
+            <wp:extent cx="723900" cy="723900"/>
+            <wp:effectExtent t="0" r="0" b="0" l="0"/>
+            <wp:wrapNone/>
+            <wp:docPr id="1" name="" descr="" title=""/>
+            <wp:cNvGraphicFramePr>
+              <a:graphicFrameLocks xmlns:a="http://schemas.openxmlformats.org/drawingml/2006/main" noChangeAspect="1"/>
+            </wp:cNvGraphicFramePr>
+            <a:graphic xmlns:a="http://schemas.openxmlformats.org/drawingml/2006/main">
+              <a:graphicData uri="http://schemas.openxmlformats.org/drawingml/2006/picture">
+                <pic:pic xmlns:pic="http://schemas.openxmlformats.org/drawingml/2006/picture">
+                  <pic:nvPicPr>
+                    <pic:cNvPr id="0" name="" descr=""/>
+                    <pic:cNvPicPr>
+                      <a:picLocks noChangeAspect="1" noChangeArrowheads="1"/>
+                    </pic:cNvPicPr>
+                  </pic:nvPicPr>
+                  <pic:blipFill>
+                    <a:blip r:embed="rId10" cstate="none"/>
+                    <a:srcRect/>
+                    <a:stretch>
+                      <a:fillRect/>
+                    </a:stretch>
+                  </pic:blipFill>
+                  <pic:spPr bwMode="auto">
+                    <a:xfrm>
+                      <a:off x="0" y="0"/>
+                      <a:ext cx="723900" cy="723900"/>
+                    </a:xfrm>
+                    <a:prstGeom prst="rect">
+                      <a:avLst/>
+                    </a:prstGeom>
+                  </pic:spPr>
+                </pic:pic>
+              </a:graphicData>
+            </a:graphic>
+          </wp:anchor>
+        </w:drawing>
+      </w:r>
       <w:r>
         <w:rPr>
           <w:rFonts w:ascii="Arial Narrow" w:cs="Arial Narrow" w:eastAsia="Arial Narrow" w:hAnsi="Arial Narrow"/>
@@ -8279,6 +9335,102 @@
         <w:jc w:val="center"/>
       </w:pPr>
       <w:r>
+        <w:drawing>
+          <wp:anchor distT="0" distB="0" distL="0" distR="0" simplePos="0" allowOverlap="1" behindDoc="0" locked="0" layoutInCell="1" relativeHeight="762000">
+            <wp:simplePos x="0" y="0"/>
+            <wp:positionH relativeFrom="page">
+              <wp:posOffset>493200</wp:posOffset>
+            </wp:positionH>
+            <wp:positionV relativeFrom="page">
+              <wp:posOffset>6444000</wp:posOffset>
+            </wp:positionV>
+            <wp:extent cx="762000" cy="762000"/>
+            <wp:effectExtent t="0" r="0" b="0" l="0"/>
+            <wp:wrapNone/>
+            <wp:docPr id="1" name="" descr="" title=""/>
+            <wp:cNvGraphicFramePr>
+              <a:graphicFrameLocks xmlns:a="http://schemas.openxmlformats.org/drawingml/2006/main" noChangeAspect="1"/>
+            </wp:cNvGraphicFramePr>
+            <a:graphic xmlns:a="http://schemas.openxmlformats.org/drawingml/2006/main">
+              <a:graphicData uri="http://schemas.openxmlformats.org/drawingml/2006/picture">
+                <pic:pic xmlns:pic="http://schemas.openxmlformats.org/drawingml/2006/picture">
+                  <pic:nvPicPr>
+                    <pic:cNvPr id="0" name="" descr=""/>
+                    <pic:cNvPicPr>
+                      <a:picLocks noChangeAspect="1" noChangeArrowheads="1"/>
+                    </pic:cNvPicPr>
+                  </pic:nvPicPr>
+                  <pic:blipFill>
+                    <a:blip r:embed="rId9" cstate="none"/>
+                    <a:srcRect/>
+                    <a:stretch>
+                      <a:fillRect/>
+                    </a:stretch>
+                  </pic:blipFill>
+                  <pic:spPr bwMode="auto">
+                    <a:xfrm>
+                      <a:off x="0" y="0"/>
+                      <a:ext cx="762000" cy="762000"/>
+                    </a:xfrm>
+                    <a:prstGeom prst="rect">
+                      <a:avLst/>
+                    </a:prstGeom>
+                  </pic:spPr>
+                </pic:pic>
+              </a:graphicData>
+            </a:graphic>
+          </wp:anchor>
+        </w:drawing>
+      </w:r>
+      <w:r>
+        <w:drawing>
+          <wp:anchor distT="0" distB="0" distL="0" distR="0" simplePos="0" allowOverlap="1" behindDoc="0" locked="0" layoutInCell="1" relativeHeight="723900">
+            <wp:simplePos x="0" y="0"/>
+            <wp:positionH relativeFrom="page">
+              <wp:posOffset>9216000</wp:posOffset>
+            </wp:positionH>
+            <wp:positionV relativeFrom="page">
+              <wp:posOffset>6480000</wp:posOffset>
+            </wp:positionV>
+            <wp:extent cx="723900" cy="723900"/>
+            <wp:effectExtent t="0" r="0" b="0" l="0"/>
+            <wp:wrapNone/>
+            <wp:docPr id="1" name="" descr="" title=""/>
+            <wp:cNvGraphicFramePr>
+              <a:graphicFrameLocks xmlns:a="http://schemas.openxmlformats.org/drawingml/2006/main" noChangeAspect="1"/>
+            </wp:cNvGraphicFramePr>
+            <a:graphic xmlns:a="http://schemas.openxmlformats.org/drawingml/2006/main">
+              <a:graphicData uri="http://schemas.openxmlformats.org/drawingml/2006/picture">
+                <pic:pic xmlns:pic="http://schemas.openxmlformats.org/drawingml/2006/picture">
+                  <pic:nvPicPr>
+                    <pic:cNvPr id="0" name="" descr=""/>
+                    <pic:cNvPicPr>
+                      <a:picLocks noChangeAspect="1" noChangeArrowheads="1"/>
+                    </pic:cNvPicPr>
+                  </pic:nvPicPr>
+                  <pic:blipFill>
+                    <a:blip r:embed="rId10" cstate="none"/>
+                    <a:srcRect/>
+                    <a:stretch>
+                      <a:fillRect/>
+                    </a:stretch>
+                  </pic:blipFill>
+                  <pic:spPr bwMode="auto">
+                    <a:xfrm>
+                      <a:off x="0" y="0"/>
+                      <a:ext cx="723900" cy="723900"/>
+                    </a:xfrm>
+                    <a:prstGeom prst="rect">
+                      <a:avLst/>
+                    </a:prstGeom>
+                  </pic:spPr>
+                </pic:pic>
+              </a:graphicData>
+            </a:graphic>
+          </wp:anchor>
+        </w:drawing>
+      </w:r>
+      <w:r>
         <w:rPr>
           <w:rFonts w:ascii="Arial Narrow" w:cs="Arial Narrow" w:eastAsia="Arial Narrow" w:hAnsi="Arial Narrow"/>
           <w:b/>
@@ -9157,6 +10309,102 @@
         <w:spacing w:after="60"/>
         <w:jc w:val="center"/>
       </w:pPr>
+      <w:r>
+        <w:drawing>
+          <wp:anchor distT="0" distB="0" distL="0" distR="0" simplePos="0" allowOverlap="1" behindDoc="0" locked="0" layoutInCell="1" relativeHeight="762000">
+            <wp:simplePos x="0" y="0"/>
+            <wp:positionH relativeFrom="page">
+              <wp:posOffset>493200</wp:posOffset>
+            </wp:positionH>
+            <wp:positionV relativeFrom="page">
+              <wp:posOffset>6444000</wp:posOffset>
+            </wp:positionV>
+            <wp:extent cx="762000" cy="762000"/>
+            <wp:effectExtent t="0" r="0" b="0" l="0"/>
+            <wp:wrapNone/>
+            <wp:docPr id="1" name="" descr="" title=""/>
+            <wp:cNvGraphicFramePr>
+              <a:graphicFrameLocks xmlns:a="http://schemas.openxmlformats.org/drawingml/2006/main" noChangeAspect="1"/>
+            </wp:cNvGraphicFramePr>
+            <a:graphic xmlns:a="http://schemas.openxmlformats.org/drawingml/2006/main">
+              <a:graphicData uri="http://schemas.openxmlformats.org/drawingml/2006/picture">
+                <pic:pic xmlns:pic="http://schemas.openxmlformats.org/drawingml/2006/picture">
+                  <pic:nvPicPr>
+                    <pic:cNvPr id="0" name="" descr=""/>
+                    <pic:cNvPicPr>
+                      <a:picLocks noChangeAspect="1" noChangeArrowheads="1"/>
+                    </pic:cNvPicPr>
+                  </pic:nvPicPr>
+                  <pic:blipFill>
+                    <a:blip r:embed="rId9" cstate="none"/>
+                    <a:srcRect/>
+                    <a:stretch>
+                      <a:fillRect/>
+                    </a:stretch>
+                  </pic:blipFill>
+                  <pic:spPr bwMode="auto">
+                    <a:xfrm>
+                      <a:off x="0" y="0"/>
+                      <a:ext cx="762000" cy="762000"/>
+                    </a:xfrm>
+                    <a:prstGeom prst="rect">
+                      <a:avLst/>
+                    </a:prstGeom>
+                  </pic:spPr>
+                </pic:pic>
+              </a:graphicData>
+            </a:graphic>
+          </wp:anchor>
+        </w:drawing>
+      </w:r>
+      <w:r>
+        <w:drawing>
+          <wp:anchor distT="0" distB="0" distL="0" distR="0" simplePos="0" allowOverlap="1" behindDoc="0" locked="0" layoutInCell="1" relativeHeight="723900">
+            <wp:simplePos x="0" y="0"/>
+            <wp:positionH relativeFrom="page">
+              <wp:posOffset>9216000</wp:posOffset>
+            </wp:positionH>
+            <wp:positionV relativeFrom="page">
+              <wp:posOffset>6480000</wp:posOffset>
+            </wp:positionV>
+            <wp:extent cx="723900" cy="723900"/>
+            <wp:effectExtent t="0" r="0" b="0" l="0"/>
+            <wp:wrapNone/>
+            <wp:docPr id="1" name="" descr="" title=""/>
+            <wp:cNvGraphicFramePr>
+              <a:graphicFrameLocks xmlns:a="http://schemas.openxmlformats.org/drawingml/2006/main" noChangeAspect="1"/>
+            </wp:cNvGraphicFramePr>
+            <a:graphic xmlns:a="http://schemas.openxmlformats.org/drawingml/2006/main">
+              <a:graphicData uri="http://schemas.openxmlformats.org/drawingml/2006/picture">
+                <pic:pic xmlns:pic="http://schemas.openxmlformats.org/drawingml/2006/picture">
+                  <pic:nvPicPr>
+                    <pic:cNvPr id="0" name="" descr=""/>
+                    <pic:cNvPicPr>
+                      <a:picLocks noChangeAspect="1" noChangeArrowheads="1"/>
+                    </pic:cNvPicPr>
+                  </pic:nvPicPr>
+                  <pic:blipFill>
+                    <a:blip r:embed="rId10" cstate="none"/>
+                    <a:srcRect/>
+                    <a:stretch>
+                      <a:fillRect/>
+                    </a:stretch>
+                  </pic:blipFill>
+                  <pic:spPr bwMode="auto">
+                    <a:xfrm>
+                      <a:off x="0" y="0"/>
+                      <a:ext cx="723900" cy="723900"/>
+                    </a:xfrm>
+                    <a:prstGeom prst="rect">
+                      <a:avLst/>
+                    </a:prstGeom>
+                  </pic:spPr>
+                </pic:pic>
+              </a:graphicData>
+            </a:graphic>
+          </wp:anchor>
+        </w:drawing>
+      </w:r>
       <w:r>
         <w:rPr>
           <w:rFonts w:ascii="Arial Narrow" w:cs="Arial Narrow" w:eastAsia="Arial Narrow" w:hAnsi="Arial Narrow"/>
@@ -9908,6 +11156,102 @@
         <w:jc w:val="center"/>
       </w:pPr>
       <w:r>
+        <w:drawing>
+          <wp:anchor distT="0" distB="0" distL="0" distR="0" simplePos="0" allowOverlap="1" behindDoc="0" locked="0" layoutInCell="1" relativeHeight="762000">
+            <wp:simplePos x="0" y="0"/>
+            <wp:positionH relativeFrom="page">
+              <wp:posOffset>493200</wp:posOffset>
+            </wp:positionH>
+            <wp:positionV relativeFrom="page">
+              <wp:posOffset>6444000</wp:posOffset>
+            </wp:positionV>
+            <wp:extent cx="762000" cy="762000"/>
+            <wp:effectExtent t="0" r="0" b="0" l="0"/>
+            <wp:wrapNone/>
+            <wp:docPr id="1" name="" descr="" title=""/>
+            <wp:cNvGraphicFramePr>
+              <a:graphicFrameLocks xmlns:a="http://schemas.openxmlformats.org/drawingml/2006/main" noChangeAspect="1"/>
+            </wp:cNvGraphicFramePr>
+            <a:graphic xmlns:a="http://schemas.openxmlformats.org/drawingml/2006/main">
+              <a:graphicData uri="http://schemas.openxmlformats.org/drawingml/2006/picture">
+                <pic:pic xmlns:pic="http://schemas.openxmlformats.org/drawingml/2006/picture">
+                  <pic:nvPicPr>
+                    <pic:cNvPr id="0" name="" descr=""/>
+                    <pic:cNvPicPr>
+                      <a:picLocks noChangeAspect="1" noChangeArrowheads="1"/>
+                    </pic:cNvPicPr>
+                  </pic:nvPicPr>
+                  <pic:blipFill>
+                    <a:blip r:embed="rId9" cstate="none"/>
+                    <a:srcRect/>
+                    <a:stretch>
+                      <a:fillRect/>
+                    </a:stretch>
+                  </pic:blipFill>
+                  <pic:spPr bwMode="auto">
+                    <a:xfrm>
+                      <a:off x="0" y="0"/>
+                      <a:ext cx="762000" cy="762000"/>
+                    </a:xfrm>
+                    <a:prstGeom prst="rect">
+                      <a:avLst/>
+                    </a:prstGeom>
+                  </pic:spPr>
+                </pic:pic>
+              </a:graphicData>
+            </a:graphic>
+          </wp:anchor>
+        </w:drawing>
+      </w:r>
+      <w:r>
+        <w:drawing>
+          <wp:anchor distT="0" distB="0" distL="0" distR="0" simplePos="0" allowOverlap="1" behindDoc="0" locked="0" layoutInCell="1" relativeHeight="723900">
+            <wp:simplePos x="0" y="0"/>
+            <wp:positionH relativeFrom="page">
+              <wp:posOffset>9216000</wp:posOffset>
+            </wp:positionH>
+            <wp:positionV relativeFrom="page">
+              <wp:posOffset>6480000</wp:posOffset>
+            </wp:positionV>
+            <wp:extent cx="723900" cy="723900"/>
+            <wp:effectExtent t="0" r="0" b="0" l="0"/>
+            <wp:wrapNone/>
+            <wp:docPr id="1" name="" descr="" title=""/>
+            <wp:cNvGraphicFramePr>
+              <a:graphicFrameLocks xmlns:a="http://schemas.openxmlformats.org/drawingml/2006/main" noChangeAspect="1"/>
+            </wp:cNvGraphicFramePr>
+            <a:graphic xmlns:a="http://schemas.openxmlformats.org/drawingml/2006/main">
+              <a:graphicData uri="http://schemas.openxmlformats.org/drawingml/2006/picture">
+                <pic:pic xmlns:pic="http://schemas.openxmlformats.org/drawingml/2006/picture">
+                  <pic:nvPicPr>
+                    <pic:cNvPr id="0" name="" descr=""/>
+                    <pic:cNvPicPr>
+                      <a:picLocks noChangeAspect="1" noChangeArrowheads="1"/>
+                    </pic:cNvPicPr>
+                  </pic:nvPicPr>
+                  <pic:blipFill>
+                    <a:blip r:embed="rId10" cstate="none"/>
+                    <a:srcRect/>
+                    <a:stretch>
+                      <a:fillRect/>
+                    </a:stretch>
+                  </pic:blipFill>
+                  <pic:spPr bwMode="auto">
+                    <a:xfrm>
+                      <a:off x="0" y="0"/>
+                      <a:ext cx="723900" cy="723900"/>
+                    </a:xfrm>
+                    <a:prstGeom prst="rect">
+                      <a:avLst/>
+                    </a:prstGeom>
+                  </pic:spPr>
+                </pic:pic>
+              </a:graphicData>
+            </a:graphic>
+          </wp:anchor>
+        </w:drawing>
+      </w:r>
+      <w:r>
         <w:rPr>
           <w:rFonts w:ascii="Arial Narrow" w:cs="Arial Narrow" w:eastAsia="Arial Narrow" w:hAnsi="Arial Narrow"/>
           <w:b/>
@@ -10677,6 +12021,102 @@
         <w:spacing w:after="60"/>
         <w:jc w:val="center"/>
       </w:pPr>
+      <w:r>
+        <w:drawing>
+          <wp:anchor distT="0" distB="0" distL="0" distR="0" simplePos="0" allowOverlap="1" behindDoc="0" locked="0" layoutInCell="1" relativeHeight="762000">
+            <wp:simplePos x="0" y="0"/>
+            <wp:positionH relativeFrom="page">
+              <wp:posOffset>493200</wp:posOffset>
+            </wp:positionH>
+            <wp:positionV relativeFrom="page">
+              <wp:posOffset>6444000</wp:posOffset>
+            </wp:positionV>
+            <wp:extent cx="762000" cy="762000"/>
+            <wp:effectExtent t="0" r="0" b="0" l="0"/>
+            <wp:wrapNone/>
+            <wp:docPr id="1" name="" descr="" title=""/>
+            <wp:cNvGraphicFramePr>
+              <a:graphicFrameLocks xmlns:a="http://schemas.openxmlformats.org/drawingml/2006/main" noChangeAspect="1"/>
+            </wp:cNvGraphicFramePr>
+            <a:graphic xmlns:a="http://schemas.openxmlformats.org/drawingml/2006/main">
+              <a:graphicData uri="http://schemas.openxmlformats.org/drawingml/2006/picture">
+                <pic:pic xmlns:pic="http://schemas.openxmlformats.org/drawingml/2006/picture">
+                  <pic:nvPicPr>
+                    <pic:cNvPr id="0" name="" descr=""/>
+                    <pic:cNvPicPr>
+                      <a:picLocks noChangeAspect="1" noChangeArrowheads="1"/>
+                    </pic:cNvPicPr>
+                  </pic:nvPicPr>
+                  <pic:blipFill>
+                    <a:blip r:embed="rId9" cstate="none"/>
+                    <a:srcRect/>
+                    <a:stretch>
+                      <a:fillRect/>
+                    </a:stretch>
+                  </pic:blipFill>
+                  <pic:spPr bwMode="auto">
+                    <a:xfrm>
+                      <a:off x="0" y="0"/>
+                      <a:ext cx="762000" cy="762000"/>
+                    </a:xfrm>
+                    <a:prstGeom prst="rect">
+                      <a:avLst/>
+                    </a:prstGeom>
+                  </pic:spPr>
+                </pic:pic>
+              </a:graphicData>
+            </a:graphic>
+          </wp:anchor>
+        </w:drawing>
+      </w:r>
+      <w:r>
+        <w:drawing>
+          <wp:anchor distT="0" distB="0" distL="0" distR="0" simplePos="0" allowOverlap="1" behindDoc="0" locked="0" layoutInCell="1" relativeHeight="723900">
+            <wp:simplePos x="0" y="0"/>
+            <wp:positionH relativeFrom="page">
+              <wp:posOffset>9216000</wp:posOffset>
+            </wp:positionH>
+            <wp:positionV relativeFrom="page">
+              <wp:posOffset>6480000</wp:posOffset>
+            </wp:positionV>
+            <wp:extent cx="723900" cy="723900"/>
+            <wp:effectExtent t="0" r="0" b="0" l="0"/>
+            <wp:wrapNone/>
+            <wp:docPr id="1" name="" descr="" title=""/>
+            <wp:cNvGraphicFramePr>
+              <a:graphicFrameLocks xmlns:a="http://schemas.openxmlformats.org/drawingml/2006/main" noChangeAspect="1"/>
+            </wp:cNvGraphicFramePr>
+            <a:graphic xmlns:a="http://schemas.openxmlformats.org/drawingml/2006/main">
+              <a:graphicData uri="http://schemas.openxmlformats.org/drawingml/2006/picture">
+                <pic:pic xmlns:pic="http://schemas.openxmlformats.org/drawingml/2006/picture">
+                  <pic:nvPicPr>
+                    <pic:cNvPr id="0" name="" descr=""/>
+                    <pic:cNvPicPr>
+                      <a:picLocks noChangeAspect="1" noChangeArrowheads="1"/>
+                    </pic:cNvPicPr>
+                  </pic:nvPicPr>
+                  <pic:blipFill>
+                    <a:blip r:embed="rId10" cstate="none"/>
+                    <a:srcRect/>
+                    <a:stretch>
+                      <a:fillRect/>
+                    </a:stretch>
+                  </pic:blipFill>
+                  <pic:spPr bwMode="auto">
+                    <a:xfrm>
+                      <a:off x="0" y="0"/>
+                      <a:ext cx="723900" cy="723900"/>
+                    </a:xfrm>
+                    <a:prstGeom prst="rect">
+                      <a:avLst/>
+                    </a:prstGeom>
+                  </pic:spPr>
+                </pic:pic>
+              </a:graphicData>
+            </a:graphic>
+          </wp:anchor>
+        </w:drawing>
+      </w:r>
       <w:r>
         <w:rPr>
           <w:rFonts w:ascii="Arial Narrow" w:cs="Arial Narrow" w:eastAsia="Arial Narrow" w:hAnsi="Arial Narrow"/>
@@ -11601,6 +13041,102 @@
         <w:jc w:val="center"/>
       </w:pPr>
       <w:r>
+        <w:drawing>
+          <wp:anchor distT="0" distB="0" distL="0" distR="0" simplePos="0" allowOverlap="1" behindDoc="0" locked="0" layoutInCell="1" relativeHeight="762000">
+            <wp:simplePos x="0" y="0"/>
+            <wp:positionH relativeFrom="page">
+              <wp:posOffset>493200</wp:posOffset>
+            </wp:positionH>
+            <wp:positionV relativeFrom="page">
+              <wp:posOffset>6444000</wp:posOffset>
+            </wp:positionV>
+            <wp:extent cx="762000" cy="762000"/>
+            <wp:effectExtent t="0" r="0" b="0" l="0"/>
+            <wp:wrapNone/>
+            <wp:docPr id="1" name="" descr="" title=""/>
+            <wp:cNvGraphicFramePr>
+              <a:graphicFrameLocks xmlns:a="http://schemas.openxmlformats.org/drawingml/2006/main" noChangeAspect="1"/>
+            </wp:cNvGraphicFramePr>
+            <a:graphic xmlns:a="http://schemas.openxmlformats.org/drawingml/2006/main">
+              <a:graphicData uri="http://schemas.openxmlformats.org/drawingml/2006/picture">
+                <pic:pic xmlns:pic="http://schemas.openxmlformats.org/drawingml/2006/picture">
+                  <pic:nvPicPr>
+                    <pic:cNvPr id="0" name="" descr=""/>
+                    <pic:cNvPicPr>
+                      <a:picLocks noChangeAspect="1" noChangeArrowheads="1"/>
+                    </pic:cNvPicPr>
+                  </pic:nvPicPr>
+                  <pic:blipFill>
+                    <a:blip r:embed="rId9" cstate="none"/>
+                    <a:srcRect/>
+                    <a:stretch>
+                      <a:fillRect/>
+                    </a:stretch>
+                  </pic:blipFill>
+                  <pic:spPr bwMode="auto">
+                    <a:xfrm>
+                      <a:off x="0" y="0"/>
+                      <a:ext cx="762000" cy="762000"/>
+                    </a:xfrm>
+                    <a:prstGeom prst="rect">
+                      <a:avLst/>
+                    </a:prstGeom>
+                  </pic:spPr>
+                </pic:pic>
+              </a:graphicData>
+            </a:graphic>
+          </wp:anchor>
+        </w:drawing>
+      </w:r>
+      <w:r>
+        <w:drawing>
+          <wp:anchor distT="0" distB="0" distL="0" distR="0" simplePos="0" allowOverlap="1" behindDoc="0" locked="0" layoutInCell="1" relativeHeight="723900">
+            <wp:simplePos x="0" y="0"/>
+            <wp:positionH relativeFrom="page">
+              <wp:posOffset>9216000</wp:posOffset>
+            </wp:positionH>
+            <wp:positionV relativeFrom="page">
+              <wp:posOffset>6480000</wp:posOffset>
+            </wp:positionV>
+            <wp:extent cx="723900" cy="723900"/>
+            <wp:effectExtent t="0" r="0" b="0" l="0"/>
+            <wp:wrapNone/>
+            <wp:docPr id="1" name="" descr="" title=""/>
+            <wp:cNvGraphicFramePr>
+              <a:graphicFrameLocks xmlns:a="http://schemas.openxmlformats.org/drawingml/2006/main" noChangeAspect="1"/>
+            </wp:cNvGraphicFramePr>
+            <a:graphic xmlns:a="http://schemas.openxmlformats.org/drawingml/2006/main">
+              <a:graphicData uri="http://schemas.openxmlformats.org/drawingml/2006/picture">
+                <pic:pic xmlns:pic="http://schemas.openxmlformats.org/drawingml/2006/picture">
+                  <pic:nvPicPr>
+                    <pic:cNvPr id="0" name="" descr=""/>
+                    <pic:cNvPicPr>
+                      <a:picLocks noChangeAspect="1" noChangeArrowheads="1"/>
+                    </pic:cNvPicPr>
+                  </pic:nvPicPr>
+                  <pic:blipFill>
+                    <a:blip r:embed="rId10" cstate="none"/>
+                    <a:srcRect/>
+                    <a:stretch>
+                      <a:fillRect/>
+                    </a:stretch>
+                  </pic:blipFill>
+                  <pic:spPr bwMode="auto">
+                    <a:xfrm>
+                      <a:off x="0" y="0"/>
+                      <a:ext cx="723900" cy="723900"/>
+                    </a:xfrm>
+                    <a:prstGeom prst="rect">
+                      <a:avLst/>
+                    </a:prstGeom>
+                  </pic:spPr>
+                </pic:pic>
+              </a:graphicData>
+            </a:graphic>
+          </wp:anchor>
+        </w:drawing>
+      </w:r>
+      <w:r>
         <w:rPr>
           <w:rFonts w:ascii="Arial Narrow" w:cs="Arial Narrow" w:eastAsia="Arial Narrow" w:hAnsi="Arial Narrow"/>
           <w:b/>
@@ -12365,6 +13901,102 @@
         <w:spacing w:after="60"/>
         <w:jc w:val="center"/>
       </w:pPr>
+      <w:r>
+        <w:drawing>
+          <wp:anchor distT="0" distB="0" distL="0" distR="0" simplePos="0" allowOverlap="1" behindDoc="0" locked="0" layoutInCell="1" relativeHeight="762000">
+            <wp:simplePos x="0" y="0"/>
+            <wp:positionH relativeFrom="page">
+              <wp:posOffset>493200</wp:posOffset>
+            </wp:positionH>
+            <wp:positionV relativeFrom="page">
+              <wp:posOffset>6444000</wp:posOffset>
+            </wp:positionV>
+            <wp:extent cx="762000" cy="762000"/>
+            <wp:effectExtent t="0" r="0" b="0" l="0"/>
+            <wp:wrapNone/>
+            <wp:docPr id="1" name="" descr="" title=""/>
+            <wp:cNvGraphicFramePr>
+              <a:graphicFrameLocks xmlns:a="http://schemas.openxmlformats.org/drawingml/2006/main" noChangeAspect="1"/>
+            </wp:cNvGraphicFramePr>
+            <a:graphic xmlns:a="http://schemas.openxmlformats.org/drawingml/2006/main">
+              <a:graphicData uri="http://schemas.openxmlformats.org/drawingml/2006/picture">
+                <pic:pic xmlns:pic="http://schemas.openxmlformats.org/drawingml/2006/picture">
+                  <pic:nvPicPr>
+                    <pic:cNvPr id="0" name="" descr=""/>
+                    <pic:cNvPicPr>
+                      <a:picLocks noChangeAspect="1" noChangeArrowheads="1"/>
+                    </pic:cNvPicPr>
+                  </pic:nvPicPr>
+                  <pic:blipFill>
+                    <a:blip r:embed="rId9" cstate="none"/>
+                    <a:srcRect/>
+                    <a:stretch>
+                      <a:fillRect/>
+                    </a:stretch>
+                  </pic:blipFill>
+                  <pic:spPr bwMode="auto">
+                    <a:xfrm>
+                      <a:off x="0" y="0"/>
+                      <a:ext cx="762000" cy="762000"/>
+                    </a:xfrm>
+                    <a:prstGeom prst="rect">
+                      <a:avLst/>
+                    </a:prstGeom>
+                  </pic:spPr>
+                </pic:pic>
+              </a:graphicData>
+            </a:graphic>
+          </wp:anchor>
+        </w:drawing>
+      </w:r>
+      <w:r>
+        <w:drawing>
+          <wp:anchor distT="0" distB="0" distL="0" distR="0" simplePos="0" allowOverlap="1" behindDoc="0" locked="0" layoutInCell="1" relativeHeight="723900">
+            <wp:simplePos x="0" y="0"/>
+            <wp:positionH relativeFrom="page">
+              <wp:posOffset>9216000</wp:posOffset>
+            </wp:positionH>
+            <wp:positionV relativeFrom="page">
+              <wp:posOffset>6480000</wp:posOffset>
+            </wp:positionV>
+            <wp:extent cx="723900" cy="723900"/>
+            <wp:effectExtent t="0" r="0" b="0" l="0"/>
+            <wp:wrapNone/>
+            <wp:docPr id="1" name="" descr="" title=""/>
+            <wp:cNvGraphicFramePr>
+              <a:graphicFrameLocks xmlns:a="http://schemas.openxmlformats.org/drawingml/2006/main" noChangeAspect="1"/>
+            </wp:cNvGraphicFramePr>
+            <a:graphic xmlns:a="http://schemas.openxmlformats.org/drawingml/2006/main">
+              <a:graphicData uri="http://schemas.openxmlformats.org/drawingml/2006/picture">
+                <pic:pic xmlns:pic="http://schemas.openxmlformats.org/drawingml/2006/picture">
+                  <pic:nvPicPr>
+                    <pic:cNvPr id="0" name="" descr=""/>
+                    <pic:cNvPicPr>
+                      <a:picLocks noChangeAspect="1" noChangeArrowheads="1"/>
+                    </pic:cNvPicPr>
+                  </pic:nvPicPr>
+                  <pic:blipFill>
+                    <a:blip r:embed="rId10" cstate="none"/>
+                    <a:srcRect/>
+                    <a:stretch>
+                      <a:fillRect/>
+                    </a:stretch>
+                  </pic:blipFill>
+                  <pic:spPr bwMode="auto">
+                    <a:xfrm>
+                      <a:off x="0" y="0"/>
+                      <a:ext cx="723900" cy="723900"/>
+                    </a:xfrm>
+                    <a:prstGeom prst="rect">
+                      <a:avLst/>
+                    </a:prstGeom>
+                  </pic:spPr>
+                </pic:pic>
+              </a:graphicData>
+            </a:graphic>
+          </wp:anchor>
+        </w:drawing>
+      </w:r>
       <w:r>
         <w:rPr>
           <w:rFonts w:ascii="Arial Narrow" w:cs="Arial Narrow" w:eastAsia="Arial Narrow" w:hAnsi="Arial Narrow"/>
@@ -13095,6 +14727,102 @@
         <w:jc w:val="center"/>
       </w:pPr>
       <w:r>
+        <w:drawing>
+          <wp:anchor distT="0" distB="0" distL="0" distR="0" simplePos="0" allowOverlap="1" behindDoc="0" locked="0" layoutInCell="1" relativeHeight="762000">
+            <wp:simplePos x="0" y="0"/>
+            <wp:positionH relativeFrom="page">
+              <wp:posOffset>493200</wp:posOffset>
+            </wp:positionH>
+            <wp:positionV relativeFrom="page">
+              <wp:posOffset>6444000</wp:posOffset>
+            </wp:positionV>
+            <wp:extent cx="762000" cy="762000"/>
+            <wp:effectExtent t="0" r="0" b="0" l="0"/>
+            <wp:wrapNone/>
+            <wp:docPr id="1" name="" descr="" title=""/>
+            <wp:cNvGraphicFramePr>
+              <a:graphicFrameLocks xmlns:a="http://schemas.openxmlformats.org/drawingml/2006/main" noChangeAspect="1"/>
+            </wp:cNvGraphicFramePr>
+            <a:graphic xmlns:a="http://schemas.openxmlformats.org/drawingml/2006/main">
+              <a:graphicData uri="http://schemas.openxmlformats.org/drawingml/2006/picture">
+                <pic:pic xmlns:pic="http://schemas.openxmlformats.org/drawingml/2006/picture">
+                  <pic:nvPicPr>
+                    <pic:cNvPr id="0" name="" descr=""/>
+                    <pic:cNvPicPr>
+                      <a:picLocks noChangeAspect="1" noChangeArrowheads="1"/>
+                    </pic:cNvPicPr>
+                  </pic:nvPicPr>
+                  <pic:blipFill>
+                    <a:blip r:embed="rId9" cstate="none"/>
+                    <a:srcRect/>
+                    <a:stretch>
+                      <a:fillRect/>
+                    </a:stretch>
+                  </pic:blipFill>
+                  <pic:spPr bwMode="auto">
+                    <a:xfrm>
+                      <a:off x="0" y="0"/>
+                      <a:ext cx="762000" cy="762000"/>
+                    </a:xfrm>
+                    <a:prstGeom prst="rect">
+                      <a:avLst/>
+                    </a:prstGeom>
+                  </pic:spPr>
+                </pic:pic>
+              </a:graphicData>
+            </a:graphic>
+          </wp:anchor>
+        </w:drawing>
+      </w:r>
+      <w:r>
+        <w:drawing>
+          <wp:anchor distT="0" distB="0" distL="0" distR="0" simplePos="0" allowOverlap="1" behindDoc="0" locked="0" layoutInCell="1" relativeHeight="723900">
+            <wp:simplePos x="0" y="0"/>
+            <wp:positionH relativeFrom="page">
+              <wp:posOffset>9216000</wp:posOffset>
+            </wp:positionH>
+            <wp:positionV relativeFrom="page">
+              <wp:posOffset>6480000</wp:posOffset>
+            </wp:positionV>
+            <wp:extent cx="723900" cy="723900"/>
+            <wp:effectExtent t="0" r="0" b="0" l="0"/>
+            <wp:wrapNone/>
+            <wp:docPr id="1" name="" descr="" title=""/>
+            <wp:cNvGraphicFramePr>
+              <a:graphicFrameLocks xmlns:a="http://schemas.openxmlformats.org/drawingml/2006/main" noChangeAspect="1"/>
+            </wp:cNvGraphicFramePr>
+            <a:graphic xmlns:a="http://schemas.openxmlformats.org/drawingml/2006/main">
+              <a:graphicData uri="http://schemas.openxmlformats.org/drawingml/2006/picture">
+                <pic:pic xmlns:pic="http://schemas.openxmlformats.org/drawingml/2006/picture">
+                  <pic:nvPicPr>
+                    <pic:cNvPr id="0" name="" descr=""/>
+                    <pic:cNvPicPr>
+                      <a:picLocks noChangeAspect="1" noChangeArrowheads="1"/>
+                    </pic:cNvPicPr>
+                  </pic:nvPicPr>
+                  <pic:blipFill>
+                    <a:blip r:embed="rId10" cstate="none"/>
+                    <a:srcRect/>
+                    <a:stretch>
+                      <a:fillRect/>
+                    </a:stretch>
+                  </pic:blipFill>
+                  <pic:spPr bwMode="auto">
+                    <a:xfrm>
+                      <a:off x="0" y="0"/>
+                      <a:ext cx="723900" cy="723900"/>
+                    </a:xfrm>
+                    <a:prstGeom prst="rect">
+                      <a:avLst/>
+                    </a:prstGeom>
+                  </pic:spPr>
+                </pic:pic>
+              </a:graphicData>
+            </a:graphic>
+          </wp:anchor>
+        </w:drawing>
+      </w:r>
+      <w:r>
         <w:rPr>
           <w:rFonts w:ascii="Arial Narrow" w:cs="Arial Narrow" w:eastAsia="Arial Narrow" w:hAnsi="Arial Narrow"/>
           <w:b/>
@@ -13900,6 +15628,102 @@
         <w:spacing w:after="60"/>
         <w:jc w:val="center"/>
       </w:pPr>
+      <w:r>
+        <w:drawing>
+          <wp:anchor distT="0" distB="0" distL="0" distR="0" simplePos="0" allowOverlap="1" behindDoc="0" locked="0" layoutInCell="1" relativeHeight="762000">
+            <wp:simplePos x="0" y="0"/>
+            <wp:positionH relativeFrom="page">
+              <wp:posOffset>493200</wp:posOffset>
+            </wp:positionH>
+            <wp:positionV relativeFrom="page">
+              <wp:posOffset>6444000</wp:posOffset>
+            </wp:positionV>
+            <wp:extent cx="762000" cy="762000"/>
+            <wp:effectExtent t="0" r="0" b="0" l="0"/>
+            <wp:wrapNone/>
+            <wp:docPr id="1" name="" descr="" title=""/>
+            <wp:cNvGraphicFramePr>
+              <a:graphicFrameLocks xmlns:a="http://schemas.openxmlformats.org/drawingml/2006/main" noChangeAspect="1"/>
+            </wp:cNvGraphicFramePr>
+            <a:graphic xmlns:a="http://schemas.openxmlformats.org/drawingml/2006/main">
+              <a:graphicData uri="http://schemas.openxmlformats.org/drawingml/2006/picture">
+                <pic:pic xmlns:pic="http://schemas.openxmlformats.org/drawingml/2006/picture">
+                  <pic:nvPicPr>
+                    <pic:cNvPr id="0" name="" descr=""/>
+                    <pic:cNvPicPr>
+                      <a:picLocks noChangeAspect="1" noChangeArrowheads="1"/>
+                    </pic:cNvPicPr>
+                  </pic:nvPicPr>
+                  <pic:blipFill>
+                    <a:blip r:embed="rId9" cstate="none"/>
+                    <a:srcRect/>
+                    <a:stretch>
+                      <a:fillRect/>
+                    </a:stretch>
+                  </pic:blipFill>
+                  <pic:spPr bwMode="auto">
+                    <a:xfrm>
+                      <a:off x="0" y="0"/>
+                      <a:ext cx="762000" cy="762000"/>
+                    </a:xfrm>
+                    <a:prstGeom prst="rect">
+                      <a:avLst/>
+                    </a:prstGeom>
+                  </pic:spPr>
+                </pic:pic>
+              </a:graphicData>
+            </a:graphic>
+          </wp:anchor>
+        </w:drawing>
+      </w:r>
+      <w:r>
+        <w:drawing>
+          <wp:anchor distT="0" distB="0" distL="0" distR="0" simplePos="0" allowOverlap="1" behindDoc="0" locked="0" layoutInCell="1" relativeHeight="723900">
+            <wp:simplePos x="0" y="0"/>
+            <wp:positionH relativeFrom="page">
+              <wp:posOffset>9216000</wp:posOffset>
+            </wp:positionH>
+            <wp:positionV relativeFrom="page">
+              <wp:posOffset>6480000</wp:posOffset>
+            </wp:positionV>
+            <wp:extent cx="723900" cy="723900"/>
+            <wp:effectExtent t="0" r="0" b="0" l="0"/>
+            <wp:wrapNone/>
+            <wp:docPr id="1" name="" descr="" title=""/>
+            <wp:cNvGraphicFramePr>
+              <a:graphicFrameLocks xmlns:a="http://schemas.openxmlformats.org/drawingml/2006/main" noChangeAspect="1"/>
+            </wp:cNvGraphicFramePr>
+            <a:graphic xmlns:a="http://schemas.openxmlformats.org/drawingml/2006/main">
+              <a:graphicData uri="http://schemas.openxmlformats.org/drawingml/2006/picture">
+                <pic:pic xmlns:pic="http://schemas.openxmlformats.org/drawingml/2006/picture">
+                  <pic:nvPicPr>
+                    <pic:cNvPr id="0" name="" descr=""/>
+                    <pic:cNvPicPr>
+                      <a:picLocks noChangeAspect="1" noChangeArrowheads="1"/>
+                    </pic:cNvPicPr>
+                  </pic:nvPicPr>
+                  <pic:blipFill>
+                    <a:blip r:embed="rId10" cstate="none"/>
+                    <a:srcRect/>
+                    <a:stretch>
+                      <a:fillRect/>
+                    </a:stretch>
+                  </pic:blipFill>
+                  <pic:spPr bwMode="auto">
+                    <a:xfrm>
+                      <a:off x="0" y="0"/>
+                      <a:ext cx="723900" cy="723900"/>
+                    </a:xfrm>
+                    <a:prstGeom prst="rect">
+                      <a:avLst/>
+                    </a:prstGeom>
+                  </pic:spPr>
+                </pic:pic>
+              </a:graphicData>
+            </a:graphic>
+          </wp:anchor>
+        </w:drawing>
+      </w:r>
       <w:r>
         <w:rPr>
           <w:rFonts w:ascii="Arial Narrow" w:cs="Arial Narrow" w:eastAsia="Arial Narrow" w:hAnsi="Arial Narrow"/>
@@ -14560,6 +16384,102 @@
         <w:jc w:val="center"/>
       </w:pPr>
       <w:r>
+        <w:drawing>
+          <wp:anchor distT="0" distB="0" distL="0" distR="0" simplePos="0" allowOverlap="1" behindDoc="0" locked="0" layoutInCell="1" relativeHeight="762000">
+            <wp:simplePos x="0" y="0"/>
+            <wp:positionH relativeFrom="page">
+              <wp:posOffset>493200</wp:posOffset>
+            </wp:positionH>
+            <wp:positionV relativeFrom="page">
+              <wp:posOffset>6444000</wp:posOffset>
+            </wp:positionV>
+            <wp:extent cx="762000" cy="762000"/>
+            <wp:effectExtent t="0" r="0" b="0" l="0"/>
+            <wp:wrapNone/>
+            <wp:docPr id="1" name="" descr="" title=""/>
+            <wp:cNvGraphicFramePr>
+              <a:graphicFrameLocks xmlns:a="http://schemas.openxmlformats.org/drawingml/2006/main" noChangeAspect="1"/>
+            </wp:cNvGraphicFramePr>
+            <a:graphic xmlns:a="http://schemas.openxmlformats.org/drawingml/2006/main">
+              <a:graphicData uri="http://schemas.openxmlformats.org/drawingml/2006/picture">
+                <pic:pic xmlns:pic="http://schemas.openxmlformats.org/drawingml/2006/picture">
+                  <pic:nvPicPr>
+                    <pic:cNvPr id="0" name="" descr=""/>
+                    <pic:cNvPicPr>
+                      <a:picLocks noChangeAspect="1" noChangeArrowheads="1"/>
+                    </pic:cNvPicPr>
+                  </pic:nvPicPr>
+                  <pic:blipFill>
+                    <a:blip r:embed="rId9" cstate="none"/>
+                    <a:srcRect/>
+                    <a:stretch>
+                      <a:fillRect/>
+                    </a:stretch>
+                  </pic:blipFill>
+                  <pic:spPr bwMode="auto">
+                    <a:xfrm>
+                      <a:off x="0" y="0"/>
+                      <a:ext cx="762000" cy="762000"/>
+                    </a:xfrm>
+                    <a:prstGeom prst="rect">
+                      <a:avLst/>
+                    </a:prstGeom>
+                  </pic:spPr>
+                </pic:pic>
+              </a:graphicData>
+            </a:graphic>
+          </wp:anchor>
+        </w:drawing>
+      </w:r>
+      <w:r>
+        <w:drawing>
+          <wp:anchor distT="0" distB="0" distL="0" distR="0" simplePos="0" allowOverlap="1" behindDoc="0" locked="0" layoutInCell="1" relativeHeight="723900">
+            <wp:simplePos x="0" y="0"/>
+            <wp:positionH relativeFrom="page">
+              <wp:posOffset>9216000</wp:posOffset>
+            </wp:positionH>
+            <wp:positionV relativeFrom="page">
+              <wp:posOffset>6480000</wp:posOffset>
+            </wp:positionV>
+            <wp:extent cx="723900" cy="723900"/>
+            <wp:effectExtent t="0" r="0" b="0" l="0"/>
+            <wp:wrapNone/>
+            <wp:docPr id="1" name="" descr="" title=""/>
+            <wp:cNvGraphicFramePr>
+              <a:graphicFrameLocks xmlns:a="http://schemas.openxmlformats.org/drawingml/2006/main" noChangeAspect="1"/>
+            </wp:cNvGraphicFramePr>
+            <a:graphic xmlns:a="http://schemas.openxmlformats.org/drawingml/2006/main">
+              <a:graphicData uri="http://schemas.openxmlformats.org/drawingml/2006/picture">
+                <pic:pic xmlns:pic="http://schemas.openxmlformats.org/drawingml/2006/picture">
+                  <pic:nvPicPr>
+                    <pic:cNvPr id="0" name="" descr=""/>
+                    <pic:cNvPicPr>
+                      <a:picLocks noChangeAspect="1" noChangeArrowheads="1"/>
+                    </pic:cNvPicPr>
+                  </pic:nvPicPr>
+                  <pic:blipFill>
+                    <a:blip r:embed="rId10" cstate="none"/>
+                    <a:srcRect/>
+                    <a:stretch>
+                      <a:fillRect/>
+                    </a:stretch>
+                  </pic:blipFill>
+                  <pic:spPr bwMode="auto">
+                    <a:xfrm>
+                      <a:off x="0" y="0"/>
+                      <a:ext cx="723900" cy="723900"/>
+                    </a:xfrm>
+                    <a:prstGeom prst="rect">
+                      <a:avLst/>
+                    </a:prstGeom>
+                  </pic:spPr>
+                </pic:pic>
+              </a:graphicData>
+            </a:graphic>
+          </wp:anchor>
+        </w:drawing>
+      </w:r>
+      <w:r>
         <w:rPr>
           <w:rFonts w:ascii="Arial Narrow" w:cs="Arial Narrow" w:eastAsia="Arial Narrow" w:hAnsi="Arial Narrow"/>
           <w:b/>
@@ -15040,6 +16960,102 @@
         <w:spacing w:after="60"/>
         <w:jc w:val="center"/>
       </w:pPr>
+      <w:r>
+        <w:drawing>
+          <wp:anchor distT="0" distB="0" distL="0" distR="0" simplePos="0" allowOverlap="1" behindDoc="0" locked="0" layoutInCell="1" relativeHeight="762000">
+            <wp:simplePos x="0" y="0"/>
+            <wp:positionH relativeFrom="page">
+              <wp:posOffset>493200</wp:posOffset>
+            </wp:positionH>
+            <wp:positionV relativeFrom="page">
+              <wp:posOffset>6444000</wp:posOffset>
+            </wp:positionV>
+            <wp:extent cx="762000" cy="762000"/>
+            <wp:effectExtent t="0" r="0" b="0" l="0"/>
+            <wp:wrapNone/>
+            <wp:docPr id="1" name="" descr="" title=""/>
+            <wp:cNvGraphicFramePr>
+              <a:graphicFrameLocks xmlns:a="http://schemas.openxmlformats.org/drawingml/2006/main" noChangeAspect="1"/>
+            </wp:cNvGraphicFramePr>
+            <a:graphic xmlns:a="http://schemas.openxmlformats.org/drawingml/2006/main">
+              <a:graphicData uri="http://schemas.openxmlformats.org/drawingml/2006/picture">
+                <pic:pic xmlns:pic="http://schemas.openxmlformats.org/drawingml/2006/picture">
+                  <pic:nvPicPr>
+                    <pic:cNvPr id="0" name="" descr=""/>
+                    <pic:cNvPicPr>
+                      <a:picLocks noChangeAspect="1" noChangeArrowheads="1"/>
+                    </pic:cNvPicPr>
+                  </pic:nvPicPr>
+                  <pic:blipFill>
+                    <a:blip r:embed="rId9" cstate="none"/>
+                    <a:srcRect/>
+                    <a:stretch>
+                      <a:fillRect/>
+                    </a:stretch>
+                  </pic:blipFill>
+                  <pic:spPr bwMode="auto">
+                    <a:xfrm>
+                      <a:off x="0" y="0"/>
+                      <a:ext cx="762000" cy="762000"/>
+                    </a:xfrm>
+                    <a:prstGeom prst="rect">
+                      <a:avLst/>
+                    </a:prstGeom>
+                  </pic:spPr>
+                </pic:pic>
+              </a:graphicData>
+            </a:graphic>
+          </wp:anchor>
+        </w:drawing>
+      </w:r>
+      <w:r>
+        <w:drawing>
+          <wp:anchor distT="0" distB="0" distL="0" distR="0" simplePos="0" allowOverlap="1" behindDoc="0" locked="0" layoutInCell="1" relativeHeight="723900">
+            <wp:simplePos x="0" y="0"/>
+            <wp:positionH relativeFrom="page">
+              <wp:posOffset>9216000</wp:posOffset>
+            </wp:positionH>
+            <wp:positionV relativeFrom="page">
+              <wp:posOffset>6480000</wp:posOffset>
+            </wp:positionV>
+            <wp:extent cx="723900" cy="723900"/>
+            <wp:effectExtent t="0" r="0" b="0" l="0"/>
+            <wp:wrapNone/>
+            <wp:docPr id="1" name="" descr="" title=""/>
+            <wp:cNvGraphicFramePr>
+              <a:graphicFrameLocks xmlns:a="http://schemas.openxmlformats.org/drawingml/2006/main" noChangeAspect="1"/>
+            </wp:cNvGraphicFramePr>
+            <a:graphic xmlns:a="http://schemas.openxmlformats.org/drawingml/2006/main">
+              <a:graphicData uri="http://schemas.openxmlformats.org/drawingml/2006/picture">
+                <pic:pic xmlns:pic="http://schemas.openxmlformats.org/drawingml/2006/picture">
+                  <pic:nvPicPr>
+                    <pic:cNvPr id="0" name="" descr=""/>
+                    <pic:cNvPicPr>
+                      <a:picLocks noChangeAspect="1" noChangeArrowheads="1"/>
+                    </pic:cNvPicPr>
+                  </pic:nvPicPr>
+                  <pic:blipFill>
+                    <a:blip r:embed="rId10" cstate="none"/>
+                    <a:srcRect/>
+                    <a:stretch>
+                      <a:fillRect/>
+                    </a:stretch>
+                  </pic:blipFill>
+                  <pic:spPr bwMode="auto">
+                    <a:xfrm>
+                      <a:off x="0" y="0"/>
+                      <a:ext cx="723900" cy="723900"/>
+                    </a:xfrm>
+                    <a:prstGeom prst="rect">
+                      <a:avLst/>
+                    </a:prstGeom>
+                  </pic:spPr>
+                </pic:pic>
+              </a:graphicData>
+            </a:graphic>
+          </wp:anchor>
+        </w:drawing>
+      </w:r>
       <w:r>
         <w:rPr>
           <w:rFonts w:ascii="Arial Narrow" w:cs="Arial Narrow" w:eastAsia="Arial Narrow" w:hAnsi="Arial Narrow"/>
@@ -15590,6 +17606,102 @@
         <w:jc w:val="center"/>
       </w:pPr>
       <w:r>
+        <w:drawing>
+          <wp:anchor distT="0" distB="0" distL="0" distR="0" simplePos="0" allowOverlap="1" behindDoc="0" locked="0" layoutInCell="1" relativeHeight="762000">
+            <wp:simplePos x="0" y="0"/>
+            <wp:positionH relativeFrom="page">
+              <wp:posOffset>493200</wp:posOffset>
+            </wp:positionH>
+            <wp:positionV relativeFrom="page">
+              <wp:posOffset>6444000</wp:posOffset>
+            </wp:positionV>
+            <wp:extent cx="762000" cy="762000"/>
+            <wp:effectExtent t="0" r="0" b="0" l="0"/>
+            <wp:wrapNone/>
+            <wp:docPr id="1" name="" descr="" title=""/>
+            <wp:cNvGraphicFramePr>
+              <a:graphicFrameLocks xmlns:a="http://schemas.openxmlformats.org/drawingml/2006/main" noChangeAspect="1"/>
+            </wp:cNvGraphicFramePr>
+            <a:graphic xmlns:a="http://schemas.openxmlformats.org/drawingml/2006/main">
+              <a:graphicData uri="http://schemas.openxmlformats.org/drawingml/2006/picture">
+                <pic:pic xmlns:pic="http://schemas.openxmlformats.org/drawingml/2006/picture">
+                  <pic:nvPicPr>
+                    <pic:cNvPr id="0" name="" descr=""/>
+                    <pic:cNvPicPr>
+                      <a:picLocks noChangeAspect="1" noChangeArrowheads="1"/>
+                    </pic:cNvPicPr>
+                  </pic:nvPicPr>
+                  <pic:blipFill>
+                    <a:blip r:embed="rId9" cstate="none"/>
+                    <a:srcRect/>
+                    <a:stretch>
+                      <a:fillRect/>
+                    </a:stretch>
+                  </pic:blipFill>
+                  <pic:spPr bwMode="auto">
+                    <a:xfrm>
+                      <a:off x="0" y="0"/>
+                      <a:ext cx="762000" cy="762000"/>
+                    </a:xfrm>
+                    <a:prstGeom prst="rect">
+                      <a:avLst/>
+                    </a:prstGeom>
+                  </pic:spPr>
+                </pic:pic>
+              </a:graphicData>
+            </a:graphic>
+          </wp:anchor>
+        </w:drawing>
+      </w:r>
+      <w:r>
+        <w:drawing>
+          <wp:anchor distT="0" distB="0" distL="0" distR="0" simplePos="0" allowOverlap="1" behindDoc="0" locked="0" layoutInCell="1" relativeHeight="723900">
+            <wp:simplePos x="0" y="0"/>
+            <wp:positionH relativeFrom="page">
+              <wp:posOffset>9216000</wp:posOffset>
+            </wp:positionH>
+            <wp:positionV relativeFrom="page">
+              <wp:posOffset>6480000</wp:posOffset>
+            </wp:positionV>
+            <wp:extent cx="723900" cy="723900"/>
+            <wp:effectExtent t="0" r="0" b="0" l="0"/>
+            <wp:wrapNone/>
+            <wp:docPr id="1" name="" descr="" title=""/>
+            <wp:cNvGraphicFramePr>
+              <a:graphicFrameLocks xmlns:a="http://schemas.openxmlformats.org/drawingml/2006/main" noChangeAspect="1"/>
+            </wp:cNvGraphicFramePr>
+            <a:graphic xmlns:a="http://schemas.openxmlformats.org/drawingml/2006/main">
+              <a:graphicData uri="http://schemas.openxmlformats.org/drawingml/2006/picture">
+                <pic:pic xmlns:pic="http://schemas.openxmlformats.org/drawingml/2006/picture">
+                  <pic:nvPicPr>
+                    <pic:cNvPr id="0" name="" descr=""/>
+                    <pic:cNvPicPr>
+                      <a:picLocks noChangeAspect="1" noChangeArrowheads="1"/>
+                    </pic:cNvPicPr>
+                  </pic:nvPicPr>
+                  <pic:blipFill>
+                    <a:blip r:embed="rId10" cstate="none"/>
+                    <a:srcRect/>
+                    <a:stretch>
+                      <a:fillRect/>
+                    </a:stretch>
+                  </pic:blipFill>
+                  <pic:spPr bwMode="auto">
+                    <a:xfrm>
+                      <a:off x="0" y="0"/>
+                      <a:ext cx="723900" cy="723900"/>
+                    </a:xfrm>
+                    <a:prstGeom prst="rect">
+                      <a:avLst/>
+                    </a:prstGeom>
+                  </pic:spPr>
+                </pic:pic>
+              </a:graphicData>
+            </a:graphic>
+          </wp:anchor>
+        </w:drawing>
+      </w:r>
+      <w:r>
         <w:rPr>
           <w:rFonts w:ascii="Arial Narrow" w:cs="Arial Narrow" w:eastAsia="Arial Narrow" w:hAnsi="Arial Narrow"/>
           <w:b/>
@@ -16039,6 +18151,102 @@
         <w:jc w:val="center"/>
       </w:pPr>
       <w:r>
+        <w:drawing>
+          <wp:anchor distT="0" distB="0" distL="0" distR="0" simplePos="0" allowOverlap="1" behindDoc="0" locked="0" layoutInCell="1" relativeHeight="762000">
+            <wp:simplePos x="0" y="0"/>
+            <wp:positionH relativeFrom="page">
+              <wp:posOffset>493200</wp:posOffset>
+            </wp:positionH>
+            <wp:positionV relativeFrom="page">
+              <wp:posOffset>6444000</wp:posOffset>
+            </wp:positionV>
+            <wp:extent cx="762000" cy="762000"/>
+            <wp:effectExtent t="0" r="0" b="0" l="0"/>
+            <wp:wrapNone/>
+            <wp:docPr id="1" name="" descr="" title=""/>
+            <wp:cNvGraphicFramePr>
+              <a:graphicFrameLocks xmlns:a="http://schemas.openxmlformats.org/drawingml/2006/main" noChangeAspect="1"/>
+            </wp:cNvGraphicFramePr>
+            <a:graphic xmlns:a="http://schemas.openxmlformats.org/drawingml/2006/main">
+              <a:graphicData uri="http://schemas.openxmlformats.org/drawingml/2006/picture">
+                <pic:pic xmlns:pic="http://schemas.openxmlformats.org/drawingml/2006/picture">
+                  <pic:nvPicPr>
+                    <pic:cNvPr id="0" name="" descr=""/>
+                    <pic:cNvPicPr>
+                      <a:picLocks noChangeAspect="1" noChangeArrowheads="1"/>
+                    </pic:cNvPicPr>
+                  </pic:nvPicPr>
+                  <pic:blipFill>
+                    <a:blip r:embed="rId9" cstate="none"/>
+                    <a:srcRect/>
+                    <a:stretch>
+                      <a:fillRect/>
+                    </a:stretch>
+                  </pic:blipFill>
+                  <pic:spPr bwMode="auto">
+                    <a:xfrm>
+                      <a:off x="0" y="0"/>
+                      <a:ext cx="762000" cy="762000"/>
+                    </a:xfrm>
+                    <a:prstGeom prst="rect">
+                      <a:avLst/>
+                    </a:prstGeom>
+                  </pic:spPr>
+                </pic:pic>
+              </a:graphicData>
+            </a:graphic>
+          </wp:anchor>
+        </w:drawing>
+      </w:r>
+      <w:r>
+        <w:drawing>
+          <wp:anchor distT="0" distB="0" distL="0" distR="0" simplePos="0" allowOverlap="1" behindDoc="0" locked="0" layoutInCell="1" relativeHeight="723900">
+            <wp:simplePos x="0" y="0"/>
+            <wp:positionH relativeFrom="page">
+              <wp:posOffset>9216000</wp:posOffset>
+            </wp:positionH>
+            <wp:positionV relativeFrom="page">
+              <wp:posOffset>6480000</wp:posOffset>
+            </wp:positionV>
+            <wp:extent cx="723900" cy="723900"/>
+            <wp:effectExtent t="0" r="0" b="0" l="0"/>
+            <wp:wrapNone/>
+            <wp:docPr id="1" name="" descr="" title=""/>
+            <wp:cNvGraphicFramePr>
+              <a:graphicFrameLocks xmlns:a="http://schemas.openxmlformats.org/drawingml/2006/main" noChangeAspect="1"/>
+            </wp:cNvGraphicFramePr>
+            <a:graphic xmlns:a="http://schemas.openxmlformats.org/drawingml/2006/main">
+              <a:graphicData uri="http://schemas.openxmlformats.org/drawingml/2006/picture">
+                <pic:pic xmlns:pic="http://schemas.openxmlformats.org/drawingml/2006/picture">
+                  <pic:nvPicPr>
+                    <pic:cNvPr id="0" name="" descr=""/>
+                    <pic:cNvPicPr>
+                      <a:picLocks noChangeAspect="1" noChangeArrowheads="1"/>
+                    </pic:cNvPicPr>
+                  </pic:nvPicPr>
+                  <pic:blipFill>
+                    <a:blip r:embed="rId10" cstate="none"/>
+                    <a:srcRect/>
+                    <a:stretch>
+                      <a:fillRect/>
+                    </a:stretch>
+                  </pic:blipFill>
+                  <pic:spPr bwMode="auto">
+                    <a:xfrm>
+                      <a:off x="0" y="0"/>
+                      <a:ext cx="723900" cy="723900"/>
+                    </a:xfrm>
+                    <a:prstGeom prst="rect">
+                      <a:avLst/>
+                    </a:prstGeom>
+                  </pic:spPr>
+                </pic:pic>
+              </a:graphicData>
+            </a:graphic>
+          </wp:anchor>
+        </w:drawing>
+      </w:r>
+      <w:r>
         <w:rPr>
           <w:rFonts w:ascii="Arial Narrow" w:cs="Arial Narrow" w:eastAsia="Arial Narrow" w:hAnsi="Arial Narrow"/>
           <w:b/>
@@ -16367,6 +18575,102 @@
         <w:spacing w:after="360"/>
         <w:jc w:val="center"/>
       </w:pPr>
+      <w:r>
+        <w:drawing>
+          <wp:anchor distT="0" distB="0" distL="0" distR="0" simplePos="0" allowOverlap="1" behindDoc="0" locked="0" layoutInCell="1" relativeHeight="762000">
+            <wp:simplePos x="0" y="0"/>
+            <wp:positionH relativeFrom="page">
+              <wp:posOffset>493200</wp:posOffset>
+            </wp:positionH>
+            <wp:positionV relativeFrom="page">
+              <wp:posOffset>6444000</wp:posOffset>
+            </wp:positionV>
+            <wp:extent cx="762000" cy="762000"/>
+            <wp:effectExtent t="0" r="0" b="0" l="0"/>
+            <wp:wrapNone/>
+            <wp:docPr id="1" name="" descr="" title=""/>
+            <wp:cNvGraphicFramePr>
+              <a:graphicFrameLocks xmlns:a="http://schemas.openxmlformats.org/drawingml/2006/main" noChangeAspect="1"/>
+            </wp:cNvGraphicFramePr>
+            <a:graphic xmlns:a="http://schemas.openxmlformats.org/drawingml/2006/main">
+              <a:graphicData uri="http://schemas.openxmlformats.org/drawingml/2006/picture">
+                <pic:pic xmlns:pic="http://schemas.openxmlformats.org/drawingml/2006/picture">
+                  <pic:nvPicPr>
+                    <pic:cNvPr id="0" name="" descr=""/>
+                    <pic:cNvPicPr>
+                      <a:picLocks noChangeAspect="1" noChangeArrowheads="1"/>
+                    </pic:cNvPicPr>
+                  </pic:nvPicPr>
+                  <pic:blipFill>
+                    <a:blip r:embed="rId9" cstate="none"/>
+                    <a:srcRect/>
+                    <a:stretch>
+                      <a:fillRect/>
+                    </a:stretch>
+                  </pic:blipFill>
+                  <pic:spPr bwMode="auto">
+                    <a:xfrm>
+                      <a:off x="0" y="0"/>
+                      <a:ext cx="762000" cy="762000"/>
+                    </a:xfrm>
+                    <a:prstGeom prst="rect">
+                      <a:avLst/>
+                    </a:prstGeom>
+                  </pic:spPr>
+                </pic:pic>
+              </a:graphicData>
+            </a:graphic>
+          </wp:anchor>
+        </w:drawing>
+      </w:r>
+      <w:r>
+        <w:drawing>
+          <wp:anchor distT="0" distB="0" distL="0" distR="0" simplePos="0" allowOverlap="1" behindDoc="0" locked="0" layoutInCell="1" relativeHeight="723900">
+            <wp:simplePos x="0" y="0"/>
+            <wp:positionH relativeFrom="page">
+              <wp:posOffset>9216000</wp:posOffset>
+            </wp:positionH>
+            <wp:positionV relativeFrom="page">
+              <wp:posOffset>6480000</wp:posOffset>
+            </wp:positionV>
+            <wp:extent cx="723900" cy="723900"/>
+            <wp:effectExtent t="0" r="0" b="0" l="0"/>
+            <wp:wrapNone/>
+            <wp:docPr id="1" name="" descr="" title=""/>
+            <wp:cNvGraphicFramePr>
+              <a:graphicFrameLocks xmlns:a="http://schemas.openxmlformats.org/drawingml/2006/main" noChangeAspect="1"/>
+            </wp:cNvGraphicFramePr>
+            <a:graphic xmlns:a="http://schemas.openxmlformats.org/drawingml/2006/main">
+              <a:graphicData uri="http://schemas.openxmlformats.org/drawingml/2006/picture">
+                <pic:pic xmlns:pic="http://schemas.openxmlformats.org/drawingml/2006/picture">
+                  <pic:nvPicPr>
+                    <pic:cNvPr id="0" name="" descr=""/>
+                    <pic:cNvPicPr>
+                      <a:picLocks noChangeAspect="1" noChangeArrowheads="1"/>
+                    </pic:cNvPicPr>
+                  </pic:nvPicPr>
+                  <pic:blipFill>
+                    <a:blip r:embed="rId10" cstate="none"/>
+                    <a:srcRect/>
+                    <a:stretch>
+                      <a:fillRect/>
+                    </a:stretch>
+                  </pic:blipFill>
+                  <pic:spPr bwMode="auto">
+                    <a:xfrm>
+                      <a:off x="0" y="0"/>
+                      <a:ext cx="723900" cy="723900"/>
+                    </a:xfrm>
+                    <a:prstGeom prst="rect">
+                      <a:avLst/>
+                    </a:prstGeom>
+                  </pic:spPr>
+                </pic:pic>
+              </a:graphicData>
+            </a:graphic>
+          </wp:anchor>
+        </w:drawing>
+      </w:r>
       <w:r>
         <w:rPr>
           <w:rFonts w:ascii="Arial Narrow" w:cs="Arial Narrow" w:eastAsia="Arial Narrow" w:hAnsi="Arial Narrow"/>
@@ -16663,6 +18967,102 @@
         <w:jc w:val="center"/>
       </w:pPr>
       <w:r>
+        <w:drawing>
+          <wp:anchor distT="0" distB="0" distL="0" distR="0" simplePos="0" allowOverlap="1" behindDoc="0" locked="0" layoutInCell="1" relativeHeight="762000">
+            <wp:simplePos x="0" y="0"/>
+            <wp:positionH relativeFrom="page">
+              <wp:posOffset>493200</wp:posOffset>
+            </wp:positionH>
+            <wp:positionV relativeFrom="page">
+              <wp:posOffset>6444000</wp:posOffset>
+            </wp:positionV>
+            <wp:extent cx="762000" cy="762000"/>
+            <wp:effectExtent t="0" r="0" b="0" l="0"/>
+            <wp:wrapNone/>
+            <wp:docPr id="1" name="" descr="" title=""/>
+            <wp:cNvGraphicFramePr>
+              <a:graphicFrameLocks xmlns:a="http://schemas.openxmlformats.org/drawingml/2006/main" noChangeAspect="1"/>
+            </wp:cNvGraphicFramePr>
+            <a:graphic xmlns:a="http://schemas.openxmlformats.org/drawingml/2006/main">
+              <a:graphicData uri="http://schemas.openxmlformats.org/drawingml/2006/picture">
+                <pic:pic xmlns:pic="http://schemas.openxmlformats.org/drawingml/2006/picture">
+                  <pic:nvPicPr>
+                    <pic:cNvPr id="0" name="" descr=""/>
+                    <pic:cNvPicPr>
+                      <a:picLocks noChangeAspect="1" noChangeArrowheads="1"/>
+                    </pic:cNvPicPr>
+                  </pic:nvPicPr>
+                  <pic:blipFill>
+                    <a:blip r:embed="rId9" cstate="none"/>
+                    <a:srcRect/>
+                    <a:stretch>
+                      <a:fillRect/>
+                    </a:stretch>
+                  </pic:blipFill>
+                  <pic:spPr bwMode="auto">
+                    <a:xfrm>
+                      <a:off x="0" y="0"/>
+                      <a:ext cx="762000" cy="762000"/>
+                    </a:xfrm>
+                    <a:prstGeom prst="rect">
+                      <a:avLst/>
+                    </a:prstGeom>
+                  </pic:spPr>
+                </pic:pic>
+              </a:graphicData>
+            </a:graphic>
+          </wp:anchor>
+        </w:drawing>
+      </w:r>
+      <w:r>
+        <w:drawing>
+          <wp:anchor distT="0" distB="0" distL="0" distR="0" simplePos="0" allowOverlap="1" behindDoc="0" locked="0" layoutInCell="1" relativeHeight="723900">
+            <wp:simplePos x="0" y="0"/>
+            <wp:positionH relativeFrom="page">
+              <wp:posOffset>9216000</wp:posOffset>
+            </wp:positionH>
+            <wp:positionV relativeFrom="page">
+              <wp:posOffset>6480000</wp:posOffset>
+            </wp:positionV>
+            <wp:extent cx="723900" cy="723900"/>
+            <wp:effectExtent t="0" r="0" b="0" l="0"/>
+            <wp:wrapNone/>
+            <wp:docPr id="1" name="" descr="" title=""/>
+            <wp:cNvGraphicFramePr>
+              <a:graphicFrameLocks xmlns:a="http://schemas.openxmlformats.org/drawingml/2006/main" noChangeAspect="1"/>
+            </wp:cNvGraphicFramePr>
+            <a:graphic xmlns:a="http://schemas.openxmlformats.org/drawingml/2006/main">
+              <a:graphicData uri="http://schemas.openxmlformats.org/drawingml/2006/picture">
+                <pic:pic xmlns:pic="http://schemas.openxmlformats.org/drawingml/2006/picture">
+                  <pic:nvPicPr>
+                    <pic:cNvPr id="0" name="" descr=""/>
+                    <pic:cNvPicPr>
+                      <a:picLocks noChangeAspect="1" noChangeArrowheads="1"/>
+                    </pic:cNvPicPr>
+                  </pic:nvPicPr>
+                  <pic:blipFill>
+                    <a:blip r:embed="rId10" cstate="none"/>
+                    <a:srcRect/>
+                    <a:stretch>
+                      <a:fillRect/>
+                    </a:stretch>
+                  </pic:blipFill>
+                  <pic:spPr bwMode="auto">
+                    <a:xfrm>
+                      <a:off x="0" y="0"/>
+                      <a:ext cx="723900" cy="723900"/>
+                    </a:xfrm>
+                    <a:prstGeom prst="rect">
+                      <a:avLst/>
+                    </a:prstGeom>
+                  </pic:spPr>
+                </pic:pic>
+              </a:graphicData>
+            </a:graphic>
+          </wp:anchor>
+        </w:drawing>
+      </w:r>
+      <w:r>
         <w:rPr>
           <w:rFonts w:ascii="Arial Narrow" w:cs="Arial Narrow" w:eastAsia="Arial Narrow" w:hAnsi="Arial Narrow"/>
           <w:b/>
@@ -17076,6 +19476,102 @@
         <w:spacing w:after="360"/>
         <w:jc w:val="center"/>
       </w:pPr>
+      <w:r>
+        <w:drawing>
+          <wp:anchor distT="0" distB="0" distL="0" distR="0" simplePos="0" allowOverlap="1" behindDoc="0" locked="0" layoutInCell="1" relativeHeight="762000">
+            <wp:simplePos x="0" y="0"/>
+            <wp:positionH relativeFrom="page">
+              <wp:posOffset>493200</wp:posOffset>
+            </wp:positionH>
+            <wp:positionV relativeFrom="page">
+              <wp:posOffset>6444000</wp:posOffset>
+            </wp:positionV>
+            <wp:extent cx="762000" cy="762000"/>
+            <wp:effectExtent t="0" r="0" b="0" l="0"/>
+            <wp:wrapNone/>
+            <wp:docPr id="1" name="" descr="" title=""/>
+            <wp:cNvGraphicFramePr>
+              <a:graphicFrameLocks xmlns:a="http://schemas.openxmlformats.org/drawingml/2006/main" noChangeAspect="1"/>
+            </wp:cNvGraphicFramePr>
+            <a:graphic xmlns:a="http://schemas.openxmlformats.org/drawingml/2006/main">
+              <a:graphicData uri="http://schemas.openxmlformats.org/drawingml/2006/picture">
+                <pic:pic xmlns:pic="http://schemas.openxmlformats.org/drawingml/2006/picture">
+                  <pic:nvPicPr>
+                    <pic:cNvPr id="0" name="" descr=""/>
+                    <pic:cNvPicPr>
+                      <a:picLocks noChangeAspect="1" noChangeArrowheads="1"/>
+                    </pic:cNvPicPr>
+                  </pic:nvPicPr>
+                  <pic:blipFill>
+                    <a:blip r:embed="rId9" cstate="none"/>
+                    <a:srcRect/>
+                    <a:stretch>
+                      <a:fillRect/>
+                    </a:stretch>
+                  </pic:blipFill>
+                  <pic:spPr bwMode="auto">
+                    <a:xfrm>
+                      <a:off x="0" y="0"/>
+                      <a:ext cx="762000" cy="762000"/>
+                    </a:xfrm>
+                    <a:prstGeom prst="rect">
+                      <a:avLst/>
+                    </a:prstGeom>
+                  </pic:spPr>
+                </pic:pic>
+              </a:graphicData>
+            </a:graphic>
+          </wp:anchor>
+        </w:drawing>
+      </w:r>
+      <w:r>
+        <w:drawing>
+          <wp:anchor distT="0" distB="0" distL="0" distR="0" simplePos="0" allowOverlap="1" behindDoc="0" locked="0" layoutInCell="1" relativeHeight="723900">
+            <wp:simplePos x="0" y="0"/>
+            <wp:positionH relativeFrom="page">
+              <wp:posOffset>9216000</wp:posOffset>
+            </wp:positionH>
+            <wp:positionV relativeFrom="page">
+              <wp:posOffset>6480000</wp:posOffset>
+            </wp:positionV>
+            <wp:extent cx="723900" cy="723900"/>
+            <wp:effectExtent t="0" r="0" b="0" l="0"/>
+            <wp:wrapNone/>
+            <wp:docPr id="1" name="" descr="" title=""/>
+            <wp:cNvGraphicFramePr>
+              <a:graphicFrameLocks xmlns:a="http://schemas.openxmlformats.org/drawingml/2006/main" noChangeAspect="1"/>
+            </wp:cNvGraphicFramePr>
+            <a:graphic xmlns:a="http://schemas.openxmlformats.org/drawingml/2006/main">
+              <a:graphicData uri="http://schemas.openxmlformats.org/drawingml/2006/picture">
+                <pic:pic xmlns:pic="http://schemas.openxmlformats.org/drawingml/2006/picture">
+                  <pic:nvPicPr>
+                    <pic:cNvPr id="0" name="" descr=""/>
+                    <pic:cNvPicPr>
+                      <a:picLocks noChangeAspect="1" noChangeArrowheads="1"/>
+                    </pic:cNvPicPr>
+                  </pic:nvPicPr>
+                  <pic:blipFill>
+                    <a:blip r:embed="rId10" cstate="none"/>
+                    <a:srcRect/>
+                    <a:stretch>
+                      <a:fillRect/>
+                    </a:stretch>
+                  </pic:blipFill>
+                  <pic:spPr bwMode="auto">
+                    <a:xfrm>
+                      <a:off x="0" y="0"/>
+                      <a:ext cx="723900" cy="723900"/>
+                    </a:xfrm>
+                    <a:prstGeom prst="rect">
+                      <a:avLst/>
+                    </a:prstGeom>
+                  </pic:spPr>
+                </pic:pic>
+              </a:graphicData>
+            </a:graphic>
+          </wp:anchor>
+        </w:drawing>
+      </w:r>
       <w:r>
         <w:rPr>
           <w:rFonts w:ascii="Arial Narrow" w:cs="Arial Narrow" w:eastAsia="Arial Narrow" w:hAnsi="Arial Narrow"/>
@@ -17472,6 +19968,102 @@
         <w:jc w:val="center"/>
       </w:pPr>
       <w:r>
+        <w:drawing>
+          <wp:anchor distT="0" distB="0" distL="0" distR="0" simplePos="0" allowOverlap="1" behindDoc="0" locked="0" layoutInCell="1" relativeHeight="762000">
+            <wp:simplePos x="0" y="0"/>
+            <wp:positionH relativeFrom="page">
+              <wp:posOffset>493200</wp:posOffset>
+            </wp:positionH>
+            <wp:positionV relativeFrom="page">
+              <wp:posOffset>6444000</wp:posOffset>
+            </wp:positionV>
+            <wp:extent cx="762000" cy="762000"/>
+            <wp:effectExtent t="0" r="0" b="0" l="0"/>
+            <wp:wrapNone/>
+            <wp:docPr id="1" name="" descr="" title=""/>
+            <wp:cNvGraphicFramePr>
+              <a:graphicFrameLocks xmlns:a="http://schemas.openxmlformats.org/drawingml/2006/main" noChangeAspect="1"/>
+            </wp:cNvGraphicFramePr>
+            <a:graphic xmlns:a="http://schemas.openxmlformats.org/drawingml/2006/main">
+              <a:graphicData uri="http://schemas.openxmlformats.org/drawingml/2006/picture">
+                <pic:pic xmlns:pic="http://schemas.openxmlformats.org/drawingml/2006/picture">
+                  <pic:nvPicPr>
+                    <pic:cNvPr id="0" name="" descr=""/>
+                    <pic:cNvPicPr>
+                      <a:picLocks noChangeAspect="1" noChangeArrowheads="1"/>
+                    </pic:cNvPicPr>
+                  </pic:nvPicPr>
+                  <pic:blipFill>
+                    <a:blip r:embed="rId9" cstate="none"/>
+                    <a:srcRect/>
+                    <a:stretch>
+                      <a:fillRect/>
+                    </a:stretch>
+                  </pic:blipFill>
+                  <pic:spPr bwMode="auto">
+                    <a:xfrm>
+                      <a:off x="0" y="0"/>
+                      <a:ext cx="762000" cy="762000"/>
+                    </a:xfrm>
+                    <a:prstGeom prst="rect">
+                      <a:avLst/>
+                    </a:prstGeom>
+                  </pic:spPr>
+                </pic:pic>
+              </a:graphicData>
+            </a:graphic>
+          </wp:anchor>
+        </w:drawing>
+      </w:r>
+      <w:r>
+        <w:drawing>
+          <wp:anchor distT="0" distB="0" distL="0" distR="0" simplePos="0" allowOverlap="1" behindDoc="0" locked="0" layoutInCell="1" relativeHeight="723900">
+            <wp:simplePos x="0" y="0"/>
+            <wp:positionH relativeFrom="page">
+              <wp:posOffset>9216000</wp:posOffset>
+            </wp:positionH>
+            <wp:positionV relativeFrom="page">
+              <wp:posOffset>6480000</wp:posOffset>
+            </wp:positionV>
+            <wp:extent cx="723900" cy="723900"/>
+            <wp:effectExtent t="0" r="0" b="0" l="0"/>
+            <wp:wrapNone/>
+            <wp:docPr id="1" name="" descr="" title=""/>
+            <wp:cNvGraphicFramePr>
+              <a:graphicFrameLocks xmlns:a="http://schemas.openxmlformats.org/drawingml/2006/main" noChangeAspect="1"/>
+            </wp:cNvGraphicFramePr>
+            <a:graphic xmlns:a="http://schemas.openxmlformats.org/drawingml/2006/main">
+              <a:graphicData uri="http://schemas.openxmlformats.org/drawingml/2006/picture">
+                <pic:pic xmlns:pic="http://schemas.openxmlformats.org/drawingml/2006/picture">
+                  <pic:nvPicPr>
+                    <pic:cNvPr id="0" name="" descr=""/>
+                    <pic:cNvPicPr>
+                      <a:picLocks noChangeAspect="1" noChangeArrowheads="1"/>
+                    </pic:cNvPicPr>
+                  </pic:nvPicPr>
+                  <pic:blipFill>
+                    <a:blip r:embed="rId10" cstate="none"/>
+                    <a:srcRect/>
+                    <a:stretch>
+                      <a:fillRect/>
+                    </a:stretch>
+                  </pic:blipFill>
+                  <pic:spPr bwMode="auto">
+                    <a:xfrm>
+                      <a:off x="0" y="0"/>
+                      <a:ext cx="723900" cy="723900"/>
+                    </a:xfrm>
+                    <a:prstGeom prst="rect">
+                      <a:avLst/>
+                    </a:prstGeom>
+                  </pic:spPr>
+                </pic:pic>
+              </a:graphicData>
+            </a:graphic>
+          </wp:anchor>
+        </w:drawing>
+      </w:r>
+      <w:r>
         <w:rPr>
           <w:rFonts w:ascii="Arial Narrow" w:cs="Arial Narrow" w:eastAsia="Arial Narrow" w:hAnsi="Arial Narrow"/>
           <w:b/>
@@ -18113,6 +20705,102 @@
         <w:spacing w:after="360"/>
         <w:jc w:val="center"/>
       </w:pPr>
+      <w:r>
+        <w:drawing>
+          <wp:anchor distT="0" distB="0" distL="0" distR="0" simplePos="0" allowOverlap="1" behindDoc="0" locked="0" layoutInCell="1" relativeHeight="762000">
+            <wp:simplePos x="0" y="0"/>
+            <wp:positionH relativeFrom="page">
+              <wp:posOffset>493200</wp:posOffset>
+            </wp:positionH>
+            <wp:positionV relativeFrom="page">
+              <wp:posOffset>6444000</wp:posOffset>
+            </wp:positionV>
+            <wp:extent cx="762000" cy="762000"/>
+            <wp:effectExtent t="0" r="0" b="0" l="0"/>
+            <wp:wrapNone/>
+            <wp:docPr id="1" name="" descr="" title=""/>
+            <wp:cNvGraphicFramePr>
+              <a:graphicFrameLocks xmlns:a="http://schemas.openxmlformats.org/drawingml/2006/main" noChangeAspect="1"/>
+            </wp:cNvGraphicFramePr>
+            <a:graphic xmlns:a="http://schemas.openxmlformats.org/drawingml/2006/main">
+              <a:graphicData uri="http://schemas.openxmlformats.org/drawingml/2006/picture">
+                <pic:pic xmlns:pic="http://schemas.openxmlformats.org/drawingml/2006/picture">
+                  <pic:nvPicPr>
+                    <pic:cNvPr id="0" name="" descr=""/>
+                    <pic:cNvPicPr>
+                      <a:picLocks noChangeAspect="1" noChangeArrowheads="1"/>
+                    </pic:cNvPicPr>
+                  </pic:nvPicPr>
+                  <pic:blipFill>
+                    <a:blip r:embed="rId9" cstate="none"/>
+                    <a:srcRect/>
+                    <a:stretch>
+                      <a:fillRect/>
+                    </a:stretch>
+                  </pic:blipFill>
+                  <pic:spPr bwMode="auto">
+                    <a:xfrm>
+                      <a:off x="0" y="0"/>
+                      <a:ext cx="762000" cy="762000"/>
+                    </a:xfrm>
+                    <a:prstGeom prst="rect">
+                      <a:avLst/>
+                    </a:prstGeom>
+                  </pic:spPr>
+                </pic:pic>
+              </a:graphicData>
+            </a:graphic>
+          </wp:anchor>
+        </w:drawing>
+      </w:r>
+      <w:r>
+        <w:drawing>
+          <wp:anchor distT="0" distB="0" distL="0" distR="0" simplePos="0" allowOverlap="1" behindDoc="0" locked="0" layoutInCell="1" relativeHeight="723900">
+            <wp:simplePos x="0" y="0"/>
+            <wp:positionH relativeFrom="page">
+              <wp:posOffset>9216000</wp:posOffset>
+            </wp:positionH>
+            <wp:positionV relativeFrom="page">
+              <wp:posOffset>6480000</wp:posOffset>
+            </wp:positionV>
+            <wp:extent cx="723900" cy="723900"/>
+            <wp:effectExtent t="0" r="0" b="0" l="0"/>
+            <wp:wrapNone/>
+            <wp:docPr id="1" name="" descr="" title=""/>
+            <wp:cNvGraphicFramePr>
+              <a:graphicFrameLocks xmlns:a="http://schemas.openxmlformats.org/drawingml/2006/main" noChangeAspect="1"/>
+            </wp:cNvGraphicFramePr>
+            <a:graphic xmlns:a="http://schemas.openxmlformats.org/drawingml/2006/main">
+              <a:graphicData uri="http://schemas.openxmlformats.org/drawingml/2006/picture">
+                <pic:pic xmlns:pic="http://schemas.openxmlformats.org/drawingml/2006/picture">
+                  <pic:nvPicPr>
+                    <pic:cNvPr id="0" name="" descr=""/>
+                    <pic:cNvPicPr>
+                      <a:picLocks noChangeAspect="1" noChangeArrowheads="1"/>
+                    </pic:cNvPicPr>
+                  </pic:nvPicPr>
+                  <pic:blipFill>
+                    <a:blip r:embed="rId10" cstate="none"/>
+                    <a:srcRect/>
+                    <a:stretch>
+                      <a:fillRect/>
+                    </a:stretch>
+                  </pic:blipFill>
+                  <pic:spPr bwMode="auto">
+                    <a:xfrm>
+                      <a:off x="0" y="0"/>
+                      <a:ext cx="723900" cy="723900"/>
+                    </a:xfrm>
+                    <a:prstGeom prst="rect">
+                      <a:avLst/>
+                    </a:prstGeom>
+                  </pic:spPr>
+                </pic:pic>
+              </a:graphicData>
+            </a:graphic>
+          </wp:anchor>
+        </w:drawing>
+      </w:r>
       <w:r>
         <w:rPr>
           <w:rFonts w:ascii="Arial Narrow" w:cs="Arial Narrow" w:eastAsia="Arial Narrow" w:hAnsi="Arial Narrow"/>
@@ -18723,6 +21411,102 @@
         <w:jc w:val="center"/>
       </w:pPr>
       <w:r>
+        <w:drawing>
+          <wp:anchor distT="0" distB="0" distL="0" distR="0" simplePos="0" allowOverlap="1" behindDoc="0" locked="0" layoutInCell="1" relativeHeight="762000">
+            <wp:simplePos x="0" y="0"/>
+            <wp:positionH relativeFrom="page">
+              <wp:posOffset>493200</wp:posOffset>
+            </wp:positionH>
+            <wp:positionV relativeFrom="page">
+              <wp:posOffset>6444000</wp:posOffset>
+            </wp:positionV>
+            <wp:extent cx="762000" cy="762000"/>
+            <wp:effectExtent t="0" r="0" b="0" l="0"/>
+            <wp:wrapNone/>
+            <wp:docPr id="1" name="" descr="" title=""/>
+            <wp:cNvGraphicFramePr>
+              <a:graphicFrameLocks xmlns:a="http://schemas.openxmlformats.org/drawingml/2006/main" noChangeAspect="1"/>
+            </wp:cNvGraphicFramePr>
+            <a:graphic xmlns:a="http://schemas.openxmlformats.org/drawingml/2006/main">
+              <a:graphicData uri="http://schemas.openxmlformats.org/drawingml/2006/picture">
+                <pic:pic xmlns:pic="http://schemas.openxmlformats.org/drawingml/2006/picture">
+                  <pic:nvPicPr>
+                    <pic:cNvPr id="0" name="" descr=""/>
+                    <pic:cNvPicPr>
+                      <a:picLocks noChangeAspect="1" noChangeArrowheads="1"/>
+                    </pic:cNvPicPr>
+                  </pic:nvPicPr>
+                  <pic:blipFill>
+                    <a:blip r:embed="rId9" cstate="none"/>
+                    <a:srcRect/>
+                    <a:stretch>
+                      <a:fillRect/>
+                    </a:stretch>
+                  </pic:blipFill>
+                  <pic:spPr bwMode="auto">
+                    <a:xfrm>
+                      <a:off x="0" y="0"/>
+                      <a:ext cx="762000" cy="762000"/>
+                    </a:xfrm>
+                    <a:prstGeom prst="rect">
+                      <a:avLst/>
+                    </a:prstGeom>
+                  </pic:spPr>
+                </pic:pic>
+              </a:graphicData>
+            </a:graphic>
+          </wp:anchor>
+        </w:drawing>
+      </w:r>
+      <w:r>
+        <w:drawing>
+          <wp:anchor distT="0" distB="0" distL="0" distR="0" simplePos="0" allowOverlap="1" behindDoc="0" locked="0" layoutInCell="1" relativeHeight="723900">
+            <wp:simplePos x="0" y="0"/>
+            <wp:positionH relativeFrom="page">
+              <wp:posOffset>9216000</wp:posOffset>
+            </wp:positionH>
+            <wp:positionV relativeFrom="page">
+              <wp:posOffset>6480000</wp:posOffset>
+            </wp:positionV>
+            <wp:extent cx="723900" cy="723900"/>
+            <wp:effectExtent t="0" r="0" b="0" l="0"/>
+            <wp:wrapNone/>
+            <wp:docPr id="1" name="" descr="" title=""/>
+            <wp:cNvGraphicFramePr>
+              <a:graphicFrameLocks xmlns:a="http://schemas.openxmlformats.org/drawingml/2006/main" noChangeAspect="1"/>
+            </wp:cNvGraphicFramePr>
+            <a:graphic xmlns:a="http://schemas.openxmlformats.org/drawingml/2006/main">
+              <a:graphicData uri="http://schemas.openxmlformats.org/drawingml/2006/picture">
+                <pic:pic xmlns:pic="http://schemas.openxmlformats.org/drawingml/2006/picture">
+                  <pic:nvPicPr>
+                    <pic:cNvPr id="0" name="" descr=""/>
+                    <pic:cNvPicPr>
+                      <a:picLocks noChangeAspect="1" noChangeArrowheads="1"/>
+                    </pic:cNvPicPr>
+                  </pic:nvPicPr>
+                  <pic:blipFill>
+                    <a:blip r:embed="rId10" cstate="none"/>
+                    <a:srcRect/>
+                    <a:stretch>
+                      <a:fillRect/>
+                    </a:stretch>
+                  </pic:blipFill>
+                  <pic:spPr bwMode="auto">
+                    <a:xfrm>
+                      <a:off x="0" y="0"/>
+                      <a:ext cx="723900" cy="723900"/>
+                    </a:xfrm>
+                    <a:prstGeom prst="rect">
+                      <a:avLst/>
+                    </a:prstGeom>
+                  </pic:spPr>
+                </pic:pic>
+              </a:graphicData>
+            </a:graphic>
+          </wp:anchor>
+        </w:drawing>
+      </w:r>
+      <w:r>
         <w:rPr>
           <w:rFonts w:ascii="Arial Narrow" w:cs="Arial Narrow" w:eastAsia="Arial Narrow" w:hAnsi="Arial Narrow"/>
           <w:b/>
@@ -19471,6 +22255,102 @@
         <w:spacing w:after="360"/>
         <w:jc w:val="center"/>
       </w:pPr>
+      <w:r>
+        <w:drawing>
+          <wp:anchor distT="0" distB="0" distL="0" distR="0" simplePos="0" allowOverlap="1" behindDoc="0" locked="0" layoutInCell="1" relativeHeight="762000">
+            <wp:simplePos x="0" y="0"/>
+            <wp:positionH relativeFrom="page">
+              <wp:posOffset>493200</wp:posOffset>
+            </wp:positionH>
+            <wp:positionV relativeFrom="page">
+              <wp:posOffset>6444000</wp:posOffset>
+            </wp:positionV>
+            <wp:extent cx="762000" cy="762000"/>
+            <wp:effectExtent t="0" r="0" b="0" l="0"/>
+            <wp:wrapNone/>
+            <wp:docPr id="1" name="" descr="" title=""/>
+            <wp:cNvGraphicFramePr>
+              <a:graphicFrameLocks xmlns:a="http://schemas.openxmlformats.org/drawingml/2006/main" noChangeAspect="1"/>
+            </wp:cNvGraphicFramePr>
+            <a:graphic xmlns:a="http://schemas.openxmlformats.org/drawingml/2006/main">
+              <a:graphicData uri="http://schemas.openxmlformats.org/drawingml/2006/picture">
+                <pic:pic xmlns:pic="http://schemas.openxmlformats.org/drawingml/2006/picture">
+                  <pic:nvPicPr>
+                    <pic:cNvPr id="0" name="" descr=""/>
+                    <pic:cNvPicPr>
+                      <a:picLocks noChangeAspect="1" noChangeArrowheads="1"/>
+                    </pic:cNvPicPr>
+                  </pic:nvPicPr>
+                  <pic:blipFill>
+                    <a:blip r:embed="rId9" cstate="none"/>
+                    <a:srcRect/>
+                    <a:stretch>
+                      <a:fillRect/>
+                    </a:stretch>
+                  </pic:blipFill>
+                  <pic:spPr bwMode="auto">
+                    <a:xfrm>
+                      <a:off x="0" y="0"/>
+                      <a:ext cx="762000" cy="762000"/>
+                    </a:xfrm>
+                    <a:prstGeom prst="rect">
+                      <a:avLst/>
+                    </a:prstGeom>
+                  </pic:spPr>
+                </pic:pic>
+              </a:graphicData>
+            </a:graphic>
+          </wp:anchor>
+        </w:drawing>
+      </w:r>
+      <w:r>
+        <w:drawing>
+          <wp:anchor distT="0" distB="0" distL="0" distR="0" simplePos="0" allowOverlap="1" behindDoc="0" locked="0" layoutInCell="1" relativeHeight="723900">
+            <wp:simplePos x="0" y="0"/>
+            <wp:positionH relativeFrom="page">
+              <wp:posOffset>9216000</wp:posOffset>
+            </wp:positionH>
+            <wp:positionV relativeFrom="page">
+              <wp:posOffset>6480000</wp:posOffset>
+            </wp:positionV>
+            <wp:extent cx="723900" cy="723900"/>
+            <wp:effectExtent t="0" r="0" b="0" l="0"/>
+            <wp:wrapNone/>
+            <wp:docPr id="1" name="" descr="" title=""/>
+            <wp:cNvGraphicFramePr>
+              <a:graphicFrameLocks xmlns:a="http://schemas.openxmlformats.org/drawingml/2006/main" noChangeAspect="1"/>
+            </wp:cNvGraphicFramePr>
+            <a:graphic xmlns:a="http://schemas.openxmlformats.org/drawingml/2006/main">
+              <a:graphicData uri="http://schemas.openxmlformats.org/drawingml/2006/picture">
+                <pic:pic xmlns:pic="http://schemas.openxmlformats.org/drawingml/2006/picture">
+                  <pic:nvPicPr>
+                    <pic:cNvPr id="0" name="" descr=""/>
+                    <pic:cNvPicPr>
+                      <a:picLocks noChangeAspect="1" noChangeArrowheads="1"/>
+                    </pic:cNvPicPr>
+                  </pic:nvPicPr>
+                  <pic:blipFill>
+                    <a:blip r:embed="rId10" cstate="none"/>
+                    <a:srcRect/>
+                    <a:stretch>
+                      <a:fillRect/>
+                    </a:stretch>
+                  </pic:blipFill>
+                  <pic:spPr bwMode="auto">
+                    <a:xfrm>
+                      <a:off x="0" y="0"/>
+                      <a:ext cx="723900" cy="723900"/>
+                    </a:xfrm>
+                    <a:prstGeom prst="rect">
+                      <a:avLst/>
+                    </a:prstGeom>
+                  </pic:spPr>
+                </pic:pic>
+              </a:graphicData>
+            </a:graphic>
+          </wp:anchor>
+        </w:drawing>
+      </w:r>
       <w:r>
         <w:rPr>
           <w:rFonts w:ascii="Arial Narrow" w:cs="Arial Narrow" w:eastAsia="Arial Narrow" w:hAnsi="Arial Narrow"/>
@@ -20576,6 +23456,102 @@
         <w:spacing w:after="60"/>
         <w:jc w:val="center"/>
       </w:pPr>
+      <w:r>
+        <w:drawing>
+          <wp:anchor distT="0" distB="0" distL="0" distR="0" simplePos="0" allowOverlap="1" behindDoc="0" locked="0" layoutInCell="1" relativeHeight="762000">
+            <wp:simplePos x="0" y="0"/>
+            <wp:positionH relativeFrom="page">
+              <wp:posOffset>493200</wp:posOffset>
+            </wp:positionH>
+            <wp:positionV relativeFrom="page">
+              <wp:posOffset>6444000</wp:posOffset>
+            </wp:positionV>
+            <wp:extent cx="762000" cy="762000"/>
+            <wp:effectExtent t="0" r="0" b="0" l="0"/>
+            <wp:wrapNone/>
+            <wp:docPr id="1" name="" descr="" title=""/>
+            <wp:cNvGraphicFramePr>
+              <a:graphicFrameLocks xmlns:a="http://schemas.openxmlformats.org/drawingml/2006/main" noChangeAspect="1"/>
+            </wp:cNvGraphicFramePr>
+            <a:graphic xmlns:a="http://schemas.openxmlformats.org/drawingml/2006/main">
+              <a:graphicData uri="http://schemas.openxmlformats.org/drawingml/2006/picture">
+                <pic:pic xmlns:pic="http://schemas.openxmlformats.org/drawingml/2006/picture">
+                  <pic:nvPicPr>
+                    <pic:cNvPr id="0" name="" descr=""/>
+                    <pic:cNvPicPr>
+                      <a:picLocks noChangeAspect="1" noChangeArrowheads="1"/>
+                    </pic:cNvPicPr>
+                  </pic:nvPicPr>
+                  <pic:blipFill>
+                    <a:blip r:embed="rId9" cstate="none"/>
+                    <a:srcRect/>
+                    <a:stretch>
+                      <a:fillRect/>
+                    </a:stretch>
+                  </pic:blipFill>
+                  <pic:spPr bwMode="auto">
+                    <a:xfrm>
+                      <a:off x="0" y="0"/>
+                      <a:ext cx="762000" cy="762000"/>
+                    </a:xfrm>
+                    <a:prstGeom prst="rect">
+                      <a:avLst/>
+                    </a:prstGeom>
+                  </pic:spPr>
+                </pic:pic>
+              </a:graphicData>
+            </a:graphic>
+          </wp:anchor>
+        </w:drawing>
+      </w:r>
+      <w:r>
+        <w:drawing>
+          <wp:anchor distT="0" distB="0" distL="0" distR="0" simplePos="0" allowOverlap="1" behindDoc="0" locked="0" layoutInCell="1" relativeHeight="723900">
+            <wp:simplePos x="0" y="0"/>
+            <wp:positionH relativeFrom="page">
+              <wp:posOffset>9216000</wp:posOffset>
+            </wp:positionH>
+            <wp:positionV relativeFrom="page">
+              <wp:posOffset>6480000</wp:posOffset>
+            </wp:positionV>
+            <wp:extent cx="723900" cy="723900"/>
+            <wp:effectExtent t="0" r="0" b="0" l="0"/>
+            <wp:wrapNone/>
+            <wp:docPr id="1" name="" descr="" title=""/>
+            <wp:cNvGraphicFramePr>
+              <a:graphicFrameLocks xmlns:a="http://schemas.openxmlformats.org/drawingml/2006/main" noChangeAspect="1"/>
+            </wp:cNvGraphicFramePr>
+            <a:graphic xmlns:a="http://schemas.openxmlformats.org/drawingml/2006/main">
+              <a:graphicData uri="http://schemas.openxmlformats.org/drawingml/2006/picture">
+                <pic:pic xmlns:pic="http://schemas.openxmlformats.org/drawingml/2006/picture">
+                  <pic:nvPicPr>
+                    <pic:cNvPr id="0" name="" descr=""/>
+                    <pic:cNvPicPr>
+                      <a:picLocks noChangeAspect="1" noChangeArrowheads="1"/>
+                    </pic:cNvPicPr>
+                  </pic:nvPicPr>
+                  <pic:blipFill>
+                    <a:blip r:embed="rId10" cstate="none"/>
+                    <a:srcRect/>
+                    <a:stretch>
+                      <a:fillRect/>
+                    </a:stretch>
+                  </pic:blipFill>
+                  <pic:spPr bwMode="auto">
+                    <a:xfrm>
+                      <a:off x="0" y="0"/>
+                      <a:ext cx="723900" cy="723900"/>
+                    </a:xfrm>
+                    <a:prstGeom prst="rect">
+                      <a:avLst/>
+                    </a:prstGeom>
+                  </pic:spPr>
+                </pic:pic>
+              </a:graphicData>
+            </a:graphic>
+          </wp:anchor>
+        </w:drawing>
+      </w:r>
       <w:r>
         <w:rPr>
           <w:rFonts w:ascii="Arial Narrow" w:cs="Arial Narrow" w:eastAsia="Arial Narrow" w:hAnsi="Arial Narrow"/>
@@ -21310,6 +24286,102 @@
         <w:jc w:val="center"/>
       </w:pPr>
       <w:r>
+        <w:drawing>
+          <wp:anchor distT="0" distB="0" distL="0" distR="0" simplePos="0" allowOverlap="1" behindDoc="0" locked="0" layoutInCell="1" relativeHeight="762000">
+            <wp:simplePos x="0" y="0"/>
+            <wp:positionH relativeFrom="page">
+              <wp:posOffset>493200</wp:posOffset>
+            </wp:positionH>
+            <wp:positionV relativeFrom="page">
+              <wp:posOffset>6444000</wp:posOffset>
+            </wp:positionV>
+            <wp:extent cx="762000" cy="762000"/>
+            <wp:effectExtent t="0" r="0" b="0" l="0"/>
+            <wp:wrapNone/>
+            <wp:docPr id="1" name="" descr="" title=""/>
+            <wp:cNvGraphicFramePr>
+              <a:graphicFrameLocks xmlns:a="http://schemas.openxmlformats.org/drawingml/2006/main" noChangeAspect="1"/>
+            </wp:cNvGraphicFramePr>
+            <a:graphic xmlns:a="http://schemas.openxmlformats.org/drawingml/2006/main">
+              <a:graphicData uri="http://schemas.openxmlformats.org/drawingml/2006/picture">
+                <pic:pic xmlns:pic="http://schemas.openxmlformats.org/drawingml/2006/picture">
+                  <pic:nvPicPr>
+                    <pic:cNvPr id="0" name="" descr=""/>
+                    <pic:cNvPicPr>
+                      <a:picLocks noChangeAspect="1" noChangeArrowheads="1"/>
+                    </pic:cNvPicPr>
+                  </pic:nvPicPr>
+                  <pic:blipFill>
+                    <a:blip r:embed="rId9" cstate="none"/>
+                    <a:srcRect/>
+                    <a:stretch>
+                      <a:fillRect/>
+                    </a:stretch>
+                  </pic:blipFill>
+                  <pic:spPr bwMode="auto">
+                    <a:xfrm>
+                      <a:off x="0" y="0"/>
+                      <a:ext cx="762000" cy="762000"/>
+                    </a:xfrm>
+                    <a:prstGeom prst="rect">
+                      <a:avLst/>
+                    </a:prstGeom>
+                  </pic:spPr>
+                </pic:pic>
+              </a:graphicData>
+            </a:graphic>
+          </wp:anchor>
+        </w:drawing>
+      </w:r>
+      <w:r>
+        <w:drawing>
+          <wp:anchor distT="0" distB="0" distL="0" distR="0" simplePos="0" allowOverlap="1" behindDoc="0" locked="0" layoutInCell="1" relativeHeight="723900">
+            <wp:simplePos x="0" y="0"/>
+            <wp:positionH relativeFrom="page">
+              <wp:posOffset>9216000</wp:posOffset>
+            </wp:positionH>
+            <wp:positionV relativeFrom="page">
+              <wp:posOffset>6480000</wp:posOffset>
+            </wp:positionV>
+            <wp:extent cx="723900" cy="723900"/>
+            <wp:effectExtent t="0" r="0" b="0" l="0"/>
+            <wp:wrapNone/>
+            <wp:docPr id="1" name="" descr="" title=""/>
+            <wp:cNvGraphicFramePr>
+              <a:graphicFrameLocks xmlns:a="http://schemas.openxmlformats.org/drawingml/2006/main" noChangeAspect="1"/>
+            </wp:cNvGraphicFramePr>
+            <a:graphic xmlns:a="http://schemas.openxmlformats.org/drawingml/2006/main">
+              <a:graphicData uri="http://schemas.openxmlformats.org/drawingml/2006/picture">
+                <pic:pic xmlns:pic="http://schemas.openxmlformats.org/drawingml/2006/picture">
+                  <pic:nvPicPr>
+                    <pic:cNvPr id="0" name="" descr=""/>
+                    <pic:cNvPicPr>
+                      <a:picLocks noChangeAspect="1" noChangeArrowheads="1"/>
+                    </pic:cNvPicPr>
+                  </pic:nvPicPr>
+                  <pic:blipFill>
+                    <a:blip r:embed="rId10" cstate="none"/>
+                    <a:srcRect/>
+                    <a:stretch>
+                      <a:fillRect/>
+                    </a:stretch>
+                  </pic:blipFill>
+                  <pic:spPr bwMode="auto">
+                    <a:xfrm>
+                      <a:off x="0" y="0"/>
+                      <a:ext cx="723900" cy="723900"/>
+                    </a:xfrm>
+                    <a:prstGeom prst="rect">
+                      <a:avLst/>
+                    </a:prstGeom>
+                  </pic:spPr>
+                </pic:pic>
+              </a:graphicData>
+            </a:graphic>
+          </wp:anchor>
+        </w:drawing>
+      </w:r>
+      <w:r>
         <w:rPr>
           <w:rFonts w:ascii="Arial Narrow" w:cs="Arial Narrow" w:eastAsia="Arial Narrow" w:hAnsi="Arial Narrow"/>
           <w:b/>
@@ -22005,6 +25077,102 @@
         <w:spacing w:after="360"/>
         <w:jc w:val="center"/>
       </w:pPr>
+      <w:r>
+        <w:drawing>
+          <wp:anchor distT="0" distB="0" distL="0" distR="0" simplePos="0" allowOverlap="1" behindDoc="0" locked="0" layoutInCell="1" relativeHeight="762000">
+            <wp:simplePos x="0" y="0"/>
+            <wp:positionH relativeFrom="page">
+              <wp:posOffset>493200</wp:posOffset>
+            </wp:positionH>
+            <wp:positionV relativeFrom="page">
+              <wp:posOffset>6444000</wp:posOffset>
+            </wp:positionV>
+            <wp:extent cx="762000" cy="762000"/>
+            <wp:effectExtent t="0" r="0" b="0" l="0"/>
+            <wp:wrapNone/>
+            <wp:docPr id="1" name="" descr="" title=""/>
+            <wp:cNvGraphicFramePr>
+              <a:graphicFrameLocks xmlns:a="http://schemas.openxmlformats.org/drawingml/2006/main" noChangeAspect="1"/>
+            </wp:cNvGraphicFramePr>
+            <a:graphic xmlns:a="http://schemas.openxmlformats.org/drawingml/2006/main">
+              <a:graphicData uri="http://schemas.openxmlformats.org/drawingml/2006/picture">
+                <pic:pic xmlns:pic="http://schemas.openxmlformats.org/drawingml/2006/picture">
+                  <pic:nvPicPr>
+                    <pic:cNvPr id="0" name="" descr=""/>
+                    <pic:cNvPicPr>
+                      <a:picLocks noChangeAspect="1" noChangeArrowheads="1"/>
+                    </pic:cNvPicPr>
+                  </pic:nvPicPr>
+                  <pic:blipFill>
+                    <a:blip r:embed="rId9" cstate="none"/>
+                    <a:srcRect/>
+                    <a:stretch>
+                      <a:fillRect/>
+                    </a:stretch>
+                  </pic:blipFill>
+                  <pic:spPr bwMode="auto">
+                    <a:xfrm>
+                      <a:off x="0" y="0"/>
+                      <a:ext cx="762000" cy="762000"/>
+                    </a:xfrm>
+                    <a:prstGeom prst="rect">
+                      <a:avLst/>
+                    </a:prstGeom>
+                  </pic:spPr>
+                </pic:pic>
+              </a:graphicData>
+            </a:graphic>
+          </wp:anchor>
+        </w:drawing>
+      </w:r>
+      <w:r>
+        <w:drawing>
+          <wp:anchor distT="0" distB="0" distL="0" distR="0" simplePos="0" allowOverlap="1" behindDoc="0" locked="0" layoutInCell="1" relativeHeight="723900">
+            <wp:simplePos x="0" y="0"/>
+            <wp:positionH relativeFrom="page">
+              <wp:posOffset>9216000</wp:posOffset>
+            </wp:positionH>
+            <wp:positionV relativeFrom="page">
+              <wp:posOffset>6480000</wp:posOffset>
+            </wp:positionV>
+            <wp:extent cx="723900" cy="723900"/>
+            <wp:effectExtent t="0" r="0" b="0" l="0"/>
+            <wp:wrapNone/>
+            <wp:docPr id="1" name="" descr="" title=""/>
+            <wp:cNvGraphicFramePr>
+              <a:graphicFrameLocks xmlns:a="http://schemas.openxmlformats.org/drawingml/2006/main" noChangeAspect="1"/>
+            </wp:cNvGraphicFramePr>
+            <a:graphic xmlns:a="http://schemas.openxmlformats.org/drawingml/2006/main">
+              <a:graphicData uri="http://schemas.openxmlformats.org/drawingml/2006/picture">
+                <pic:pic xmlns:pic="http://schemas.openxmlformats.org/drawingml/2006/picture">
+                  <pic:nvPicPr>
+                    <pic:cNvPr id="0" name="" descr=""/>
+                    <pic:cNvPicPr>
+                      <a:picLocks noChangeAspect="1" noChangeArrowheads="1"/>
+                    </pic:cNvPicPr>
+                  </pic:nvPicPr>
+                  <pic:blipFill>
+                    <a:blip r:embed="rId10" cstate="none"/>
+                    <a:srcRect/>
+                    <a:stretch>
+                      <a:fillRect/>
+                    </a:stretch>
+                  </pic:blipFill>
+                  <pic:spPr bwMode="auto">
+                    <a:xfrm>
+                      <a:off x="0" y="0"/>
+                      <a:ext cx="723900" cy="723900"/>
+                    </a:xfrm>
+                    <a:prstGeom prst="rect">
+                      <a:avLst/>
+                    </a:prstGeom>
+                  </pic:spPr>
+                </pic:pic>
+              </a:graphicData>
+            </a:graphic>
+          </wp:anchor>
+        </w:drawing>
+      </w:r>
       <w:r>
         <w:rPr>
           <w:rFonts w:ascii="Arial Narrow" w:cs="Arial Narrow" w:eastAsia="Arial Narrow" w:hAnsi="Arial Narrow"/>
@@ -22401,6 +25569,102 @@
         <w:jc w:val="center"/>
       </w:pPr>
       <w:r>
+        <w:drawing>
+          <wp:anchor distT="0" distB="0" distL="0" distR="0" simplePos="0" allowOverlap="1" behindDoc="0" locked="0" layoutInCell="1" relativeHeight="762000">
+            <wp:simplePos x="0" y="0"/>
+            <wp:positionH relativeFrom="page">
+              <wp:posOffset>493200</wp:posOffset>
+            </wp:positionH>
+            <wp:positionV relativeFrom="page">
+              <wp:posOffset>6444000</wp:posOffset>
+            </wp:positionV>
+            <wp:extent cx="762000" cy="762000"/>
+            <wp:effectExtent t="0" r="0" b="0" l="0"/>
+            <wp:wrapNone/>
+            <wp:docPr id="1" name="" descr="" title=""/>
+            <wp:cNvGraphicFramePr>
+              <a:graphicFrameLocks xmlns:a="http://schemas.openxmlformats.org/drawingml/2006/main" noChangeAspect="1"/>
+            </wp:cNvGraphicFramePr>
+            <a:graphic xmlns:a="http://schemas.openxmlformats.org/drawingml/2006/main">
+              <a:graphicData uri="http://schemas.openxmlformats.org/drawingml/2006/picture">
+                <pic:pic xmlns:pic="http://schemas.openxmlformats.org/drawingml/2006/picture">
+                  <pic:nvPicPr>
+                    <pic:cNvPr id="0" name="" descr=""/>
+                    <pic:cNvPicPr>
+                      <a:picLocks noChangeAspect="1" noChangeArrowheads="1"/>
+                    </pic:cNvPicPr>
+                  </pic:nvPicPr>
+                  <pic:blipFill>
+                    <a:blip r:embed="rId9" cstate="none"/>
+                    <a:srcRect/>
+                    <a:stretch>
+                      <a:fillRect/>
+                    </a:stretch>
+                  </pic:blipFill>
+                  <pic:spPr bwMode="auto">
+                    <a:xfrm>
+                      <a:off x="0" y="0"/>
+                      <a:ext cx="762000" cy="762000"/>
+                    </a:xfrm>
+                    <a:prstGeom prst="rect">
+                      <a:avLst/>
+                    </a:prstGeom>
+                  </pic:spPr>
+                </pic:pic>
+              </a:graphicData>
+            </a:graphic>
+          </wp:anchor>
+        </w:drawing>
+      </w:r>
+      <w:r>
+        <w:drawing>
+          <wp:anchor distT="0" distB="0" distL="0" distR="0" simplePos="0" allowOverlap="1" behindDoc="0" locked="0" layoutInCell="1" relativeHeight="723900">
+            <wp:simplePos x="0" y="0"/>
+            <wp:positionH relativeFrom="page">
+              <wp:posOffset>9216000</wp:posOffset>
+            </wp:positionH>
+            <wp:positionV relativeFrom="page">
+              <wp:posOffset>6480000</wp:posOffset>
+            </wp:positionV>
+            <wp:extent cx="723900" cy="723900"/>
+            <wp:effectExtent t="0" r="0" b="0" l="0"/>
+            <wp:wrapNone/>
+            <wp:docPr id="1" name="" descr="" title=""/>
+            <wp:cNvGraphicFramePr>
+              <a:graphicFrameLocks xmlns:a="http://schemas.openxmlformats.org/drawingml/2006/main" noChangeAspect="1"/>
+            </wp:cNvGraphicFramePr>
+            <a:graphic xmlns:a="http://schemas.openxmlformats.org/drawingml/2006/main">
+              <a:graphicData uri="http://schemas.openxmlformats.org/drawingml/2006/picture">
+                <pic:pic xmlns:pic="http://schemas.openxmlformats.org/drawingml/2006/picture">
+                  <pic:nvPicPr>
+                    <pic:cNvPr id="0" name="" descr=""/>
+                    <pic:cNvPicPr>
+                      <a:picLocks noChangeAspect="1" noChangeArrowheads="1"/>
+                    </pic:cNvPicPr>
+                  </pic:nvPicPr>
+                  <pic:blipFill>
+                    <a:blip r:embed="rId10" cstate="none"/>
+                    <a:srcRect/>
+                    <a:stretch>
+                      <a:fillRect/>
+                    </a:stretch>
+                  </pic:blipFill>
+                  <pic:spPr bwMode="auto">
+                    <a:xfrm>
+                      <a:off x="0" y="0"/>
+                      <a:ext cx="723900" cy="723900"/>
+                    </a:xfrm>
+                    <a:prstGeom prst="rect">
+                      <a:avLst/>
+                    </a:prstGeom>
+                  </pic:spPr>
+                </pic:pic>
+              </a:graphicData>
+            </a:graphic>
+          </wp:anchor>
+        </w:drawing>
+      </w:r>
+      <w:r>
         <w:rPr>
           <w:rFonts w:ascii="Arial Narrow" w:cs="Arial Narrow" w:eastAsia="Arial Narrow" w:hAnsi="Arial Narrow"/>
           <w:b/>
@@ -23115,6 +26379,102 @@
         <w:spacing w:after="60"/>
         <w:jc w:val="center"/>
       </w:pPr>
+      <w:r>
+        <w:drawing>
+          <wp:anchor distT="0" distB="0" distL="0" distR="0" simplePos="0" allowOverlap="1" behindDoc="0" locked="0" layoutInCell="1" relativeHeight="762000">
+            <wp:simplePos x="0" y="0"/>
+            <wp:positionH relativeFrom="page">
+              <wp:posOffset>493200</wp:posOffset>
+            </wp:positionH>
+            <wp:positionV relativeFrom="page">
+              <wp:posOffset>6444000</wp:posOffset>
+            </wp:positionV>
+            <wp:extent cx="762000" cy="762000"/>
+            <wp:effectExtent t="0" r="0" b="0" l="0"/>
+            <wp:wrapNone/>
+            <wp:docPr id="1" name="" descr="" title=""/>
+            <wp:cNvGraphicFramePr>
+              <a:graphicFrameLocks xmlns:a="http://schemas.openxmlformats.org/drawingml/2006/main" noChangeAspect="1"/>
+            </wp:cNvGraphicFramePr>
+            <a:graphic xmlns:a="http://schemas.openxmlformats.org/drawingml/2006/main">
+              <a:graphicData uri="http://schemas.openxmlformats.org/drawingml/2006/picture">
+                <pic:pic xmlns:pic="http://schemas.openxmlformats.org/drawingml/2006/picture">
+                  <pic:nvPicPr>
+                    <pic:cNvPr id="0" name="" descr=""/>
+                    <pic:cNvPicPr>
+                      <a:picLocks noChangeAspect="1" noChangeArrowheads="1"/>
+                    </pic:cNvPicPr>
+                  </pic:nvPicPr>
+                  <pic:blipFill>
+                    <a:blip r:embed="rId9" cstate="none"/>
+                    <a:srcRect/>
+                    <a:stretch>
+                      <a:fillRect/>
+                    </a:stretch>
+                  </pic:blipFill>
+                  <pic:spPr bwMode="auto">
+                    <a:xfrm>
+                      <a:off x="0" y="0"/>
+                      <a:ext cx="762000" cy="762000"/>
+                    </a:xfrm>
+                    <a:prstGeom prst="rect">
+                      <a:avLst/>
+                    </a:prstGeom>
+                  </pic:spPr>
+                </pic:pic>
+              </a:graphicData>
+            </a:graphic>
+          </wp:anchor>
+        </w:drawing>
+      </w:r>
+      <w:r>
+        <w:drawing>
+          <wp:anchor distT="0" distB="0" distL="0" distR="0" simplePos="0" allowOverlap="1" behindDoc="0" locked="0" layoutInCell="1" relativeHeight="723900">
+            <wp:simplePos x="0" y="0"/>
+            <wp:positionH relativeFrom="page">
+              <wp:posOffset>9216000</wp:posOffset>
+            </wp:positionH>
+            <wp:positionV relativeFrom="page">
+              <wp:posOffset>6480000</wp:posOffset>
+            </wp:positionV>
+            <wp:extent cx="723900" cy="723900"/>
+            <wp:effectExtent t="0" r="0" b="0" l="0"/>
+            <wp:wrapNone/>
+            <wp:docPr id="1" name="" descr="" title=""/>
+            <wp:cNvGraphicFramePr>
+              <a:graphicFrameLocks xmlns:a="http://schemas.openxmlformats.org/drawingml/2006/main" noChangeAspect="1"/>
+            </wp:cNvGraphicFramePr>
+            <a:graphic xmlns:a="http://schemas.openxmlformats.org/drawingml/2006/main">
+              <a:graphicData uri="http://schemas.openxmlformats.org/drawingml/2006/picture">
+                <pic:pic xmlns:pic="http://schemas.openxmlformats.org/drawingml/2006/picture">
+                  <pic:nvPicPr>
+                    <pic:cNvPr id="0" name="" descr=""/>
+                    <pic:cNvPicPr>
+                      <a:picLocks noChangeAspect="1" noChangeArrowheads="1"/>
+                    </pic:cNvPicPr>
+                  </pic:nvPicPr>
+                  <pic:blipFill>
+                    <a:blip r:embed="rId10" cstate="none"/>
+                    <a:srcRect/>
+                    <a:stretch>
+                      <a:fillRect/>
+                    </a:stretch>
+                  </pic:blipFill>
+                  <pic:spPr bwMode="auto">
+                    <a:xfrm>
+                      <a:off x="0" y="0"/>
+                      <a:ext cx="723900" cy="723900"/>
+                    </a:xfrm>
+                    <a:prstGeom prst="rect">
+                      <a:avLst/>
+                    </a:prstGeom>
+                  </pic:spPr>
+                </pic:pic>
+              </a:graphicData>
+            </a:graphic>
+          </wp:anchor>
+        </w:drawing>
+      </w:r>
       <w:r>
         <w:rPr>
           <w:rFonts w:ascii="Arial Narrow" w:cs="Arial Narrow" w:eastAsia="Arial Narrow" w:hAnsi="Arial Narrow"/>
@@ -23775,6 +27135,102 @@
         <w:jc w:val="center"/>
       </w:pPr>
       <w:r>
+        <w:drawing>
+          <wp:anchor distT="0" distB="0" distL="0" distR="0" simplePos="0" allowOverlap="1" behindDoc="0" locked="0" layoutInCell="1" relativeHeight="762000">
+            <wp:simplePos x="0" y="0"/>
+            <wp:positionH relativeFrom="page">
+              <wp:posOffset>493200</wp:posOffset>
+            </wp:positionH>
+            <wp:positionV relativeFrom="page">
+              <wp:posOffset>6444000</wp:posOffset>
+            </wp:positionV>
+            <wp:extent cx="762000" cy="762000"/>
+            <wp:effectExtent t="0" r="0" b="0" l="0"/>
+            <wp:wrapNone/>
+            <wp:docPr id="1" name="" descr="" title=""/>
+            <wp:cNvGraphicFramePr>
+              <a:graphicFrameLocks xmlns:a="http://schemas.openxmlformats.org/drawingml/2006/main" noChangeAspect="1"/>
+            </wp:cNvGraphicFramePr>
+            <a:graphic xmlns:a="http://schemas.openxmlformats.org/drawingml/2006/main">
+              <a:graphicData uri="http://schemas.openxmlformats.org/drawingml/2006/picture">
+                <pic:pic xmlns:pic="http://schemas.openxmlformats.org/drawingml/2006/picture">
+                  <pic:nvPicPr>
+                    <pic:cNvPr id="0" name="" descr=""/>
+                    <pic:cNvPicPr>
+                      <a:picLocks noChangeAspect="1" noChangeArrowheads="1"/>
+                    </pic:cNvPicPr>
+                  </pic:nvPicPr>
+                  <pic:blipFill>
+                    <a:blip r:embed="rId9" cstate="none"/>
+                    <a:srcRect/>
+                    <a:stretch>
+                      <a:fillRect/>
+                    </a:stretch>
+                  </pic:blipFill>
+                  <pic:spPr bwMode="auto">
+                    <a:xfrm>
+                      <a:off x="0" y="0"/>
+                      <a:ext cx="762000" cy="762000"/>
+                    </a:xfrm>
+                    <a:prstGeom prst="rect">
+                      <a:avLst/>
+                    </a:prstGeom>
+                  </pic:spPr>
+                </pic:pic>
+              </a:graphicData>
+            </a:graphic>
+          </wp:anchor>
+        </w:drawing>
+      </w:r>
+      <w:r>
+        <w:drawing>
+          <wp:anchor distT="0" distB="0" distL="0" distR="0" simplePos="0" allowOverlap="1" behindDoc="0" locked="0" layoutInCell="1" relativeHeight="723900">
+            <wp:simplePos x="0" y="0"/>
+            <wp:positionH relativeFrom="page">
+              <wp:posOffset>9216000</wp:posOffset>
+            </wp:positionH>
+            <wp:positionV relativeFrom="page">
+              <wp:posOffset>6480000</wp:posOffset>
+            </wp:positionV>
+            <wp:extent cx="723900" cy="723900"/>
+            <wp:effectExtent t="0" r="0" b="0" l="0"/>
+            <wp:wrapNone/>
+            <wp:docPr id="1" name="" descr="" title=""/>
+            <wp:cNvGraphicFramePr>
+              <a:graphicFrameLocks xmlns:a="http://schemas.openxmlformats.org/drawingml/2006/main" noChangeAspect="1"/>
+            </wp:cNvGraphicFramePr>
+            <a:graphic xmlns:a="http://schemas.openxmlformats.org/drawingml/2006/main">
+              <a:graphicData uri="http://schemas.openxmlformats.org/drawingml/2006/picture">
+                <pic:pic xmlns:pic="http://schemas.openxmlformats.org/drawingml/2006/picture">
+                  <pic:nvPicPr>
+                    <pic:cNvPr id="0" name="" descr=""/>
+                    <pic:cNvPicPr>
+                      <a:picLocks noChangeAspect="1" noChangeArrowheads="1"/>
+                    </pic:cNvPicPr>
+                  </pic:nvPicPr>
+                  <pic:blipFill>
+                    <a:blip r:embed="rId10" cstate="none"/>
+                    <a:srcRect/>
+                    <a:stretch>
+                      <a:fillRect/>
+                    </a:stretch>
+                  </pic:blipFill>
+                  <pic:spPr bwMode="auto">
+                    <a:xfrm>
+                      <a:off x="0" y="0"/>
+                      <a:ext cx="723900" cy="723900"/>
+                    </a:xfrm>
+                    <a:prstGeom prst="rect">
+                      <a:avLst/>
+                    </a:prstGeom>
+                  </pic:spPr>
+                </pic:pic>
+              </a:graphicData>
+            </a:graphic>
+          </wp:anchor>
+        </w:drawing>
+      </w:r>
+      <w:r>
         <w:rPr>
           <w:rFonts w:ascii="Arial Narrow" w:cs="Arial Narrow" w:eastAsia="Arial Narrow" w:hAnsi="Arial Narrow"/>
           <w:b/>
@@ -24506,6 +27962,102 @@
         <w:spacing w:after="360"/>
         <w:jc w:val="center"/>
       </w:pPr>
+      <w:r>
+        <w:drawing>
+          <wp:anchor distT="0" distB="0" distL="0" distR="0" simplePos="0" allowOverlap="1" behindDoc="0" locked="0" layoutInCell="1" relativeHeight="762000">
+            <wp:simplePos x="0" y="0"/>
+            <wp:positionH relativeFrom="page">
+              <wp:posOffset>493200</wp:posOffset>
+            </wp:positionH>
+            <wp:positionV relativeFrom="page">
+              <wp:posOffset>6444000</wp:posOffset>
+            </wp:positionV>
+            <wp:extent cx="762000" cy="762000"/>
+            <wp:effectExtent t="0" r="0" b="0" l="0"/>
+            <wp:wrapNone/>
+            <wp:docPr id="1" name="" descr="" title=""/>
+            <wp:cNvGraphicFramePr>
+              <a:graphicFrameLocks xmlns:a="http://schemas.openxmlformats.org/drawingml/2006/main" noChangeAspect="1"/>
+            </wp:cNvGraphicFramePr>
+            <a:graphic xmlns:a="http://schemas.openxmlformats.org/drawingml/2006/main">
+              <a:graphicData uri="http://schemas.openxmlformats.org/drawingml/2006/picture">
+                <pic:pic xmlns:pic="http://schemas.openxmlformats.org/drawingml/2006/picture">
+                  <pic:nvPicPr>
+                    <pic:cNvPr id="0" name="" descr=""/>
+                    <pic:cNvPicPr>
+                      <a:picLocks noChangeAspect="1" noChangeArrowheads="1"/>
+                    </pic:cNvPicPr>
+                  </pic:nvPicPr>
+                  <pic:blipFill>
+                    <a:blip r:embed="rId9" cstate="none"/>
+                    <a:srcRect/>
+                    <a:stretch>
+                      <a:fillRect/>
+                    </a:stretch>
+                  </pic:blipFill>
+                  <pic:spPr bwMode="auto">
+                    <a:xfrm>
+                      <a:off x="0" y="0"/>
+                      <a:ext cx="762000" cy="762000"/>
+                    </a:xfrm>
+                    <a:prstGeom prst="rect">
+                      <a:avLst/>
+                    </a:prstGeom>
+                  </pic:spPr>
+                </pic:pic>
+              </a:graphicData>
+            </a:graphic>
+          </wp:anchor>
+        </w:drawing>
+      </w:r>
+      <w:r>
+        <w:drawing>
+          <wp:anchor distT="0" distB="0" distL="0" distR="0" simplePos="0" allowOverlap="1" behindDoc="0" locked="0" layoutInCell="1" relativeHeight="723900">
+            <wp:simplePos x="0" y="0"/>
+            <wp:positionH relativeFrom="page">
+              <wp:posOffset>9216000</wp:posOffset>
+            </wp:positionH>
+            <wp:positionV relativeFrom="page">
+              <wp:posOffset>6480000</wp:posOffset>
+            </wp:positionV>
+            <wp:extent cx="723900" cy="723900"/>
+            <wp:effectExtent t="0" r="0" b="0" l="0"/>
+            <wp:wrapNone/>
+            <wp:docPr id="1" name="" descr="" title=""/>
+            <wp:cNvGraphicFramePr>
+              <a:graphicFrameLocks xmlns:a="http://schemas.openxmlformats.org/drawingml/2006/main" noChangeAspect="1"/>
+            </wp:cNvGraphicFramePr>
+            <a:graphic xmlns:a="http://schemas.openxmlformats.org/drawingml/2006/main">
+              <a:graphicData uri="http://schemas.openxmlformats.org/drawingml/2006/picture">
+                <pic:pic xmlns:pic="http://schemas.openxmlformats.org/drawingml/2006/picture">
+                  <pic:nvPicPr>
+                    <pic:cNvPr id="0" name="" descr=""/>
+                    <pic:cNvPicPr>
+                      <a:picLocks noChangeAspect="1" noChangeArrowheads="1"/>
+                    </pic:cNvPicPr>
+                  </pic:nvPicPr>
+                  <pic:blipFill>
+                    <a:blip r:embed="rId10" cstate="none"/>
+                    <a:srcRect/>
+                    <a:stretch>
+                      <a:fillRect/>
+                    </a:stretch>
+                  </pic:blipFill>
+                  <pic:spPr bwMode="auto">
+                    <a:xfrm>
+                      <a:off x="0" y="0"/>
+                      <a:ext cx="723900" cy="723900"/>
+                    </a:xfrm>
+                    <a:prstGeom prst="rect">
+                      <a:avLst/>
+                    </a:prstGeom>
+                  </pic:spPr>
+                </pic:pic>
+              </a:graphicData>
+            </a:graphic>
+          </wp:anchor>
+        </w:drawing>
+      </w:r>
       <w:r>
         <w:rPr>
           <w:rFonts w:ascii="Arial Narrow" w:cs="Arial Narrow" w:eastAsia="Arial Narrow" w:hAnsi="Arial Narrow"/>
@@ -24816,6 +28368,102 @@
         <w:spacing w:after="60"/>
         <w:jc w:val="center"/>
       </w:pPr>
+      <w:r>
+        <w:drawing>
+          <wp:anchor distT="0" distB="0" distL="0" distR="0" simplePos="0" allowOverlap="1" behindDoc="0" locked="0" layoutInCell="1" relativeHeight="762000">
+            <wp:simplePos x="0" y="0"/>
+            <wp:positionH relativeFrom="page">
+              <wp:posOffset>493200</wp:posOffset>
+            </wp:positionH>
+            <wp:positionV relativeFrom="page">
+              <wp:posOffset>6444000</wp:posOffset>
+            </wp:positionV>
+            <wp:extent cx="762000" cy="762000"/>
+            <wp:effectExtent t="0" r="0" b="0" l="0"/>
+            <wp:wrapNone/>
+            <wp:docPr id="1" name="" descr="" title=""/>
+            <wp:cNvGraphicFramePr>
+              <a:graphicFrameLocks xmlns:a="http://schemas.openxmlformats.org/drawingml/2006/main" noChangeAspect="1"/>
+            </wp:cNvGraphicFramePr>
+            <a:graphic xmlns:a="http://schemas.openxmlformats.org/drawingml/2006/main">
+              <a:graphicData uri="http://schemas.openxmlformats.org/drawingml/2006/picture">
+                <pic:pic xmlns:pic="http://schemas.openxmlformats.org/drawingml/2006/picture">
+                  <pic:nvPicPr>
+                    <pic:cNvPr id="0" name="" descr=""/>
+                    <pic:cNvPicPr>
+                      <a:picLocks noChangeAspect="1" noChangeArrowheads="1"/>
+                    </pic:cNvPicPr>
+                  </pic:nvPicPr>
+                  <pic:blipFill>
+                    <a:blip r:embed="rId9" cstate="none"/>
+                    <a:srcRect/>
+                    <a:stretch>
+                      <a:fillRect/>
+                    </a:stretch>
+                  </pic:blipFill>
+                  <pic:spPr bwMode="auto">
+                    <a:xfrm>
+                      <a:off x="0" y="0"/>
+                      <a:ext cx="762000" cy="762000"/>
+                    </a:xfrm>
+                    <a:prstGeom prst="rect">
+                      <a:avLst/>
+                    </a:prstGeom>
+                  </pic:spPr>
+                </pic:pic>
+              </a:graphicData>
+            </a:graphic>
+          </wp:anchor>
+        </w:drawing>
+      </w:r>
+      <w:r>
+        <w:drawing>
+          <wp:anchor distT="0" distB="0" distL="0" distR="0" simplePos="0" allowOverlap="1" behindDoc="0" locked="0" layoutInCell="1" relativeHeight="723900">
+            <wp:simplePos x="0" y="0"/>
+            <wp:positionH relativeFrom="page">
+              <wp:posOffset>9216000</wp:posOffset>
+            </wp:positionH>
+            <wp:positionV relativeFrom="page">
+              <wp:posOffset>6480000</wp:posOffset>
+            </wp:positionV>
+            <wp:extent cx="723900" cy="723900"/>
+            <wp:effectExtent t="0" r="0" b="0" l="0"/>
+            <wp:wrapNone/>
+            <wp:docPr id="1" name="" descr="" title=""/>
+            <wp:cNvGraphicFramePr>
+              <a:graphicFrameLocks xmlns:a="http://schemas.openxmlformats.org/drawingml/2006/main" noChangeAspect="1"/>
+            </wp:cNvGraphicFramePr>
+            <a:graphic xmlns:a="http://schemas.openxmlformats.org/drawingml/2006/main">
+              <a:graphicData uri="http://schemas.openxmlformats.org/drawingml/2006/picture">
+                <pic:pic xmlns:pic="http://schemas.openxmlformats.org/drawingml/2006/picture">
+                  <pic:nvPicPr>
+                    <pic:cNvPr id="0" name="" descr=""/>
+                    <pic:cNvPicPr>
+                      <a:picLocks noChangeAspect="1" noChangeArrowheads="1"/>
+                    </pic:cNvPicPr>
+                  </pic:nvPicPr>
+                  <pic:blipFill>
+                    <a:blip r:embed="rId10" cstate="none"/>
+                    <a:srcRect/>
+                    <a:stretch>
+                      <a:fillRect/>
+                    </a:stretch>
+                  </pic:blipFill>
+                  <pic:spPr bwMode="auto">
+                    <a:xfrm>
+                      <a:off x="0" y="0"/>
+                      <a:ext cx="723900" cy="723900"/>
+                    </a:xfrm>
+                    <a:prstGeom prst="rect">
+                      <a:avLst/>
+                    </a:prstGeom>
+                  </pic:spPr>
+                </pic:pic>
+              </a:graphicData>
+            </a:graphic>
+          </wp:anchor>
+        </w:drawing>
+      </w:r>
       <w:r>
         <w:rPr>
           <w:rFonts w:ascii="Arial Narrow" w:cs="Arial Narrow" w:eastAsia="Arial Narrow" w:hAnsi="Arial Narrow"/>
@@ -25510,6 +29158,102 @@
         <w:jc w:val="center"/>
       </w:pPr>
       <w:r>
+        <w:drawing>
+          <wp:anchor distT="0" distB="0" distL="0" distR="0" simplePos="0" allowOverlap="1" behindDoc="0" locked="0" layoutInCell="1" relativeHeight="762000">
+            <wp:simplePos x="0" y="0"/>
+            <wp:positionH relativeFrom="page">
+              <wp:posOffset>493200</wp:posOffset>
+            </wp:positionH>
+            <wp:positionV relativeFrom="page">
+              <wp:posOffset>6444000</wp:posOffset>
+            </wp:positionV>
+            <wp:extent cx="762000" cy="762000"/>
+            <wp:effectExtent t="0" r="0" b="0" l="0"/>
+            <wp:wrapNone/>
+            <wp:docPr id="1" name="" descr="" title=""/>
+            <wp:cNvGraphicFramePr>
+              <a:graphicFrameLocks xmlns:a="http://schemas.openxmlformats.org/drawingml/2006/main" noChangeAspect="1"/>
+            </wp:cNvGraphicFramePr>
+            <a:graphic xmlns:a="http://schemas.openxmlformats.org/drawingml/2006/main">
+              <a:graphicData uri="http://schemas.openxmlformats.org/drawingml/2006/picture">
+                <pic:pic xmlns:pic="http://schemas.openxmlformats.org/drawingml/2006/picture">
+                  <pic:nvPicPr>
+                    <pic:cNvPr id="0" name="" descr=""/>
+                    <pic:cNvPicPr>
+                      <a:picLocks noChangeAspect="1" noChangeArrowheads="1"/>
+                    </pic:cNvPicPr>
+                  </pic:nvPicPr>
+                  <pic:blipFill>
+                    <a:blip r:embed="rId9" cstate="none"/>
+                    <a:srcRect/>
+                    <a:stretch>
+                      <a:fillRect/>
+                    </a:stretch>
+                  </pic:blipFill>
+                  <pic:spPr bwMode="auto">
+                    <a:xfrm>
+                      <a:off x="0" y="0"/>
+                      <a:ext cx="762000" cy="762000"/>
+                    </a:xfrm>
+                    <a:prstGeom prst="rect">
+                      <a:avLst/>
+                    </a:prstGeom>
+                  </pic:spPr>
+                </pic:pic>
+              </a:graphicData>
+            </a:graphic>
+          </wp:anchor>
+        </w:drawing>
+      </w:r>
+      <w:r>
+        <w:drawing>
+          <wp:anchor distT="0" distB="0" distL="0" distR="0" simplePos="0" allowOverlap="1" behindDoc="0" locked="0" layoutInCell="1" relativeHeight="723900">
+            <wp:simplePos x="0" y="0"/>
+            <wp:positionH relativeFrom="page">
+              <wp:posOffset>9216000</wp:posOffset>
+            </wp:positionH>
+            <wp:positionV relativeFrom="page">
+              <wp:posOffset>6480000</wp:posOffset>
+            </wp:positionV>
+            <wp:extent cx="723900" cy="723900"/>
+            <wp:effectExtent t="0" r="0" b="0" l="0"/>
+            <wp:wrapNone/>
+            <wp:docPr id="1" name="" descr="" title=""/>
+            <wp:cNvGraphicFramePr>
+              <a:graphicFrameLocks xmlns:a="http://schemas.openxmlformats.org/drawingml/2006/main" noChangeAspect="1"/>
+            </wp:cNvGraphicFramePr>
+            <a:graphic xmlns:a="http://schemas.openxmlformats.org/drawingml/2006/main">
+              <a:graphicData uri="http://schemas.openxmlformats.org/drawingml/2006/picture">
+                <pic:pic xmlns:pic="http://schemas.openxmlformats.org/drawingml/2006/picture">
+                  <pic:nvPicPr>
+                    <pic:cNvPr id="0" name="" descr=""/>
+                    <pic:cNvPicPr>
+                      <a:picLocks noChangeAspect="1" noChangeArrowheads="1"/>
+                    </pic:cNvPicPr>
+                  </pic:nvPicPr>
+                  <pic:blipFill>
+                    <a:blip r:embed="rId10" cstate="none"/>
+                    <a:srcRect/>
+                    <a:stretch>
+                      <a:fillRect/>
+                    </a:stretch>
+                  </pic:blipFill>
+                  <pic:spPr bwMode="auto">
+                    <a:xfrm>
+                      <a:off x="0" y="0"/>
+                      <a:ext cx="723900" cy="723900"/>
+                    </a:xfrm>
+                    <a:prstGeom prst="rect">
+                      <a:avLst/>
+                    </a:prstGeom>
+                  </pic:spPr>
+                </pic:pic>
+              </a:graphicData>
+            </a:graphic>
+          </wp:anchor>
+        </w:drawing>
+      </w:r>
+      <w:r>
         <w:rPr>
           <w:rFonts w:ascii="Arial Narrow" w:cs="Arial Narrow" w:eastAsia="Arial Narrow" w:hAnsi="Arial Narrow"/>
           <w:b/>
@@ -26045,6 +29789,102 @@
         <w:jc w:val="center"/>
       </w:pPr>
       <w:r>
+        <w:drawing>
+          <wp:anchor distT="0" distB="0" distL="0" distR="0" simplePos="0" allowOverlap="1" behindDoc="0" locked="0" layoutInCell="1" relativeHeight="762000">
+            <wp:simplePos x="0" y="0"/>
+            <wp:positionH relativeFrom="page">
+              <wp:posOffset>493200</wp:posOffset>
+            </wp:positionH>
+            <wp:positionV relativeFrom="page">
+              <wp:posOffset>6444000</wp:posOffset>
+            </wp:positionV>
+            <wp:extent cx="762000" cy="762000"/>
+            <wp:effectExtent t="0" r="0" b="0" l="0"/>
+            <wp:wrapNone/>
+            <wp:docPr id="1" name="" descr="" title=""/>
+            <wp:cNvGraphicFramePr>
+              <a:graphicFrameLocks xmlns:a="http://schemas.openxmlformats.org/drawingml/2006/main" noChangeAspect="1"/>
+            </wp:cNvGraphicFramePr>
+            <a:graphic xmlns:a="http://schemas.openxmlformats.org/drawingml/2006/main">
+              <a:graphicData uri="http://schemas.openxmlformats.org/drawingml/2006/picture">
+                <pic:pic xmlns:pic="http://schemas.openxmlformats.org/drawingml/2006/picture">
+                  <pic:nvPicPr>
+                    <pic:cNvPr id="0" name="" descr=""/>
+                    <pic:cNvPicPr>
+                      <a:picLocks noChangeAspect="1" noChangeArrowheads="1"/>
+                    </pic:cNvPicPr>
+                  </pic:nvPicPr>
+                  <pic:blipFill>
+                    <a:blip r:embed="rId9" cstate="none"/>
+                    <a:srcRect/>
+                    <a:stretch>
+                      <a:fillRect/>
+                    </a:stretch>
+                  </pic:blipFill>
+                  <pic:spPr bwMode="auto">
+                    <a:xfrm>
+                      <a:off x="0" y="0"/>
+                      <a:ext cx="762000" cy="762000"/>
+                    </a:xfrm>
+                    <a:prstGeom prst="rect">
+                      <a:avLst/>
+                    </a:prstGeom>
+                  </pic:spPr>
+                </pic:pic>
+              </a:graphicData>
+            </a:graphic>
+          </wp:anchor>
+        </w:drawing>
+      </w:r>
+      <w:r>
+        <w:drawing>
+          <wp:anchor distT="0" distB="0" distL="0" distR="0" simplePos="0" allowOverlap="1" behindDoc="0" locked="0" layoutInCell="1" relativeHeight="723900">
+            <wp:simplePos x="0" y="0"/>
+            <wp:positionH relativeFrom="page">
+              <wp:posOffset>9216000</wp:posOffset>
+            </wp:positionH>
+            <wp:positionV relativeFrom="page">
+              <wp:posOffset>6480000</wp:posOffset>
+            </wp:positionV>
+            <wp:extent cx="723900" cy="723900"/>
+            <wp:effectExtent t="0" r="0" b="0" l="0"/>
+            <wp:wrapNone/>
+            <wp:docPr id="1" name="" descr="" title=""/>
+            <wp:cNvGraphicFramePr>
+              <a:graphicFrameLocks xmlns:a="http://schemas.openxmlformats.org/drawingml/2006/main" noChangeAspect="1"/>
+            </wp:cNvGraphicFramePr>
+            <a:graphic xmlns:a="http://schemas.openxmlformats.org/drawingml/2006/main">
+              <a:graphicData uri="http://schemas.openxmlformats.org/drawingml/2006/picture">
+                <pic:pic xmlns:pic="http://schemas.openxmlformats.org/drawingml/2006/picture">
+                  <pic:nvPicPr>
+                    <pic:cNvPr id="0" name="" descr=""/>
+                    <pic:cNvPicPr>
+                      <a:picLocks noChangeAspect="1" noChangeArrowheads="1"/>
+                    </pic:cNvPicPr>
+                  </pic:nvPicPr>
+                  <pic:blipFill>
+                    <a:blip r:embed="rId10" cstate="none"/>
+                    <a:srcRect/>
+                    <a:stretch>
+                      <a:fillRect/>
+                    </a:stretch>
+                  </pic:blipFill>
+                  <pic:spPr bwMode="auto">
+                    <a:xfrm>
+                      <a:off x="0" y="0"/>
+                      <a:ext cx="723900" cy="723900"/>
+                    </a:xfrm>
+                    <a:prstGeom prst="rect">
+                      <a:avLst/>
+                    </a:prstGeom>
+                  </pic:spPr>
+                </pic:pic>
+              </a:graphicData>
+            </a:graphic>
+          </wp:anchor>
+        </w:drawing>
+      </w:r>
+      <w:r>
         <w:rPr>
           <w:rFonts w:ascii="Arial Narrow" w:cs="Arial Narrow" w:eastAsia="Arial Narrow" w:hAnsi="Arial Narrow"/>
           <w:b/>
@@ -26682,6 +30522,102 @@
         <w:spacing w:after="360"/>
         <w:jc w:val="center"/>
       </w:pPr>
+      <w:r>
+        <w:drawing>
+          <wp:anchor distT="0" distB="0" distL="0" distR="0" simplePos="0" allowOverlap="1" behindDoc="0" locked="0" layoutInCell="1" relativeHeight="762000">
+            <wp:simplePos x="0" y="0"/>
+            <wp:positionH relativeFrom="page">
+              <wp:posOffset>493200</wp:posOffset>
+            </wp:positionH>
+            <wp:positionV relativeFrom="page">
+              <wp:posOffset>6444000</wp:posOffset>
+            </wp:positionV>
+            <wp:extent cx="762000" cy="762000"/>
+            <wp:effectExtent t="0" r="0" b="0" l="0"/>
+            <wp:wrapNone/>
+            <wp:docPr id="1" name="" descr="" title=""/>
+            <wp:cNvGraphicFramePr>
+              <a:graphicFrameLocks xmlns:a="http://schemas.openxmlformats.org/drawingml/2006/main" noChangeAspect="1"/>
+            </wp:cNvGraphicFramePr>
+            <a:graphic xmlns:a="http://schemas.openxmlformats.org/drawingml/2006/main">
+              <a:graphicData uri="http://schemas.openxmlformats.org/drawingml/2006/picture">
+                <pic:pic xmlns:pic="http://schemas.openxmlformats.org/drawingml/2006/picture">
+                  <pic:nvPicPr>
+                    <pic:cNvPr id="0" name="" descr=""/>
+                    <pic:cNvPicPr>
+                      <a:picLocks noChangeAspect="1" noChangeArrowheads="1"/>
+                    </pic:cNvPicPr>
+                  </pic:nvPicPr>
+                  <pic:blipFill>
+                    <a:blip r:embed="rId9" cstate="none"/>
+                    <a:srcRect/>
+                    <a:stretch>
+                      <a:fillRect/>
+                    </a:stretch>
+                  </pic:blipFill>
+                  <pic:spPr bwMode="auto">
+                    <a:xfrm>
+                      <a:off x="0" y="0"/>
+                      <a:ext cx="762000" cy="762000"/>
+                    </a:xfrm>
+                    <a:prstGeom prst="rect">
+                      <a:avLst/>
+                    </a:prstGeom>
+                  </pic:spPr>
+                </pic:pic>
+              </a:graphicData>
+            </a:graphic>
+          </wp:anchor>
+        </w:drawing>
+      </w:r>
+      <w:r>
+        <w:drawing>
+          <wp:anchor distT="0" distB="0" distL="0" distR="0" simplePos="0" allowOverlap="1" behindDoc="0" locked="0" layoutInCell="1" relativeHeight="723900">
+            <wp:simplePos x="0" y="0"/>
+            <wp:positionH relativeFrom="page">
+              <wp:posOffset>9216000</wp:posOffset>
+            </wp:positionH>
+            <wp:positionV relativeFrom="page">
+              <wp:posOffset>6480000</wp:posOffset>
+            </wp:positionV>
+            <wp:extent cx="723900" cy="723900"/>
+            <wp:effectExtent t="0" r="0" b="0" l="0"/>
+            <wp:wrapNone/>
+            <wp:docPr id="1" name="" descr="" title=""/>
+            <wp:cNvGraphicFramePr>
+              <a:graphicFrameLocks xmlns:a="http://schemas.openxmlformats.org/drawingml/2006/main" noChangeAspect="1"/>
+            </wp:cNvGraphicFramePr>
+            <a:graphic xmlns:a="http://schemas.openxmlformats.org/drawingml/2006/main">
+              <a:graphicData uri="http://schemas.openxmlformats.org/drawingml/2006/picture">
+                <pic:pic xmlns:pic="http://schemas.openxmlformats.org/drawingml/2006/picture">
+                  <pic:nvPicPr>
+                    <pic:cNvPr id="0" name="" descr=""/>
+                    <pic:cNvPicPr>
+                      <a:picLocks noChangeAspect="1" noChangeArrowheads="1"/>
+                    </pic:cNvPicPr>
+                  </pic:nvPicPr>
+                  <pic:blipFill>
+                    <a:blip r:embed="rId10" cstate="none"/>
+                    <a:srcRect/>
+                    <a:stretch>
+                      <a:fillRect/>
+                    </a:stretch>
+                  </pic:blipFill>
+                  <pic:spPr bwMode="auto">
+                    <a:xfrm>
+                      <a:off x="0" y="0"/>
+                      <a:ext cx="723900" cy="723900"/>
+                    </a:xfrm>
+                    <a:prstGeom prst="rect">
+                      <a:avLst/>
+                    </a:prstGeom>
+                  </pic:spPr>
+                </pic:pic>
+              </a:graphicData>
+            </a:graphic>
+          </wp:anchor>
+        </w:drawing>
+      </w:r>
       <w:r>
         <w:rPr>
           <w:rFonts w:ascii="Arial Narrow" w:cs="Arial Narrow" w:eastAsia="Arial Narrow" w:hAnsi="Arial Narrow"/>
@@ -27364,6 +31300,102 @@
         <w:jc w:val="center"/>
       </w:pPr>
       <w:r>
+        <w:drawing>
+          <wp:anchor distT="0" distB="0" distL="0" distR="0" simplePos="0" allowOverlap="1" behindDoc="0" locked="0" layoutInCell="1" relativeHeight="762000">
+            <wp:simplePos x="0" y="0"/>
+            <wp:positionH relativeFrom="page">
+              <wp:posOffset>493200</wp:posOffset>
+            </wp:positionH>
+            <wp:positionV relativeFrom="page">
+              <wp:posOffset>6444000</wp:posOffset>
+            </wp:positionV>
+            <wp:extent cx="762000" cy="762000"/>
+            <wp:effectExtent t="0" r="0" b="0" l="0"/>
+            <wp:wrapNone/>
+            <wp:docPr id="1" name="" descr="" title=""/>
+            <wp:cNvGraphicFramePr>
+              <a:graphicFrameLocks xmlns:a="http://schemas.openxmlformats.org/drawingml/2006/main" noChangeAspect="1"/>
+            </wp:cNvGraphicFramePr>
+            <a:graphic xmlns:a="http://schemas.openxmlformats.org/drawingml/2006/main">
+              <a:graphicData uri="http://schemas.openxmlformats.org/drawingml/2006/picture">
+                <pic:pic xmlns:pic="http://schemas.openxmlformats.org/drawingml/2006/picture">
+                  <pic:nvPicPr>
+                    <pic:cNvPr id="0" name="" descr=""/>
+                    <pic:cNvPicPr>
+                      <a:picLocks noChangeAspect="1" noChangeArrowheads="1"/>
+                    </pic:cNvPicPr>
+                  </pic:nvPicPr>
+                  <pic:blipFill>
+                    <a:blip r:embed="rId9" cstate="none"/>
+                    <a:srcRect/>
+                    <a:stretch>
+                      <a:fillRect/>
+                    </a:stretch>
+                  </pic:blipFill>
+                  <pic:spPr bwMode="auto">
+                    <a:xfrm>
+                      <a:off x="0" y="0"/>
+                      <a:ext cx="762000" cy="762000"/>
+                    </a:xfrm>
+                    <a:prstGeom prst="rect">
+                      <a:avLst/>
+                    </a:prstGeom>
+                  </pic:spPr>
+                </pic:pic>
+              </a:graphicData>
+            </a:graphic>
+          </wp:anchor>
+        </w:drawing>
+      </w:r>
+      <w:r>
+        <w:drawing>
+          <wp:anchor distT="0" distB="0" distL="0" distR="0" simplePos="0" allowOverlap="1" behindDoc="0" locked="0" layoutInCell="1" relativeHeight="723900">
+            <wp:simplePos x="0" y="0"/>
+            <wp:positionH relativeFrom="page">
+              <wp:posOffset>9216000</wp:posOffset>
+            </wp:positionH>
+            <wp:positionV relativeFrom="page">
+              <wp:posOffset>6480000</wp:posOffset>
+            </wp:positionV>
+            <wp:extent cx="723900" cy="723900"/>
+            <wp:effectExtent t="0" r="0" b="0" l="0"/>
+            <wp:wrapNone/>
+            <wp:docPr id="1" name="" descr="" title=""/>
+            <wp:cNvGraphicFramePr>
+              <a:graphicFrameLocks xmlns:a="http://schemas.openxmlformats.org/drawingml/2006/main" noChangeAspect="1"/>
+            </wp:cNvGraphicFramePr>
+            <a:graphic xmlns:a="http://schemas.openxmlformats.org/drawingml/2006/main">
+              <a:graphicData uri="http://schemas.openxmlformats.org/drawingml/2006/picture">
+                <pic:pic xmlns:pic="http://schemas.openxmlformats.org/drawingml/2006/picture">
+                  <pic:nvPicPr>
+                    <pic:cNvPr id="0" name="" descr=""/>
+                    <pic:cNvPicPr>
+                      <a:picLocks noChangeAspect="1" noChangeArrowheads="1"/>
+                    </pic:cNvPicPr>
+                  </pic:nvPicPr>
+                  <pic:blipFill>
+                    <a:blip r:embed="rId10" cstate="none"/>
+                    <a:srcRect/>
+                    <a:stretch>
+                      <a:fillRect/>
+                    </a:stretch>
+                  </pic:blipFill>
+                  <pic:spPr bwMode="auto">
+                    <a:xfrm>
+                      <a:off x="0" y="0"/>
+                      <a:ext cx="723900" cy="723900"/>
+                    </a:xfrm>
+                    <a:prstGeom prst="rect">
+                      <a:avLst/>
+                    </a:prstGeom>
+                  </pic:spPr>
+                </pic:pic>
+              </a:graphicData>
+            </a:graphic>
+          </wp:anchor>
+        </w:drawing>
+      </w:r>
+      <w:r>
         <w:rPr>
           <w:rFonts w:ascii="Arial Narrow" w:cs="Arial Narrow" w:eastAsia="Arial Narrow" w:hAnsi="Arial Narrow"/>
           <w:b/>
@@ -27901,6 +31933,102 @@
         <w:spacing w:after="60"/>
         <w:jc w:val="center"/>
       </w:pPr>
+      <w:r>
+        <w:drawing>
+          <wp:anchor distT="0" distB="0" distL="0" distR="0" simplePos="0" allowOverlap="1" behindDoc="0" locked="0" layoutInCell="1" relativeHeight="762000">
+            <wp:simplePos x="0" y="0"/>
+            <wp:positionH relativeFrom="page">
+              <wp:posOffset>493200</wp:posOffset>
+            </wp:positionH>
+            <wp:positionV relativeFrom="page">
+              <wp:posOffset>6444000</wp:posOffset>
+            </wp:positionV>
+            <wp:extent cx="762000" cy="762000"/>
+            <wp:effectExtent t="0" r="0" b="0" l="0"/>
+            <wp:wrapNone/>
+            <wp:docPr id="1" name="" descr="" title=""/>
+            <wp:cNvGraphicFramePr>
+              <a:graphicFrameLocks xmlns:a="http://schemas.openxmlformats.org/drawingml/2006/main" noChangeAspect="1"/>
+            </wp:cNvGraphicFramePr>
+            <a:graphic xmlns:a="http://schemas.openxmlformats.org/drawingml/2006/main">
+              <a:graphicData uri="http://schemas.openxmlformats.org/drawingml/2006/picture">
+                <pic:pic xmlns:pic="http://schemas.openxmlformats.org/drawingml/2006/picture">
+                  <pic:nvPicPr>
+                    <pic:cNvPr id="0" name="" descr=""/>
+                    <pic:cNvPicPr>
+                      <a:picLocks noChangeAspect="1" noChangeArrowheads="1"/>
+                    </pic:cNvPicPr>
+                  </pic:nvPicPr>
+                  <pic:blipFill>
+                    <a:blip r:embed="rId9" cstate="none"/>
+                    <a:srcRect/>
+                    <a:stretch>
+                      <a:fillRect/>
+                    </a:stretch>
+                  </pic:blipFill>
+                  <pic:spPr bwMode="auto">
+                    <a:xfrm>
+                      <a:off x="0" y="0"/>
+                      <a:ext cx="762000" cy="762000"/>
+                    </a:xfrm>
+                    <a:prstGeom prst="rect">
+                      <a:avLst/>
+                    </a:prstGeom>
+                  </pic:spPr>
+                </pic:pic>
+              </a:graphicData>
+            </a:graphic>
+          </wp:anchor>
+        </w:drawing>
+      </w:r>
+      <w:r>
+        <w:drawing>
+          <wp:anchor distT="0" distB="0" distL="0" distR="0" simplePos="0" allowOverlap="1" behindDoc="0" locked="0" layoutInCell="1" relativeHeight="723900">
+            <wp:simplePos x="0" y="0"/>
+            <wp:positionH relativeFrom="page">
+              <wp:posOffset>9216000</wp:posOffset>
+            </wp:positionH>
+            <wp:positionV relativeFrom="page">
+              <wp:posOffset>6480000</wp:posOffset>
+            </wp:positionV>
+            <wp:extent cx="723900" cy="723900"/>
+            <wp:effectExtent t="0" r="0" b="0" l="0"/>
+            <wp:wrapNone/>
+            <wp:docPr id="1" name="" descr="" title=""/>
+            <wp:cNvGraphicFramePr>
+              <a:graphicFrameLocks xmlns:a="http://schemas.openxmlformats.org/drawingml/2006/main" noChangeAspect="1"/>
+            </wp:cNvGraphicFramePr>
+            <a:graphic xmlns:a="http://schemas.openxmlformats.org/drawingml/2006/main">
+              <a:graphicData uri="http://schemas.openxmlformats.org/drawingml/2006/picture">
+                <pic:pic xmlns:pic="http://schemas.openxmlformats.org/drawingml/2006/picture">
+                  <pic:nvPicPr>
+                    <pic:cNvPr id="0" name="" descr=""/>
+                    <pic:cNvPicPr>
+                      <a:picLocks noChangeAspect="1" noChangeArrowheads="1"/>
+                    </pic:cNvPicPr>
+                  </pic:nvPicPr>
+                  <pic:blipFill>
+                    <a:blip r:embed="rId10" cstate="none"/>
+                    <a:srcRect/>
+                    <a:stretch>
+                      <a:fillRect/>
+                    </a:stretch>
+                  </pic:blipFill>
+                  <pic:spPr bwMode="auto">
+                    <a:xfrm>
+                      <a:off x="0" y="0"/>
+                      <a:ext cx="723900" cy="723900"/>
+                    </a:xfrm>
+                    <a:prstGeom prst="rect">
+                      <a:avLst/>
+                    </a:prstGeom>
+                  </pic:spPr>
+                </pic:pic>
+              </a:graphicData>
+            </a:graphic>
+          </wp:anchor>
+        </w:drawing>
+      </w:r>
       <w:r>
         <w:rPr>
           <w:rFonts w:ascii="Arial Narrow" w:cs="Arial Narrow" w:eastAsia="Arial Narrow" w:hAnsi="Arial Narrow"/>
@@ -28507,172 +32635,28 @@
 
 <file path=word/footer2.xml><?xml version="1.0" encoding="utf-8"?>
 <w:ftr xmlns:wpc="http://schemas.microsoft.com/office/word/2010/wordprocessingCanvas" xmlns:mc="http://schemas.openxmlformats.org/markup-compatibility/2006" xmlns:o="urn:schemas-microsoft-com:office:office" xmlns:r="http://schemas.openxmlformats.org/officeDocument/2006/relationships" xmlns:m="http://schemas.openxmlformats.org/officeDocument/2006/math" xmlns:v="urn:schemas-microsoft-com:vml" xmlns:wp14="http://schemas.microsoft.com/office/word/2010/wordprocessingDrawing" xmlns:wp="http://schemas.openxmlformats.org/drawingml/2006/wordprocessingDrawing" xmlns:w10="urn:schemas-microsoft-com:office:word" xmlns:w="http://schemas.openxmlformats.org/wordprocessingml/2006/main" xmlns:w14="http://schemas.microsoft.com/office/word/2010/wordml" xmlns:w15="http://schemas.microsoft.com/office/word/2012/wordml" xmlns:wpg="http://schemas.microsoft.com/office/word/2010/wordprocessingGroup" xmlns:wpi="http://schemas.microsoft.com/office/word/2010/wordprocessingInk" xmlns:wne="http://schemas.microsoft.com/office/word/2006/wordml" xmlns:wps="http://schemas.microsoft.com/office/word/2010/wordprocessingShape">
-  <w:tbl>
-    <w:tblPr>
-      <w:tblW w:type="dxa" w:w="15398"/>
-      <w:tblBorders>
-        <w:top w:val="none" w:color="FFFFFF" w:sz="0"/>
-        <w:left w:val="none" w:color="FFFFFF" w:sz="0"/>
-        <w:bottom w:val="none" w:color="FFFFFF" w:sz="0"/>
-        <w:right w:val="none" w:color="FFFFFF" w:sz="0"/>
-        <w:insideH w:val="none" w:color="FFFFFF" w:sz="0"/>
-        <w:insideV w:val="none" w:color="FFFFFF" w:sz="0"/>
-      </w:tblBorders>
-    </w:tblPr>
-    <w:tblGrid>
-      <w:gridCol w:w="3000"/>
-      <w:gridCol w:w="9398"/>
-      <w:gridCol w:w="3000"/>
-    </w:tblGrid>
-    <w:tr>
-      <w:tc>
-        <w:tcPr>
-          <w:tcW w:type="dxa" w:w="3000"/>
-          <w:tcBorders>
-            <w:top w:val="none" w:color="FFFFFF" w:sz="0"/>
-            <w:left w:val="none" w:color="FFFFFF" w:sz="0"/>
-            <w:bottom w:val="none" w:color="FFFFFF" w:sz="0"/>
-            <w:right w:val="none" w:color="FFFFFF" w:sz="0"/>
-          </w:tcBorders>
-          <w:vAlign w:val="bottom"/>
-        </w:tcPr>
-        <w:p>
-          <w:r>
-            <w:drawing>
-              <wp:inline distT="0" distB="0" distL="0" distR="0">
-                <wp:extent cx="762000" cy="762000"/>
-                <wp:effectExtent t="0" r="0" b="0" l="0"/>
-                <wp:docPr id="1" name="" descr="" title=""/>
-                <wp:cNvGraphicFramePr>
-                  <a:graphicFrameLocks xmlns:a="http://schemas.openxmlformats.org/drawingml/2006/main" noChangeAspect="1"/>
-                </wp:cNvGraphicFramePr>
-                <a:graphic xmlns:a="http://schemas.openxmlformats.org/drawingml/2006/main">
-                  <a:graphicData uri="http://schemas.openxmlformats.org/drawingml/2006/picture">
-                    <pic:pic xmlns:pic="http://schemas.openxmlformats.org/drawingml/2006/picture">
-                      <pic:nvPicPr>
-                        <pic:cNvPr id="0" name="" descr=""/>
-                        <pic:cNvPicPr>
-                          <a:picLocks noChangeAspect="1" noChangeArrowheads="1"/>
-                        </pic:cNvPicPr>
-                      </pic:nvPicPr>
-                      <pic:blipFill>
-                        <a:blip r:embed="rId0" cstate="none"/>
-                        <a:srcRect/>
-                        <a:stretch>
-                          <a:fillRect/>
-                        </a:stretch>
-                      </pic:blipFill>
-                      <pic:spPr bwMode="auto">
-                        <a:xfrm>
-                          <a:off x="0" y="0"/>
-                          <a:ext cx="762000" cy="762000"/>
-                        </a:xfrm>
-                        <a:prstGeom prst="rect">
-                          <a:avLst/>
-                        </a:prstGeom>
-                      </pic:spPr>
-                    </pic:pic>
-                  </a:graphicData>
-                </a:graphic>
-              </wp:inline>
-            </w:drawing>
-          </w:r>
-        </w:p>
-      </w:tc>
-      <w:tc>
-        <w:tcPr>
-          <w:tcW w:type="dxa" w:w="9398"/>
-          <w:tcBorders>
-            <w:top w:val="none" w:color="FFFFFF" w:sz="0"/>
-            <w:left w:val="none" w:color="FFFFFF" w:sz="0"/>
-            <w:bottom w:val="none" w:color="FFFFFF" w:sz="0"/>
-            <w:right w:val="none" w:color="FFFFFF" w:sz="0"/>
-          </w:tcBorders>
-          <w:vAlign w:val="top"/>
-        </w:tcPr>
-        <w:p>
-          <w:pPr>
-            <w:jc w:val="center"/>
-          </w:pPr>
-          <w:r>
-            <w:rPr>
-              <w:rFonts w:ascii="Times New Roman" w:cs="Times New Roman" w:eastAsia="Times New Roman" w:hAnsi="Times New Roman"/>
-              <w:sz w:val="24"/>
-              <w:szCs w:val="24"/>
-            </w:rPr>
-            <w:fldChar w:fldCharType="begin"/>
-            <w:instrText xml:space="preserve">PAGE</w:instrText>
-            <w:fldChar w:fldCharType="separate"/>
-            <w:fldChar w:fldCharType="end"/>
-          </w:r>
-        </w:p>
-      </w:tc>
-      <w:tc>
-        <w:tcPr>
-          <w:tcW w:type="dxa" w:w="3000"/>
-          <w:tcBorders>
-            <w:top w:val="none" w:color="FFFFFF" w:sz="0"/>
-            <w:left w:val="none" w:color="FFFFFF" w:sz="0"/>
-            <w:bottom w:val="none" w:color="FFFFFF" w:sz="0"/>
-            <w:right w:val="none" w:color="FFFFFF" w:sz="0"/>
-          </w:tcBorders>
-          <w:vAlign w:val="bottom"/>
-        </w:tcPr>
-        <w:p>
-          <w:pPr>
-            <w:ind w:right="500"/>
-            <w:jc w:val="right"/>
-          </w:pPr>
-          <w:r>
-            <w:drawing>
-              <wp:inline distT="0" distB="0" distL="0" distR="0">
-                <wp:extent cx="723900" cy="723900"/>
-                <wp:effectExtent t="0" r="0" b="0" l="0"/>
-                <wp:docPr id="1" name="" descr="" title=""/>
-                <wp:cNvGraphicFramePr>
-                  <a:graphicFrameLocks xmlns:a="http://schemas.openxmlformats.org/drawingml/2006/main" noChangeAspect="1"/>
-                </wp:cNvGraphicFramePr>
-                <a:graphic xmlns:a="http://schemas.openxmlformats.org/drawingml/2006/main">
-                  <a:graphicData uri="http://schemas.openxmlformats.org/drawingml/2006/picture">
-                    <pic:pic xmlns:pic="http://schemas.openxmlformats.org/drawingml/2006/picture">
-                      <pic:nvPicPr>
-                        <pic:cNvPr id="0" name="" descr=""/>
-                        <pic:cNvPicPr>
-                          <a:picLocks noChangeAspect="1" noChangeArrowheads="1"/>
-                        </pic:cNvPicPr>
-                      </pic:nvPicPr>
-                      <pic:blipFill>
-                        <a:blip r:embed="rId1" cstate="none"/>
-                        <a:srcRect/>
-                        <a:stretch>
-                          <a:fillRect/>
-                        </a:stretch>
-                      </pic:blipFill>
-                      <pic:spPr bwMode="auto">
-                        <a:xfrm>
-                          <a:off x="0" y="0"/>
-                          <a:ext cx="723900" cy="723900"/>
-                        </a:xfrm>
-                        <a:prstGeom prst="rect">
-                          <a:avLst/>
-                        </a:prstGeom>
-                      </pic:spPr>
-                    </pic:pic>
-                  </a:graphicData>
-                </a:graphic>
-              </wp:inline>
-            </w:drawing>
-          </w:r>
-        </w:p>
-      </w:tc>
-    </w:tr>
-  </w:tbl>
+  <w:p>
+    <w:pPr>
+      <w:jc w:val="center"/>
+    </w:pPr>
+    <w:r>
+      <w:rPr>
+        <w:rFonts w:ascii="Times New Roman" w:cs="Times New Roman" w:eastAsia="Times New Roman" w:hAnsi="Times New Roman"/>
+        <w:sz w:val="24"/>
+        <w:szCs w:val="24"/>
+      </w:rPr>
+      <w:fldChar w:fldCharType="begin"/>
+      <w:instrText xml:space="preserve">PAGE</w:instrText>
+      <w:fldChar w:fldCharType="separate"/>
+      <w:fldChar w:fldCharType="end"/>
+    </w:r>
+  </w:p>
   <w:p>
     <w:pPr>
       <w:pBdr>
         <w:bottom w:val="single" w:color="8496B0" w:sz="6" w:space="1"/>
       </w:pBdr>
-      <w:spacing w:before="80"/>
+      <w:spacing w:before="1150"/>
     </w:pPr>
   </w:p>
 </w:ftr>

</xml_diff>